<commit_message>
Made AI Summary for overall compliance check (as requested by Sr Personal Tutor before submitting any exam - declared in assumptions file on Submission Doc) and made a start on diagrams
</commit_message>
<xml_diff>
--- a/CM2307_CW_StudentNumber.docx.docx
+++ b/CM2307_CW_StudentNumber.docx.docx
@@ -1,27 +1,34 @@
 
 <file path=word/document.xml><?xml version="1.0" encoding="utf-8"?>
-<w:document xmlns:wpc="http://schemas.microsoft.com/office/word/2010/wordprocessingCanvas" xmlns:cx="http://schemas.microsoft.com/office/drawing/2014/chartex" xmlns:cx1="http://schemas.microsoft.com/office/drawing/2015/9/8/chartex" xmlns:cx2="http://schemas.microsoft.com/office/drawing/2015/10/21/chartex" xmlns:cx3="http://schemas.microsoft.com/office/drawing/2016/5/9/chartex" xmlns:cx4="http://schemas.microsoft.com/office/drawing/2016/5/10/chartex" xmlns:cx5="http://schemas.microsoft.com/office/drawing/2016/5/11/chartex" xmlns:cx6="http://schemas.microsoft.com/office/drawing/2016/5/12/chartex" xmlns:cx7="http://schemas.microsoft.com/office/drawing/2016/5/13/chartex" xmlns:cx8="http://schemas.microsoft.com/office/drawing/2016/5/14/chartex" xmlns:mc="http://schemas.openxmlformats.org/markup-compatibility/2006" xmlns:aink="http://schemas.microsoft.com/office/drawing/2016/ink" xmlns:am3d="http://schemas.microsoft.com/office/drawing/2017/model3d" xmlns:o="urn:schemas-microsoft-com:office:office" xmlns:oel="http://schemas.microsoft.com/office/2019/extlst" xmlns:r="http://schemas.openxmlformats.org/officeDocument/2006/relationships" xmlns:m="http://schemas.openxmlformats.org/officeDocument/2006/math" xmlns:v="urn:schemas-microsoft-com:vml" xmlns:wp14="http://schemas.microsoft.com/office/word/2010/wordprocessingDrawing" xmlns:wp="http://schemas.openxmlformats.org/drawingml/2006/wordprocessingDrawing" xmlns:w10="urn:schemas-microsoft-com:office:word" xmlns:w="http://schemas.openxmlformats.org/wordprocessingml/2006/main" xmlns:w14="http://schemas.microsoft.com/office/word/2010/wordml" xmlns:w15="http://schemas.microsoft.com/office/word/2012/wordml" xmlns:w16cex="http://schemas.microsoft.com/office/word/2018/wordml/cex" xmlns:w16cid="http://schemas.microsoft.com/office/word/2016/wordml/cid" xmlns:w16="http://schemas.microsoft.com/office/word/2018/wordml" xmlns:w16du="http://schemas.microsoft.com/office/word/2023/wordml/word16du" xmlns:w16sdtdh="http://schemas.microsoft.com/office/word/2020/wordml/sdtdatahash" xmlns:w16sdtfl="http://schemas.microsoft.com/office/word/2024/wordml/sdtformatlock" xmlns:w16se="http://schemas.microsoft.com/office/word/2015/wordml/symex" xmlns:wpg="http://schemas.microsoft.com/office/word/2010/wordprocessingGroup" xmlns:wpi="http://schemas.microsoft.com/office/word/2010/wordprocessingInk" xmlns:wne="http://schemas.microsoft.com/office/word/2006/wordml" xmlns:wps="http://schemas.microsoft.com/office/word/2010/wordprocessingShape" mc:Ignorable="w14 w15 w16se w16cid w16 w16cex w16sdtdh w16sdtfl w16du wp14">
+<w:document xmlns:wpc="http://schemas.microsoft.com/office/word/2010/wordprocessingCanvas" xmlns:cx="http://schemas.microsoft.com/office/drawing/2014/chartex" xmlns:cx1="http://schemas.microsoft.com/office/drawing/2015/9/8/chartex" xmlns:cx2="http://schemas.microsoft.com/office/drawing/2015/10/21/chartex" xmlns:cx3="http://schemas.microsoft.com/office/drawing/2016/5/9/chartex" xmlns:cx4="http://schemas.microsoft.com/office/drawing/2016/5/10/chartex" xmlns:cx5="http://schemas.microsoft.com/office/drawing/2016/5/11/chartex" xmlns:cx6="http://schemas.microsoft.com/office/drawing/2016/5/12/chartex" xmlns:cx7="http://schemas.microsoft.com/office/drawing/2016/5/13/chartex" xmlns:cx8="http://schemas.microsoft.com/office/drawing/2016/5/14/chartex" xmlns:mc="http://schemas.openxmlformats.org/markup-compatibility/2006" xmlns:aink="http://schemas.microsoft.com/office/drawing/2016/ink" xmlns:am3d="http://schemas.microsoft.com/office/drawing/2017/model3d" xmlns:o="urn:schemas-microsoft-com:office:office" xmlns:oel="http://schemas.microsoft.com/office/2019/extlst" xmlns:r="http://schemas.openxmlformats.org/officeDocument/2006/relationships" xmlns:m="http://schemas.openxmlformats.org/officeDocument/2006/math" xmlns:v="urn:schemas-microsoft-com:vml" xmlns:wp14="http://schemas.microsoft.com/office/word/2010/wordprocessingDrawing" xmlns:wp="http://schemas.openxmlformats.org/drawingml/2006/wordprocessingDrawing" xmlns:w10="urn:schemas-microsoft-com:office:word" xmlns:w="http://schemas.openxmlformats.org/wordprocessingml/2006/main" xmlns:w14="http://schemas.microsoft.com/office/word/2010/wordml" xmlns:w15="http://schemas.microsoft.com/office/word/2012/wordml" xmlns:w16cex="http://schemas.microsoft.com/office/word/2018/wordml/cex" xmlns:w16cid="http://schemas.microsoft.com/office/word/2016/wordml/cid" xmlns:w16="http://schemas.microsoft.com/office/word/2018/wordml" xmlns:w16sdtdh="http://schemas.microsoft.com/office/word/2020/wordml/sdtdatahash" xmlns:w16se="http://schemas.microsoft.com/office/word/2015/wordml/symex" xmlns:wpg="http://schemas.microsoft.com/office/word/2010/wordprocessingGroup" xmlns:wpi="http://schemas.microsoft.com/office/word/2010/wordprocessingInk" xmlns:wne="http://schemas.microsoft.com/office/word/2006/wordml" xmlns:wps="http://schemas.microsoft.com/office/word/2010/wordprocessingShape" mc:Ignorable="w14 w15 w16se w16cid w16 w16cex w16sdtdh wp14">
   <w:body>
     <w:p>
       <w:pPr>
         <w:pStyle w:val="Title"/>
-      </w:pPr>
-      <w:r>
-        <w:t xml:space="preserve">CM2307 – </w:t>
-      </w:r>
-      <w:r>
-        <w:t xml:space="preserve">Resit </w:t>
+        <w:jc w:val="center"/>
+        <w:rPr>
+          <w:rFonts w:hint="eastAsia"/>
+        </w:rPr>
+      </w:pPr>
+      <w:r>
+        <w:t xml:space="preserve">CM2307 </w:t>
+      </w:r>
+      <w:r>
+        <w:t>Deferral</w:t>
+      </w:r>
+      <w:r>
+        <w:t xml:space="preserve"> </w:t>
       </w:r>
       <w:r>
         <w:t>Coursework</w:t>
-      </w:r>
-      <w:r>
-        <w:t xml:space="preserve"> Submission</w:t>
       </w:r>
     </w:p>
     <w:p>
       <w:pPr>
         <w:pStyle w:val="Heading1"/>
+        <w:rPr>
+          <w:rFonts w:hint="eastAsia"/>
+        </w:rPr>
       </w:pPr>
       <w:r>
         <w:t>Key Items:</w:t>
@@ -35,8 +42,8 @@
       </w:tblPr>
       <w:tblGrid>
         <w:gridCol w:w="2122"/>
-        <w:gridCol w:w="3685"/>
-        <w:gridCol w:w="3209"/>
+        <w:gridCol w:w="3543"/>
+        <w:gridCol w:w="3351"/>
       </w:tblGrid>
       <w:tr>
         <w:tc>
@@ -93,21 +100,30 @@
         </w:tc>
         <w:tc>
           <w:tcPr>
-            <w:tcW w:w="3685" w:type="dxa"/>
+            <w:tcW w:w="3543" w:type="dxa"/>
           </w:tcPr>
           <w:p>
             <w:pPr>
+              <w:jc w:val="center"/>
               <w:rPr>
                 <w:rFonts w:ascii="Aptos Light" w:eastAsia="Aptos Light" w:hAnsi="Aptos Light" w:cs="Aptos Light"/>
                 <w:sz w:val="22"/>
                 <w:szCs w:val="22"/>
               </w:rPr>
             </w:pPr>
+            <w:r>
+              <w:rPr>
+                <w:rFonts w:ascii="Aptos Light" w:eastAsia="Aptos Light" w:hAnsi="Aptos Light" w:cs="Aptos Light"/>
+                <w:sz w:val="22"/>
+                <w:szCs w:val="22"/>
+              </w:rPr>
+              <w:t>C24062219</w:t>
+            </w:r>
           </w:p>
         </w:tc>
         <w:tc>
           <w:tcPr>
-            <w:tcW w:w="3209" w:type="dxa"/>
+            <w:tcW w:w="3351" w:type="dxa"/>
           </w:tcPr>
           <w:p>
             <w:pPr>
@@ -199,10 +215,11 @@
         </w:tc>
         <w:tc>
           <w:tcPr>
-            <w:tcW w:w="3685" w:type="dxa"/>
+            <w:tcW w:w="3543" w:type="dxa"/>
           </w:tcPr>
           <w:p>
             <w:pPr>
+              <w:jc w:val="center"/>
               <w:rPr>
                 <w:rFonts w:ascii="Aptos Light" w:eastAsia="Aptos Light" w:hAnsi="Aptos Light" w:cs="Aptos Light"/>
                 <w:sz w:val="22"/>
@@ -213,7 +230,7 @@
         </w:tc>
         <w:tc>
           <w:tcPr>
-            <w:tcW w:w="3209" w:type="dxa"/>
+            <w:tcW w:w="3351" w:type="dxa"/>
           </w:tcPr>
           <w:p>
             <w:pPr>
@@ -253,7 +270,25 @@
                 <w:sz w:val="22"/>
                 <w:szCs w:val="22"/>
               </w:rPr>
-              <w:t xml:space="preserve">Access to Git Repo has been provided to the teaching and marking team? </w:t>
+              <w:t xml:space="preserve">Access to </w:t>
+            </w:r>
+            <w:proofErr w:type="spellStart"/>
+            <w:r>
+              <w:rPr>
+                <w:rFonts w:ascii="Aptos Light" w:eastAsia="Aptos Light" w:hAnsi="Aptos Light" w:cs="Aptos Light"/>
+                <w:sz w:val="22"/>
+                <w:szCs w:val="22"/>
+              </w:rPr>
+              <w:t>Git</w:t>
+            </w:r>
+            <w:proofErr w:type="spellEnd"/>
+            <w:r>
+              <w:rPr>
+                <w:rFonts w:ascii="Aptos Light" w:eastAsia="Aptos Light" w:hAnsi="Aptos Light" w:cs="Aptos Light"/>
+                <w:sz w:val="22"/>
+                <w:szCs w:val="22"/>
+              </w:rPr>
+              <w:t xml:space="preserve"> Repo has been provided to the teaching and marking team? </w:t>
             </w:r>
             <w:r>
               <w:rPr>
@@ -289,10 +324,11 @@
         </w:tc>
         <w:tc>
           <w:tcPr>
-            <w:tcW w:w="3685" w:type="dxa"/>
+            <w:tcW w:w="3543" w:type="dxa"/>
           </w:tcPr>
           <w:p>
             <w:pPr>
+              <w:jc w:val="center"/>
               <w:rPr>
                 <w:rFonts w:ascii="Aptos Light" w:eastAsia="Aptos Light" w:hAnsi="Aptos Light" w:cs="Aptos Light"/>
                 <w:sz w:val="22"/>
@@ -311,7 +347,7 @@
         </w:tc>
         <w:tc>
           <w:tcPr>
-            <w:tcW w:w="3209" w:type="dxa"/>
+            <w:tcW w:w="3351" w:type="dxa"/>
           </w:tcPr>
           <w:p>
             <w:pPr>
@@ -387,10 +423,11 @@
         </w:tc>
         <w:tc>
           <w:tcPr>
-            <w:tcW w:w="3685" w:type="dxa"/>
+            <w:tcW w:w="3543" w:type="dxa"/>
           </w:tcPr>
           <w:p>
             <w:pPr>
+              <w:jc w:val="center"/>
               <w:rPr>
                 <w:rFonts w:ascii="Aptos Light" w:eastAsia="Aptos Light" w:hAnsi="Aptos Light" w:cs="Aptos Light"/>
                 <w:sz w:val="22"/>
@@ -401,7 +438,7 @@
         </w:tc>
         <w:tc>
           <w:tcPr>
-            <w:tcW w:w="3209" w:type="dxa"/>
+            <w:tcW w:w="3351" w:type="dxa"/>
           </w:tcPr>
           <w:p>
             <w:pPr>
@@ -477,10 +514,11 @@
         </w:tc>
         <w:tc>
           <w:tcPr>
-            <w:tcW w:w="3685" w:type="dxa"/>
+            <w:tcW w:w="3543" w:type="dxa"/>
           </w:tcPr>
           <w:p>
             <w:pPr>
+              <w:jc w:val="center"/>
               <w:rPr>
                 <w:rFonts w:ascii="Aptos Light" w:eastAsia="Aptos Light" w:hAnsi="Aptos Light" w:cs="Aptos Light"/>
                 <w:sz w:val="22"/>
@@ -499,7 +537,7 @@
         </w:tc>
         <w:tc>
           <w:tcPr>
-            <w:tcW w:w="3209" w:type="dxa"/>
+            <w:tcW w:w="3351" w:type="dxa"/>
           </w:tcPr>
           <w:p>
             <w:pPr>
@@ -523,95 +561,89 @@
     </w:tbl>
     <w:p/>
     <w:p>
-      <w:r>
-        <w:t>Gen AI Declaration:</w:t>
-      </w:r>
+      <w:pPr>
+        <w:rPr>
+          <w:rFonts w:eastAsiaTheme="minorEastAsia" w:hint="eastAsia"/>
+          <w:b/>
+          <w:bCs/>
+        </w:rPr>
+      </w:pPr>
     </w:p>
     <w:p>
       <w:pPr>
+        <w:rPr>
+          <w:rFonts w:ascii="Aptos Light" w:eastAsia="Aptos Light" w:hAnsi="Aptos Light" w:cs="Aptos Light"/>
+          <w:b/>
+          <w:bCs/>
+        </w:rPr>
+      </w:pPr>
+      <w:r>
+        <w:rPr>
+          <w:rFonts w:ascii="Aptos Light" w:eastAsia="Aptos Light" w:hAnsi="Aptos Light" w:cs="Aptos Light"/>
+          <w:b/>
+          <w:bCs/>
+        </w:rPr>
+        <w:t>I declare that I have used Generative AI software to support me in producing parts of this work. I have used Gen AI in line with the usage defined by the assessment guidance and have maintained academic integrity throughout my work. I have rewritten any Gen AI content in my own words and validated it through using reliable independent sources.</w:t>
+      </w:r>
+    </w:p>
+    <w:p>
+      <w:pPr>
+        <w:rPr>
+          <w:rFonts w:ascii="Aptos Light" w:eastAsia="Aptos Light" w:hAnsi="Aptos Light" w:cs="Aptos Light"/>
+          <w:b/>
+          <w:bCs/>
+        </w:rPr>
+      </w:pPr>
+      <w:r>
+        <w:rPr>
+          <w:rFonts w:ascii="Aptos Light" w:eastAsia="Aptos Light" w:hAnsi="Aptos Light" w:cs="Aptos Light"/>
+          <w:b/>
+          <w:bCs/>
+        </w:rPr>
+        <w:t xml:space="preserve">I understand that declaring the use of </w:t>
+      </w:r>
+      <w:proofErr w:type="spellStart"/>
+      <w:r>
+        <w:rPr>
+          <w:rFonts w:ascii="Aptos Light" w:eastAsia="Aptos Light" w:hAnsi="Aptos Light" w:cs="Aptos Light"/>
+          <w:b/>
+          <w:bCs/>
+        </w:rPr>
+        <w:t>GenAI</w:t>
+      </w:r>
+      <w:proofErr w:type="spellEnd"/>
+      <w:r>
+        <w:rPr>
+          <w:rFonts w:ascii="Aptos Light" w:eastAsia="Aptos Light" w:hAnsi="Aptos Light" w:cs="Aptos Light"/>
+          <w:b/>
+          <w:bCs/>
+        </w:rPr>
+        <w:t xml:space="preserve"> tools will not lead to a lower mark, provided that my use is in accordance with the assessment guidelines and I maintain academic integrity.</w:t>
+      </w:r>
+    </w:p>
+    <w:p>
+      <w:pPr>
+        <w:rPr>
+          <w:rFonts w:ascii="Aptos Light" w:eastAsia="Aptos Light" w:hAnsi="Aptos Light" w:cs="Aptos Light"/>
+          <w:b/>
+          <w:bCs/>
+        </w:rPr>
+      </w:pPr>
+    </w:p>
+    <w:p>
+      <w:pPr>
+        <w:rPr>
+          <w:rFonts w:eastAsiaTheme="minorEastAsia" w:hint="eastAsia"/>
+          <w:b/>
+          <w:bCs/>
+        </w:rPr>
+      </w:pPr>
+      <w:r>
         <w:rPr>
           <w:rFonts w:eastAsiaTheme="minorEastAsia"/>
           <w:b/>
           <w:bCs/>
         </w:rPr>
-      </w:pPr>
-    </w:p>
-    <w:p>
-      <w:r>
-        <w:rPr>
-          <w:rFonts w:eastAsiaTheme="minorEastAsia"/>
-          <w:b/>
-          <w:bCs/>
-        </w:rPr>
-        <w:t>If you have used Gen AI:</w:t>
-      </w:r>
-    </w:p>
-    <w:p>
-      <w:pPr>
-        <w:rPr>
-          <w:rFonts w:eastAsiaTheme="minorEastAsia"/>
-          <w:b/>
-          <w:bCs/>
-        </w:rPr>
-      </w:pPr>
-    </w:p>
-    <w:p>
-      <w:pPr>
-        <w:rPr>
-          <w:rFonts w:ascii="Aptos Light" w:eastAsia="Aptos Light" w:hAnsi="Aptos Light" w:cs="Aptos Light"/>
-          <w:b/>
-          <w:bCs/>
-        </w:rPr>
-      </w:pPr>
-      <w:r>
-        <w:rPr>
-          <w:rFonts w:ascii="Aptos Light" w:eastAsia="Aptos Light" w:hAnsi="Aptos Light" w:cs="Aptos Light"/>
-          <w:b/>
-          <w:bCs/>
-        </w:rPr>
-        <w:t>I declare that I have used Generative AI software to support me in producing parts of this work. I have used Gen AI in line with the usage defined by the assessment guidance and have maintained academic integrity throughout my work. I have rewritten any Gen AI content in my own words and validated it through using reliable independent sources.</w:t>
-      </w:r>
-    </w:p>
-    <w:p>
-      <w:pPr>
-        <w:rPr>
-          <w:rFonts w:ascii="Aptos Light" w:eastAsia="Aptos Light" w:hAnsi="Aptos Light" w:cs="Aptos Light"/>
-          <w:b/>
-          <w:bCs/>
-        </w:rPr>
-      </w:pPr>
-      <w:r>
-        <w:rPr>
-          <w:rFonts w:ascii="Aptos Light" w:eastAsia="Aptos Light" w:hAnsi="Aptos Light" w:cs="Aptos Light"/>
-          <w:b/>
-          <w:bCs/>
-        </w:rPr>
-        <w:t>I understand that declaring the use of GenAI tools will not lead to a lower mark, provided that my use is in accordance with the assessment guidelines and I maintain academic integrity.</w:t>
-      </w:r>
-    </w:p>
-    <w:p>
-      <w:pPr>
-        <w:rPr>
-          <w:rFonts w:ascii="Aptos Light" w:eastAsia="Aptos Light" w:hAnsi="Aptos Light" w:cs="Aptos Light"/>
-          <w:b/>
-          <w:bCs/>
-        </w:rPr>
-      </w:pPr>
-    </w:p>
-    <w:p>
-      <w:pPr>
-        <w:rPr>
-          <w:rFonts w:eastAsiaTheme="minorEastAsia"/>
-          <w:b/>
-          <w:bCs/>
-        </w:rPr>
-      </w:pPr>
-      <w:r>
-        <w:rPr>
-          <w:rFonts w:eastAsiaTheme="minorEastAsia"/>
-          <w:b/>
-          <w:bCs/>
-        </w:rPr>
         <w:t>I acknowledge my use of AI tools to (update as appropriate):</w:t>
       </w:r>
     </w:p>
@@ -620,46 +652,122 @@
         <w:pStyle w:val="ListParagraph"/>
         <w:numPr>
           <w:ilvl w:val="0"/>
-          <w:numId w:val="2"/>
+          <w:numId w:val="3"/>
         </w:numPr>
-        <w:rPr>
-          <w:rFonts w:ascii="Aptos Light" w:eastAsia="Aptos Light" w:hAnsi="Aptos Light" w:cs="Aptos Light"/>
-        </w:rPr>
-      </w:pPr>
-      <w:r>
-        <w:rPr>
-          <w:rFonts w:ascii="Aptos Light" w:eastAsia="Aptos Light" w:hAnsi="Aptos Light" w:cs="Aptos Light"/>
-        </w:rPr>
-        <w:t>Generate initial ideas or structures, to help understand core concepts or other preparatory activities:</w:t>
+      </w:pPr>
+      <w:r>
+        <w:t>All AI chats and general usage have been declared in a folder called “inf. AI Chats for Declaration” in the provided GitHub repository. You may request further Information if required.</w:t>
       </w:r>
     </w:p>
     <w:p>
-      <w:pPr>
-        <w:pStyle w:val="ListParagraph"/>
-        <w:rPr>
-          <w:rFonts w:ascii="Aptos Light" w:eastAsia="Aptos Light" w:hAnsi="Aptos Light" w:cs="Aptos Light"/>
-          <w:i/>
-          <w:iCs/>
-        </w:rPr>
-      </w:pPr>
-      <w:r>
-        <w:rPr>
-          <w:rFonts w:ascii="Aptos Light" w:eastAsia="Aptos Light" w:hAnsi="Aptos Light" w:cs="Aptos Light"/>
-          <w:i/>
-          <w:iCs/>
-        </w:rPr>
-        <w:t>[Insert name of AI tool(s) and include brief details of how used]</w:t>
+      <w:r>
+        <w:br w:type="page"/>
       </w:r>
     </w:p>
     <w:p>
       <w:pPr>
-        <w:pStyle w:val="ListParagraph"/>
         <w:rPr>
           <w:rFonts w:ascii="Aptos Light" w:eastAsia="Aptos Light" w:hAnsi="Aptos Light" w:cs="Aptos Light"/>
         </w:rPr>
       </w:pPr>
       <w:r>
-        <w:br/>
+        <w:rPr>
+          <w:rFonts w:ascii="Aptos Light" w:eastAsia="Aptos Light" w:hAnsi="Aptos Light" w:cs="Aptos Light"/>
+        </w:rPr>
+        <w:lastRenderedPageBreak/>
+        <w:t>It i</w:t>
+      </w:r>
+      <w:r>
+        <w:rPr>
+          <w:rFonts w:ascii="Aptos Light" w:eastAsia="Aptos Light" w:hAnsi="Aptos Light" w:cs="Aptos Light"/>
+        </w:rPr>
+        <w:t xml:space="preserve">s </w:t>
+      </w:r>
+      <w:r>
+        <w:rPr>
+          <w:rFonts w:ascii="Aptos Light" w:eastAsia="Aptos Light" w:hAnsi="Aptos Light" w:cs="Aptos Light"/>
+        </w:rPr>
+        <w:t>my</w:t>
+      </w:r>
+      <w:r>
+        <w:rPr>
+          <w:rFonts w:ascii="Aptos Light" w:eastAsia="Aptos Light" w:hAnsi="Aptos Light" w:cs="Aptos Light"/>
+        </w:rPr>
+        <w:t xml:space="preserve"> responsibility to retain copies of all </w:t>
+      </w:r>
+      <w:proofErr w:type="spellStart"/>
+      <w:r>
+        <w:rPr>
+          <w:rFonts w:ascii="Aptos Light" w:eastAsia="Aptos Light" w:hAnsi="Aptos Light" w:cs="Aptos Light"/>
+        </w:rPr>
+        <w:t>GenAI</w:t>
+      </w:r>
+      <w:proofErr w:type="spellEnd"/>
+      <w:r>
+        <w:rPr>
+          <w:rFonts w:ascii="Aptos Light" w:eastAsia="Aptos Light" w:hAnsi="Aptos Light" w:cs="Aptos Light"/>
+        </w:rPr>
+        <w:t xml:space="preserve"> prompts and outputs after submission in case of any concerns over academic misconduct, as </w:t>
+      </w:r>
+      <w:r>
+        <w:rPr>
+          <w:rFonts w:ascii="Aptos Light" w:eastAsia="Aptos Light" w:hAnsi="Aptos Light" w:cs="Aptos Light"/>
+        </w:rPr>
+        <w:t>I</w:t>
+      </w:r>
+      <w:r>
+        <w:rPr>
+          <w:rFonts w:ascii="Aptos Light" w:eastAsia="Aptos Light" w:hAnsi="Aptos Light" w:cs="Aptos Light"/>
+        </w:rPr>
+        <w:t xml:space="preserve"> may be asked to produce these as evidence of how</w:t>
+      </w:r>
+      <w:r>
+        <w:rPr>
+          <w:rFonts w:ascii="Aptos Light" w:eastAsia="Aptos Light" w:hAnsi="Aptos Light" w:cs="Aptos Light"/>
+        </w:rPr>
+        <w:t xml:space="preserve"> I’ve used</w:t>
+      </w:r>
+      <w:r>
+        <w:rPr>
+          <w:rFonts w:ascii="Aptos Light" w:eastAsia="Aptos Light" w:hAnsi="Aptos Light" w:cs="Aptos Light"/>
+        </w:rPr>
+        <w:t xml:space="preserve"> Gen AI as part of any investigation into academic misconduct.</w:t>
+      </w:r>
+    </w:p>
+    <w:p>
+      <w:pPr>
+        <w:rPr>
+          <w:rFonts w:ascii="Aptos Light" w:eastAsia="Aptos Light" w:hAnsi="Aptos Light" w:cs="Aptos Light"/>
+        </w:rPr>
+      </w:pPr>
+      <w:r>
+        <w:rPr>
+          <w:rFonts w:ascii="Aptos Light" w:eastAsia="Aptos Light" w:hAnsi="Aptos Light" w:cs="Aptos Light"/>
+        </w:rPr>
+        <w:t>I have also tracked all of my progress and work throughout, using Git Trees.</w:t>
+      </w:r>
+    </w:p>
+    <w:p>
+      <w:pPr>
+        <w:rPr>
+          <w:rFonts w:ascii="Aptos Light" w:eastAsia="Aptos Light" w:hAnsi="Aptos Light" w:cs="Aptos Light"/>
+        </w:rPr>
+      </w:pPr>
+    </w:p>
+    <w:p>
+      <w:pPr>
+        <w:rPr>
+          <w:rFonts w:ascii="Aptos Light" w:eastAsia="Aptos Light" w:hAnsi="Aptos Light" w:cs="Aptos Light"/>
+        </w:rPr>
+      </w:pPr>
+    </w:p>
+    <w:p>
+      <w:pPr>
+        <w:pStyle w:val="Title"/>
+        <w:jc w:val="center"/>
+      </w:pPr>
+      <w:r>
+        <w:t>ASSUMPTIONS FILE</w:t>
       </w:r>
     </w:p>
     <w:p>
@@ -667,161 +775,50 @@
         <w:pStyle w:val="ListParagraph"/>
         <w:numPr>
           <w:ilvl w:val="0"/>
-          <w:numId w:val="2"/>
+          <w:numId w:val="4"/>
         </w:numPr>
-        <w:rPr>
-          <w:rFonts w:ascii="Aptos Light" w:eastAsia="Aptos Light" w:hAnsi="Aptos Light" w:cs="Aptos Light"/>
-          <w:i/>
-          <w:iCs/>
-        </w:rPr>
-      </w:pPr>
-      <w:r>
-        <w:rPr>
-          <w:rFonts w:ascii="Aptos Light" w:eastAsia="Aptos Light" w:hAnsi="Aptos Light" w:cs="Aptos Light"/>
-        </w:rPr>
-        <w:t>Write, rewrite, or paraphrase part of this submission:</w:t>
-      </w:r>
-      <w:r>
-        <w:br/>
-      </w:r>
-      <w:r>
-        <w:rPr>
-          <w:rFonts w:ascii="Aptos Light" w:eastAsia="Aptos Light" w:hAnsi="Aptos Light" w:cs="Aptos Light"/>
-          <w:i/>
-          <w:iCs/>
-        </w:rPr>
-        <w:t>[Insert name of AI tool(s) and include brief details of how used]</w:t>
-      </w:r>
-    </w:p>
-    <w:p>
-      <w:pPr>
-        <w:pStyle w:val="ListParagraph"/>
-        <w:rPr>
-          <w:rFonts w:ascii="Aptos Light" w:eastAsia="Aptos Light" w:hAnsi="Aptos Light" w:cs="Aptos Light"/>
-        </w:rPr>
-      </w:pPr>
+      </w:pPr>
+      <w:r>
+        <w:t xml:space="preserve">I assume that the Test Files (used purely for demonstration purposes) can be generated with AI (all chats provided) due to the fact that I am using Artificial Intelligence as a tool to </w:t>
+      </w:r>
+      <w:r>
+        <w:rPr>
+          <w:b/>
+          <w:bCs/>
+        </w:rPr>
+        <w:t>save time</w:t>
+      </w:r>
+      <w:r>
+        <w:t xml:space="preserve">. I would not have otherwise wasted time making them and it is not affecting my learning of the subject in any meaningful way. </w:t>
+      </w:r>
     </w:p>
     <w:p>
       <w:pPr>
         <w:pStyle w:val="ListParagraph"/>
         <w:numPr>
           <w:ilvl w:val="0"/>
-          <w:numId w:val="2"/>
+          <w:numId w:val="4"/>
         </w:numPr>
-        <w:rPr>
-          <w:rFonts w:ascii="Aptos Light" w:eastAsia="Aptos Light" w:hAnsi="Aptos Light" w:cs="Aptos Light"/>
-          <w:i/>
-          <w:iCs/>
-        </w:rPr>
-      </w:pPr>
-      <w:r>
-        <w:rPr>
-          <w:rFonts w:ascii="Aptos Light" w:eastAsia="Aptos Light" w:hAnsi="Aptos Light" w:cs="Aptos Light"/>
-        </w:rPr>
-        <w:t>Generate other aspect(s) of the assignment:</w:t>
-      </w:r>
-      <w:r>
-        <w:br/>
-      </w:r>
-      <w:r>
-        <w:rPr>
-          <w:rFonts w:ascii="Aptos Light" w:eastAsia="Aptos Light" w:hAnsi="Aptos Light" w:cs="Aptos Light"/>
-          <w:i/>
-          <w:iCs/>
-        </w:rPr>
-        <w:t>[Insert name of AI tool(s) and include brief details of how used]</w:t>
+      </w:pPr>
+      <w:r>
+        <w:t xml:space="preserve">I have taken the liberty of using some home-made tools to help me optimise this assessment before publishing it. This is after the recommendation from my Sr. Personal Tutor DR. LANGBEIN. </w:t>
       </w:r>
     </w:p>
     <w:p/>
     <w:p>
-      <w:pPr>
-        <w:rPr>
-          <w:rFonts w:ascii="Aptos Light" w:eastAsia="Aptos Light" w:hAnsi="Aptos Light" w:cs="Aptos Light"/>
-        </w:rPr>
-      </w:pPr>
-      <w:r>
-        <w:rPr>
-          <w:rFonts w:eastAsiaTheme="minorEastAsia"/>
-        </w:rPr>
-        <w:t>Important note:</w:t>
-      </w:r>
-      <w:r>
-        <w:br/>
-      </w:r>
-      <w:r>
-        <w:rPr>
-          <w:rFonts w:ascii="Aptos Light" w:eastAsia="Aptos Light" w:hAnsi="Aptos Light" w:cs="Aptos Light"/>
-        </w:rPr>
-        <w:t>When you have used GenAI, it is your responsibility to retain copies of all GenAI prompts and outputs after submission in case of any concerns over academic misconduct, as you may be asked to produce these as evidence of how you’ve used Gen AI as part of any investigation into academic misconduct. You may also wish to retain a ‘Track Changes’ version of your work to show how you’ve developed your work.</w:t>
+      <w:r>
+        <w:br w:type="page"/>
       </w:r>
     </w:p>
     <w:p>
       <w:pPr>
-        <w:rPr>
-          <w:rFonts w:ascii="Aptos Light" w:eastAsia="Aptos Light" w:hAnsi="Aptos Light" w:cs="Aptos Light"/>
-        </w:rPr>
-      </w:pPr>
-    </w:p>
-    <w:p>
-      <w:pPr>
-        <w:jc w:val="center"/>
-        <w:rPr>
-          <w:rFonts w:ascii="Aptos Light" w:eastAsia="Aptos Light" w:hAnsi="Aptos Light" w:cs="Aptos Light"/>
-        </w:rPr>
-      </w:pPr>
-      <w:r>
-        <w:rPr>
-          <w:rFonts w:ascii="Aptos Light" w:eastAsia="Aptos Light" w:hAnsi="Aptos Light" w:cs="Aptos Light"/>
-        </w:rPr>
-        <w:t>(Or)</w:t>
-      </w:r>
-    </w:p>
-    <w:p>
-      <w:pPr>
-        <w:rPr>
-          <w:rFonts w:ascii="Aptos Light" w:eastAsia="Aptos Light" w:hAnsi="Aptos Light" w:cs="Aptos Light"/>
-        </w:rPr>
-      </w:pPr>
-      <w:r>
-        <w:br/>
-      </w:r>
-      <w:r>
-        <w:rPr>
-          <w:rFonts w:eastAsiaTheme="minorEastAsia"/>
-          <w:b/>
-          <w:bCs/>
-        </w:rPr>
-        <w:t>If you haven’t used Gen AI (for all work</w:t>
-      </w:r>
-      <w:r>
-        <w:rPr>
-          <w:rFonts w:eastAsiaTheme="minorEastAsia"/>
-          <w:b/>
-          <w:bCs/>
-        </w:rPr>
-        <w:t>)</w:t>
-      </w:r>
-      <w:r>
-        <w:br/>
-      </w:r>
-      <w:r>
-        <w:rPr>
-          <w:rFonts w:ascii="Aptos Light" w:eastAsia="Aptos Light" w:hAnsi="Aptos Light" w:cs="Aptos Light"/>
-        </w:rPr>
-        <w:t>I declare that this work is entirely my own words and no part of it has been produced by Generative AI tools.</w:t>
-      </w:r>
-    </w:p>
-    <w:p/>
-    <w:p>
-      <w:r>
-        <w:br w:type="page"/>
-      </w:r>
-    </w:p>
-    <w:p>
-      <w:pPr>
         <w:pStyle w:val="Heading1"/>
-      </w:pPr>
-      <w:r>
+        <w:rPr>
+          <w:rFonts w:hint="eastAsia"/>
+        </w:rPr>
+      </w:pPr>
+      <w:r>
+        <w:lastRenderedPageBreak/>
         <w:t>System Design using UML:</w:t>
       </w:r>
     </w:p>
@@ -844,11 +841,17 @@
     <w:p>
       <w:pPr>
         <w:pStyle w:val="Heading1"/>
+        <w:rPr>
+          <w:rFonts w:hint="eastAsia"/>
+        </w:rPr>
       </w:pPr>
     </w:p>
     <w:p>
       <w:pPr>
         <w:pStyle w:val="Heading1"/>
+        <w:rPr>
+          <w:rFonts w:hint="eastAsia"/>
+        </w:rPr>
       </w:pPr>
       <w:r>
         <w:t>Evidence and Evaluation:</w:t>
@@ -858,6 +861,9 @@
     <w:p>
       <w:pPr>
         <w:pStyle w:val="Heading2"/>
+        <w:rPr>
+          <w:rFonts w:hint="eastAsia"/>
+        </w:rPr>
       </w:pPr>
       <w:r>
         <w:t>Part 1</w:t>
@@ -915,6 +921,9 @@
     <w:p>
       <w:pPr>
         <w:pStyle w:val="Heading2"/>
+        <w:rPr>
+          <w:rFonts w:hint="eastAsia"/>
+        </w:rPr>
       </w:pPr>
       <w:r>
         <w:t>Part 2: (max of 1</w:t>
@@ -963,7 +972,7 @@
 </file>
 
 <file path=word/numbering.xml><?xml version="1.0" encoding="utf-8"?>
-<w:numbering xmlns:wpc="http://schemas.microsoft.com/office/word/2010/wordprocessingCanvas" xmlns:cx="http://schemas.microsoft.com/office/drawing/2014/chartex" xmlns:cx1="http://schemas.microsoft.com/office/drawing/2015/9/8/chartex" xmlns:cx2="http://schemas.microsoft.com/office/drawing/2015/10/21/chartex" xmlns:cx3="http://schemas.microsoft.com/office/drawing/2016/5/9/chartex" xmlns:cx4="http://schemas.microsoft.com/office/drawing/2016/5/10/chartex" xmlns:cx5="http://schemas.microsoft.com/office/drawing/2016/5/11/chartex" xmlns:cx6="http://schemas.microsoft.com/office/drawing/2016/5/12/chartex" xmlns:cx7="http://schemas.microsoft.com/office/drawing/2016/5/13/chartex" xmlns:cx8="http://schemas.microsoft.com/office/drawing/2016/5/14/chartex" xmlns:mc="http://schemas.openxmlformats.org/markup-compatibility/2006" xmlns:aink="http://schemas.microsoft.com/office/drawing/2016/ink" xmlns:am3d="http://schemas.microsoft.com/office/drawing/2017/model3d" xmlns:o="urn:schemas-microsoft-com:office:office" xmlns:oel="http://schemas.microsoft.com/office/2019/extlst" xmlns:r="http://schemas.openxmlformats.org/officeDocument/2006/relationships" xmlns:m="http://schemas.openxmlformats.org/officeDocument/2006/math" xmlns:v="urn:schemas-microsoft-com:vml" xmlns:wp14="http://schemas.microsoft.com/office/word/2010/wordprocessingDrawing" xmlns:wp="http://schemas.openxmlformats.org/drawingml/2006/wordprocessingDrawing" xmlns:w10="urn:schemas-microsoft-com:office:word" xmlns:w="http://schemas.openxmlformats.org/wordprocessingml/2006/main" xmlns:w14="http://schemas.microsoft.com/office/word/2010/wordml" xmlns:w15="http://schemas.microsoft.com/office/word/2012/wordml" xmlns:w16cex="http://schemas.microsoft.com/office/word/2018/wordml/cex" xmlns:w16cid="http://schemas.microsoft.com/office/word/2016/wordml/cid" xmlns:w16="http://schemas.microsoft.com/office/word/2018/wordml" xmlns:w16du="http://schemas.microsoft.com/office/word/2023/wordml/word16du" xmlns:w16sdtdh="http://schemas.microsoft.com/office/word/2020/wordml/sdtdatahash" xmlns:w16sdtfl="http://schemas.microsoft.com/office/word/2024/wordml/sdtformatlock" xmlns:w16se="http://schemas.microsoft.com/office/word/2015/wordml/symex" xmlns:wpg="http://schemas.microsoft.com/office/word/2010/wordprocessingGroup" xmlns:wpi="http://schemas.microsoft.com/office/word/2010/wordprocessingInk" xmlns:wne="http://schemas.microsoft.com/office/word/2006/wordml" xmlns:wps="http://schemas.microsoft.com/office/word/2010/wordprocessingShape" mc:Ignorable="w14 w15 w16se w16cid w16 w16cex w16sdtdh w16sdtfl w16du wp14">
+<w:numbering xmlns:wpc="http://schemas.microsoft.com/office/word/2010/wordprocessingCanvas" xmlns:cx="http://schemas.microsoft.com/office/drawing/2014/chartex" xmlns:cx1="http://schemas.microsoft.com/office/drawing/2015/9/8/chartex" xmlns:cx2="http://schemas.microsoft.com/office/drawing/2015/10/21/chartex" xmlns:cx3="http://schemas.microsoft.com/office/drawing/2016/5/9/chartex" xmlns:cx4="http://schemas.microsoft.com/office/drawing/2016/5/10/chartex" xmlns:cx5="http://schemas.microsoft.com/office/drawing/2016/5/11/chartex" xmlns:cx6="http://schemas.microsoft.com/office/drawing/2016/5/12/chartex" xmlns:cx7="http://schemas.microsoft.com/office/drawing/2016/5/13/chartex" xmlns:cx8="http://schemas.microsoft.com/office/drawing/2016/5/14/chartex" xmlns:mc="http://schemas.openxmlformats.org/markup-compatibility/2006" xmlns:aink="http://schemas.microsoft.com/office/drawing/2016/ink" xmlns:am3d="http://schemas.microsoft.com/office/drawing/2017/model3d" xmlns:o="urn:schemas-microsoft-com:office:office" xmlns:oel="http://schemas.microsoft.com/office/2019/extlst" xmlns:r="http://schemas.openxmlformats.org/officeDocument/2006/relationships" xmlns:m="http://schemas.openxmlformats.org/officeDocument/2006/math" xmlns:v="urn:schemas-microsoft-com:vml" xmlns:wp14="http://schemas.microsoft.com/office/word/2010/wordprocessingDrawing" xmlns:wp="http://schemas.openxmlformats.org/drawingml/2006/wordprocessingDrawing" xmlns:w10="urn:schemas-microsoft-com:office:word" xmlns:w="http://schemas.openxmlformats.org/wordprocessingml/2006/main" xmlns:w14="http://schemas.microsoft.com/office/word/2010/wordml" xmlns:w15="http://schemas.microsoft.com/office/word/2012/wordml" xmlns:w16cex="http://schemas.microsoft.com/office/word/2018/wordml/cex" xmlns:w16cid="http://schemas.microsoft.com/office/word/2016/wordml/cid" xmlns:w16="http://schemas.microsoft.com/office/word/2018/wordml" xmlns:w16sdtdh="http://schemas.microsoft.com/office/word/2020/wordml/sdtdatahash" xmlns:w16se="http://schemas.microsoft.com/office/word/2015/wordml/symex" xmlns:wpg="http://schemas.microsoft.com/office/word/2010/wordprocessingGroup" xmlns:wpi="http://schemas.microsoft.com/office/word/2010/wordprocessingInk" xmlns:wne="http://schemas.microsoft.com/office/word/2006/wordml" xmlns:wps="http://schemas.microsoft.com/office/word/2010/wordprocessingShape" mc:Ignorable="w14 w15 w16se w16cid w16 w16cex w16sdtdh wp14">
   <w:abstractNum w:abstractNumId="0" w15:restartNumberingAfterBreak="0">
     <w:nsid w:val="01BB22D0"/>
     <w:multiLevelType w:val="multilevel"/>
@@ -1078,6 +1087,184 @@
     </w:lvl>
   </w:abstractNum>
   <w:abstractNum w:abstractNumId="1" w15:restartNumberingAfterBreak="0">
+    <w:nsid w:val="198F2DFD"/>
+    <w:multiLevelType w:val="hybridMultilevel"/>
+    <w:tmpl w:val="6A664DA8"/>
+    <w:lvl w:ilvl="0" w:tplc="0809000F">
+      <w:start w:val="1"/>
+      <w:numFmt w:val="decimal"/>
+      <w:lvlText w:val="%1."/>
+      <w:lvlJc w:val="left"/>
+      <w:pPr>
+        <w:ind w:left="720" w:hanging="360"/>
+      </w:pPr>
+      <w:rPr>
+        <w:rFonts w:hint="default"/>
+      </w:rPr>
+    </w:lvl>
+    <w:lvl w:ilvl="1" w:tplc="08090019" w:tentative="1">
+      <w:start w:val="1"/>
+      <w:numFmt w:val="lowerLetter"/>
+      <w:lvlText w:val="%2."/>
+      <w:lvlJc w:val="left"/>
+      <w:pPr>
+        <w:ind w:left="1440" w:hanging="360"/>
+      </w:pPr>
+    </w:lvl>
+    <w:lvl w:ilvl="2" w:tplc="0809001B" w:tentative="1">
+      <w:start w:val="1"/>
+      <w:numFmt w:val="lowerRoman"/>
+      <w:lvlText w:val="%3."/>
+      <w:lvlJc w:val="right"/>
+      <w:pPr>
+        <w:ind w:left="2160" w:hanging="180"/>
+      </w:pPr>
+    </w:lvl>
+    <w:lvl w:ilvl="3" w:tplc="0809000F" w:tentative="1">
+      <w:start w:val="1"/>
+      <w:numFmt w:val="decimal"/>
+      <w:lvlText w:val="%4."/>
+      <w:lvlJc w:val="left"/>
+      <w:pPr>
+        <w:ind w:left="2880" w:hanging="360"/>
+      </w:pPr>
+    </w:lvl>
+    <w:lvl w:ilvl="4" w:tplc="08090019" w:tentative="1">
+      <w:start w:val="1"/>
+      <w:numFmt w:val="lowerLetter"/>
+      <w:lvlText w:val="%5."/>
+      <w:lvlJc w:val="left"/>
+      <w:pPr>
+        <w:ind w:left="3600" w:hanging="360"/>
+      </w:pPr>
+    </w:lvl>
+    <w:lvl w:ilvl="5" w:tplc="0809001B" w:tentative="1">
+      <w:start w:val="1"/>
+      <w:numFmt w:val="lowerRoman"/>
+      <w:lvlText w:val="%6."/>
+      <w:lvlJc w:val="right"/>
+      <w:pPr>
+        <w:ind w:left="4320" w:hanging="180"/>
+      </w:pPr>
+    </w:lvl>
+    <w:lvl w:ilvl="6" w:tplc="0809000F" w:tentative="1">
+      <w:start w:val="1"/>
+      <w:numFmt w:val="decimal"/>
+      <w:lvlText w:val="%7."/>
+      <w:lvlJc w:val="left"/>
+      <w:pPr>
+        <w:ind w:left="5040" w:hanging="360"/>
+      </w:pPr>
+    </w:lvl>
+    <w:lvl w:ilvl="7" w:tplc="08090019" w:tentative="1">
+      <w:start w:val="1"/>
+      <w:numFmt w:val="lowerLetter"/>
+      <w:lvlText w:val="%8."/>
+      <w:lvlJc w:val="left"/>
+      <w:pPr>
+        <w:ind w:left="5760" w:hanging="360"/>
+      </w:pPr>
+    </w:lvl>
+    <w:lvl w:ilvl="8" w:tplc="0809001B" w:tentative="1">
+      <w:start w:val="1"/>
+      <w:numFmt w:val="lowerRoman"/>
+      <w:lvlText w:val="%9."/>
+      <w:lvlJc w:val="right"/>
+      <w:pPr>
+        <w:ind w:left="6480" w:hanging="180"/>
+      </w:pPr>
+    </w:lvl>
+  </w:abstractNum>
+  <w:abstractNum w:abstractNumId="2" w15:restartNumberingAfterBreak="0">
+    <w:nsid w:val="570823BA"/>
+    <w:multiLevelType w:val="hybridMultilevel"/>
+    <w:tmpl w:val="F1EEB828"/>
+    <w:lvl w:ilvl="0" w:tplc="0809000F">
+      <w:start w:val="1"/>
+      <w:numFmt w:val="decimal"/>
+      <w:lvlText w:val="%1."/>
+      <w:lvlJc w:val="left"/>
+      <w:pPr>
+        <w:ind w:left="720" w:hanging="360"/>
+      </w:pPr>
+      <w:rPr>
+        <w:rFonts w:hint="default"/>
+      </w:rPr>
+    </w:lvl>
+    <w:lvl w:ilvl="1" w:tplc="08090019" w:tentative="1">
+      <w:start w:val="1"/>
+      <w:numFmt w:val="lowerLetter"/>
+      <w:lvlText w:val="%2."/>
+      <w:lvlJc w:val="left"/>
+      <w:pPr>
+        <w:ind w:left="1440" w:hanging="360"/>
+      </w:pPr>
+    </w:lvl>
+    <w:lvl w:ilvl="2" w:tplc="0809001B" w:tentative="1">
+      <w:start w:val="1"/>
+      <w:numFmt w:val="lowerRoman"/>
+      <w:lvlText w:val="%3."/>
+      <w:lvlJc w:val="right"/>
+      <w:pPr>
+        <w:ind w:left="2160" w:hanging="180"/>
+      </w:pPr>
+    </w:lvl>
+    <w:lvl w:ilvl="3" w:tplc="0809000F" w:tentative="1">
+      <w:start w:val="1"/>
+      <w:numFmt w:val="decimal"/>
+      <w:lvlText w:val="%4."/>
+      <w:lvlJc w:val="left"/>
+      <w:pPr>
+        <w:ind w:left="2880" w:hanging="360"/>
+      </w:pPr>
+    </w:lvl>
+    <w:lvl w:ilvl="4" w:tplc="08090019" w:tentative="1">
+      <w:start w:val="1"/>
+      <w:numFmt w:val="lowerLetter"/>
+      <w:lvlText w:val="%5."/>
+      <w:lvlJc w:val="left"/>
+      <w:pPr>
+        <w:ind w:left="3600" w:hanging="360"/>
+      </w:pPr>
+    </w:lvl>
+    <w:lvl w:ilvl="5" w:tplc="0809001B" w:tentative="1">
+      <w:start w:val="1"/>
+      <w:numFmt w:val="lowerRoman"/>
+      <w:lvlText w:val="%6."/>
+      <w:lvlJc w:val="right"/>
+      <w:pPr>
+        <w:ind w:left="4320" w:hanging="180"/>
+      </w:pPr>
+    </w:lvl>
+    <w:lvl w:ilvl="6" w:tplc="0809000F" w:tentative="1">
+      <w:start w:val="1"/>
+      <w:numFmt w:val="decimal"/>
+      <w:lvlText w:val="%7."/>
+      <w:lvlJc w:val="left"/>
+      <w:pPr>
+        <w:ind w:left="5040" w:hanging="360"/>
+      </w:pPr>
+    </w:lvl>
+    <w:lvl w:ilvl="7" w:tplc="08090019" w:tentative="1">
+      <w:start w:val="1"/>
+      <w:numFmt w:val="lowerLetter"/>
+      <w:lvlText w:val="%8."/>
+      <w:lvlJc w:val="left"/>
+      <w:pPr>
+        <w:ind w:left="5760" w:hanging="360"/>
+      </w:pPr>
+    </w:lvl>
+    <w:lvl w:ilvl="8" w:tplc="0809001B" w:tentative="1">
+      <w:start w:val="1"/>
+      <w:numFmt w:val="lowerRoman"/>
+      <w:lvlText w:val="%9."/>
+      <w:lvlJc w:val="right"/>
+      <w:pPr>
+        <w:ind w:left="6480" w:hanging="180"/>
+      </w:pPr>
+    </w:lvl>
+  </w:abstractNum>
+  <w:abstractNum w:abstractNumId="3" w15:restartNumberingAfterBreak="0">
     <w:nsid w:val="65A54D34"/>
     <w:multiLevelType w:val="hybridMultilevel"/>
     <w:tmpl w:val="77BE3090"/>
@@ -1170,13 +1357,19 @@
     </w:lvlOverride>
   </w:num>
   <w:num w:numId="2" w16cid:durableId="16659313">
+    <w:abstractNumId w:val="3"/>
+  </w:num>
+  <w:num w:numId="3" w16cid:durableId="2145614557">
     <w:abstractNumId w:val="1"/>
+  </w:num>
+  <w:num w:numId="4" w16cid:durableId="387264634">
+    <w:abstractNumId w:val="2"/>
   </w:num>
 </w:numbering>
 </file>
 
 <file path=word/styles.xml><?xml version="1.0" encoding="utf-8"?>
-<w:styles xmlns:mc="http://schemas.openxmlformats.org/markup-compatibility/2006" xmlns:r="http://schemas.openxmlformats.org/officeDocument/2006/relationships" xmlns:w="http://schemas.openxmlformats.org/wordprocessingml/2006/main" xmlns:w14="http://schemas.microsoft.com/office/word/2010/wordml" xmlns:w15="http://schemas.microsoft.com/office/word/2012/wordml" xmlns:w16cex="http://schemas.microsoft.com/office/word/2018/wordml/cex" xmlns:w16cid="http://schemas.microsoft.com/office/word/2016/wordml/cid" xmlns:w16="http://schemas.microsoft.com/office/word/2018/wordml" xmlns:w16du="http://schemas.microsoft.com/office/word/2023/wordml/word16du" xmlns:w16sdtdh="http://schemas.microsoft.com/office/word/2020/wordml/sdtdatahash" xmlns:w16sdtfl="http://schemas.microsoft.com/office/word/2024/wordml/sdtformatlock" xmlns:w16se="http://schemas.microsoft.com/office/word/2015/wordml/symex" mc:Ignorable="w14 w15 w16se w16cid w16 w16cex w16sdtdh w16sdtfl w16du">
+<w:styles xmlns:mc="http://schemas.openxmlformats.org/markup-compatibility/2006" xmlns:r="http://schemas.openxmlformats.org/officeDocument/2006/relationships" xmlns:w="http://schemas.openxmlformats.org/wordprocessingml/2006/main" xmlns:w14="http://schemas.microsoft.com/office/word/2010/wordml" xmlns:w15="http://schemas.microsoft.com/office/word/2012/wordml" xmlns:w16cex="http://schemas.microsoft.com/office/word/2018/wordml/cex" xmlns:w16cid="http://schemas.microsoft.com/office/word/2016/wordml/cid" xmlns:w16="http://schemas.microsoft.com/office/word/2018/wordml" xmlns:w16sdtdh="http://schemas.microsoft.com/office/word/2020/wordml/sdtdatahash" xmlns:w16se="http://schemas.microsoft.com/office/word/2015/wordml/symex" mc:Ignorable="w14 w15 w16se w16cid w16 w16cex w16sdtdh">
   <w:docDefaults>
     <w:rPrDefault>
       <w:rPr>
@@ -2452,26 +2645,6 @@
 </file>
 
 <file path=customXml/item1.xml><?xml version="1.0" encoding="utf-8"?>
-<p:properties xmlns:p="http://schemas.microsoft.com/office/2006/metadata/properties" xmlns:xsi="http://www.w3.org/2001/XMLSchema-instance" xmlns:pc="http://schemas.microsoft.com/office/infopath/2007/PartnerControls">
-  <documentManagement>
-    <lcf76f155ced4ddcb4097134ff3c332f xmlns="ad3e776c-94bd-4a72-a355-75cb9a7c6436">
-      <Terms xmlns="http://schemas.microsoft.com/office/infopath/2007/PartnerControls"/>
-    </lcf76f155ced4ddcb4097134ff3c332f>
-    <TaxCatchAll xmlns="448e1c89-a2cf-4123-8a99-f1e41c9e891a" xsi:nil="true"/>
-  </documentManagement>
-</p:properties>
-</file>
-
-<file path=customXml/item2.xml><?xml version="1.0" encoding="utf-8"?>
-<?mso-contentType ?>
-<FormTemplates xmlns="http://schemas.microsoft.com/sharepoint/v3/contenttype/forms">
-  <Display>DocumentLibraryForm</Display>
-  <Edit>DocumentLibraryForm</Edit>
-  <New>DocumentLibraryForm</New>
-</FormTemplates>
-</file>
-
-<file path=customXml/item3.xml><?xml version="1.0" encoding="utf-8"?>
 <ct:contentTypeSchema xmlns:ct="http://schemas.microsoft.com/office/2006/metadata/contentType" xmlns:ma="http://schemas.microsoft.com/office/2006/metadata/properties/metaAttributes" ct:_="" ma:_="" ma:contentTypeName="Document" ma:contentTypeID="0x010100488F50E9D743E844A402DFA9BD35EB46" ma:contentTypeVersion="18" ma:contentTypeDescription="Create a new document." ma:contentTypeScope="" ma:versionID="ab4f57aace3d5c4cb265cba79c3597a4">
   <xsd:schema xmlns:xsd="http://www.w3.org/2001/XMLSchema" xmlns:xs="http://www.w3.org/2001/XMLSchema" xmlns:p="http://schemas.microsoft.com/office/2006/metadata/properties" xmlns:ns2="ad3e776c-94bd-4a72-a355-75cb9a7c6436" xmlns:ns3="448e1c89-a2cf-4123-8a99-f1e41c9e891a" targetNamespace="http://schemas.microsoft.com/office/2006/metadata/properties" ma:root="true" ma:fieldsID="8131dec6176ab81cf767309be7412c40" ns2:_="" ns3:_="">
     <xsd:import namespace="ad3e776c-94bd-4a72-a355-75cb9a7c6436"/>
@@ -2726,26 +2899,27 @@
 </ct:contentTypeSchema>
 </file>
 
-<file path=customXml/itemProps1.xml><?xml version="1.0" encoding="utf-8"?>
-<ds:datastoreItem xmlns:ds="http://schemas.openxmlformats.org/officeDocument/2006/customXml" ds:itemID="{C40BEE74-7066-43CC-B2CB-1586B8877133}">
-  <ds:schemaRefs>
-    <ds:schemaRef ds:uri="http://schemas.microsoft.com/office/2006/metadata/properties"/>
-    <ds:schemaRef ds:uri="http://schemas.microsoft.com/office/infopath/2007/PartnerControls"/>
-    <ds:schemaRef ds:uri="ad3e776c-94bd-4a72-a355-75cb9a7c6436"/>
-    <ds:schemaRef ds:uri="448e1c89-a2cf-4123-8a99-f1e41c9e891a"/>
-  </ds:schemaRefs>
-</ds:datastoreItem>
+<file path=customXml/item2.xml><?xml version="1.0" encoding="utf-8"?>
+<?mso-contentType ?>
+<FormTemplates xmlns="http://schemas.microsoft.com/sharepoint/v3/contenttype/forms">
+  <Display>DocumentLibraryForm</Display>
+  <Edit>DocumentLibraryForm</Edit>
+  <New>DocumentLibraryForm</New>
+</FormTemplates>
 </file>
 
-<file path=customXml/itemProps2.xml><?xml version="1.0" encoding="utf-8"?>
-<ds:datastoreItem xmlns:ds="http://schemas.openxmlformats.org/officeDocument/2006/customXml" ds:itemID="{23423EC8-F332-4F31-8C59-935961A6823B}">
-  <ds:schemaRefs>
-    <ds:schemaRef ds:uri="http://schemas.microsoft.com/sharepoint/v3/contenttype/forms"/>
-  </ds:schemaRefs>
-</ds:datastoreItem>
+<file path=customXml/item3.xml><?xml version="1.0" encoding="utf-8"?>
+<p:properties xmlns:p="http://schemas.microsoft.com/office/2006/metadata/properties" xmlns:xsi="http://www.w3.org/2001/XMLSchema-instance" xmlns:pc="http://schemas.microsoft.com/office/infopath/2007/PartnerControls">
+  <documentManagement>
+    <lcf76f155ced4ddcb4097134ff3c332f xmlns="ad3e776c-94bd-4a72-a355-75cb9a7c6436">
+      <Terms xmlns="http://schemas.microsoft.com/office/infopath/2007/PartnerControls"/>
+    </lcf76f155ced4ddcb4097134ff3c332f>
+    <TaxCatchAll xmlns="448e1c89-a2cf-4123-8a99-f1e41c9e891a" xsi:nil="true"/>
+  </documentManagement>
+</p:properties>
 </file>
 
-<file path=customXml/itemProps3.xml><?xml version="1.0" encoding="utf-8"?>
+<file path=customXml/itemProps1.xml><?xml version="1.0" encoding="utf-8"?>
 <ds:datastoreItem xmlns:ds="http://schemas.openxmlformats.org/officeDocument/2006/customXml" ds:itemID="{D0060901-5A76-4688-AC0B-C4BFA0B1A86B}">
   <ds:schemaRefs>
     <ds:schemaRef ds:uri="http://schemas.microsoft.com/office/2006/metadata/contentType"/>
@@ -2764,6 +2938,25 @@
 </ds:datastoreItem>
 </file>
 
+<file path=customXml/itemProps2.xml><?xml version="1.0" encoding="utf-8"?>
+<ds:datastoreItem xmlns:ds="http://schemas.openxmlformats.org/officeDocument/2006/customXml" ds:itemID="{23423EC8-F332-4F31-8C59-935961A6823B}">
+  <ds:schemaRefs>
+    <ds:schemaRef ds:uri="http://schemas.microsoft.com/sharepoint/v3/contenttype/forms"/>
+  </ds:schemaRefs>
+</ds:datastoreItem>
+</file>
+
+<file path=customXml/itemProps3.xml><?xml version="1.0" encoding="utf-8"?>
+<ds:datastoreItem xmlns:ds="http://schemas.openxmlformats.org/officeDocument/2006/customXml" ds:itemID="{C40BEE74-7066-43CC-B2CB-1586B8877133}">
+  <ds:schemaRefs>
+    <ds:schemaRef ds:uri="http://schemas.microsoft.com/office/2006/metadata/properties"/>
+    <ds:schemaRef ds:uri="http://schemas.microsoft.com/office/infopath/2007/PartnerControls"/>
+    <ds:schemaRef ds:uri="ad3e776c-94bd-4a72-a355-75cb9a7c6436"/>
+    <ds:schemaRef ds:uri="448e1c89-a2cf-4123-8a99-f1e41c9e891a"/>
+  </ds:schemaRefs>
+</ds:datastoreItem>
+</file>
+
 <file path=docMetadata/LabelInfo.xml><?xml version="1.0" encoding="utf-8"?>
 <clbl:labelList xmlns:clbl="http://schemas.microsoft.com/office/2020/mipLabelMetadata">
   <clbl:label id="{bdb74b30-9568-4856-bdbf-06759778fcbc}" enabled="0" method="" siteId="{bdb74b30-9568-4856-bdbf-06759778fcbc}" removed="1"/>

</xml_diff>

<commit_message>
Made a start on Part 1 report, exported diagrams
</commit_message>
<xml_diff>
--- a/CM2307_CW_StudentNumber.docx.docx
+++ b/CM2307_CW_StudentNumber.docx.docx
@@ -1098,7 +1098,10 @@
         </w:rPr>
       </w:pPr>
       <w:r>
-        <w:t xml:space="preserve">A comparison of </w:t>
+        <w:t xml:space="preserve">Some exports </w:t>
+      </w:r>
+      <w:r>
+        <w:t xml:space="preserve">of </w:t>
       </w:r>
       <w:r>
         <w:t>“</w:t>
@@ -1137,7 +1140,13 @@
         <w:t xml:space="preserve"> diagrams from </w:t>
       </w:r>
       <w:r>
-        <w:t>the standard system, to the improved implementation.</w:t>
+        <w:t>the improved implementation</w:t>
+      </w:r>
+      <w:r>
+        <w:t xml:space="preserve"> of the StudentJobPortal</w:t>
+      </w:r>
+      <w:r>
+        <w:t>.</w:t>
       </w:r>
     </w:p>
     <w:p/>
@@ -1145,164 +1154,474 @@
       <w:tblPr>
         <w:tblStyle w:val="TableGrid"/>
         <w:tblW w:w="0" w:type="auto"/>
+        <w:tblBorders>
+          <w:top w:val="none" w:sz="0" w:space="0" w:color="auto"/>
+          <w:left w:val="none" w:sz="0" w:space="0" w:color="auto"/>
+          <w:bottom w:val="none" w:sz="0" w:space="0" w:color="auto"/>
+          <w:right w:val="none" w:sz="0" w:space="0" w:color="auto"/>
+          <w:insideH w:val="none" w:sz="0" w:space="0" w:color="auto"/>
+          <w:insideV w:val="none" w:sz="0" w:space="0" w:color="auto"/>
+        </w:tblBorders>
         <w:tblLook w:val="04A0" w:firstRow="1" w:lastRow="0" w:firstColumn="1" w:lastColumn="0" w:noHBand="0" w:noVBand="1"/>
       </w:tblPr>
       <w:tblGrid>
-        <w:gridCol w:w="4508"/>
-        <w:gridCol w:w="4508"/>
+        <w:gridCol w:w="9016"/>
       </w:tblGrid>
       <w:tr>
         <w:tc>
           <w:tcPr>
-            <w:tcW w:w="4508" w:type="dxa"/>
+            <w:tcW w:w="9016" w:type="dxa"/>
           </w:tcPr>
-          <w:p/>
-        </w:tc>
-        <w:tc>
-          <w:tcPr>
-            <w:tcW w:w="4508" w:type="dxa"/>
-          </w:tcPr>
-          <w:p/>
+          <w:p>
+            <w:r>
+              <w:rPr>
+                <w:noProof/>
+              </w:rPr>
+              <w:drawing>
+                <wp:inline distT="0" distB="0" distL="0" distR="0" wp14:anchorId="633CE9FF" wp14:editId="1B2A003B">
+                  <wp:extent cx="5582976" cy="5075433"/>
+                  <wp:effectExtent l="0" t="0" r="5080" b="5080"/>
+                  <wp:docPr id="582172239" name="Picture 1"/>
+                  <wp:cNvGraphicFramePr>
+                    <a:graphicFrameLocks xmlns:a="http://schemas.openxmlformats.org/drawingml/2006/main" noChangeAspect="1"/>
+                  </wp:cNvGraphicFramePr>
+                  <a:graphic xmlns:a="http://schemas.openxmlformats.org/drawingml/2006/main">
+                    <a:graphicData uri="http://schemas.openxmlformats.org/drawingml/2006/picture">
+                      <pic:pic xmlns:pic="http://schemas.openxmlformats.org/drawingml/2006/picture">
+                        <pic:nvPicPr>
+                          <pic:cNvPr id="582172239" name="Picture 582172239"/>
+                          <pic:cNvPicPr/>
+                        </pic:nvPicPr>
+                        <pic:blipFill>
+                          <a:blip r:embed="rId8">
+                            <a:extLst>
+                              <a:ext uri="{28A0092B-C50C-407E-A947-70E740481C1C}">
+                                <a14:useLocalDpi xmlns:a14="http://schemas.microsoft.com/office/drawing/2010/main" val="0"/>
+                              </a:ext>
+                            </a:extLst>
+                          </a:blip>
+                          <a:stretch>
+                            <a:fillRect/>
+                          </a:stretch>
+                        </pic:blipFill>
+                        <pic:spPr>
+                          <a:xfrm>
+                            <a:off x="0" y="0"/>
+                            <a:ext cx="5620084" cy="5109167"/>
+                          </a:xfrm>
+                          <a:prstGeom prst="rect">
+                            <a:avLst/>
+                          </a:prstGeom>
+                        </pic:spPr>
+                      </pic:pic>
+                    </a:graphicData>
+                  </a:graphic>
+                </wp:inline>
+              </w:drawing>
+            </w:r>
+          </w:p>
         </w:tc>
       </w:tr>
       <w:tr>
         <w:tc>
           <w:tcPr>
-            <w:tcW w:w="4508" w:type="dxa"/>
+            <w:tcW w:w="9016" w:type="dxa"/>
           </w:tcPr>
-          <w:p/>
-        </w:tc>
-        <w:tc>
-          <w:tcPr>
-            <w:tcW w:w="4508" w:type="dxa"/>
-          </w:tcPr>
-          <w:p/>
+          <w:p>
+            <w:pPr>
+              <w:jc w:val="center"/>
+              <w:rPr>
+                <w:i/>
+                <w:iCs/>
+                <w:color w:val="808080" w:themeColor="background1" w:themeShade="80"/>
+                <w:sz w:val="22"/>
+                <w:szCs w:val="22"/>
+              </w:rPr>
+            </w:pPr>
+            <w:r>
+              <w:rPr>
+                <w:i/>
+                <w:iCs/>
+                <w:color w:val="808080" w:themeColor="background1" w:themeShade="80"/>
+                <w:sz w:val="22"/>
+                <w:szCs w:val="22"/>
+              </w:rPr>
+              <w:t>Export of “Use Case Diagram” from Draw.io MacOS taken the 12</w:t>
+            </w:r>
+            <w:r>
+              <w:rPr>
+                <w:i/>
+                <w:iCs/>
+                <w:color w:val="808080" w:themeColor="background1" w:themeShade="80"/>
+                <w:sz w:val="22"/>
+                <w:szCs w:val="22"/>
+                <w:vertAlign w:val="superscript"/>
+              </w:rPr>
+              <w:t>th</w:t>
+            </w:r>
+            <w:r>
+              <w:rPr>
+                <w:i/>
+                <w:iCs/>
+                <w:color w:val="808080" w:themeColor="background1" w:themeShade="80"/>
+                <w:sz w:val="22"/>
+                <w:szCs w:val="22"/>
+              </w:rPr>
+              <w:t xml:space="preserve"> Aug 2026.</w:t>
+            </w:r>
+          </w:p>
         </w:tc>
       </w:tr>
     </w:tbl>
+    <w:p/>
+    <w:p>
+      <w:r>
+        <w:t>next page &gt;&gt;</w:t>
+      </w:r>
+    </w:p>
+    <w:tbl>
+      <w:tblPr>
+        <w:tblStyle w:val="TableGrid"/>
+        <w:tblW w:w="0" w:type="auto"/>
+        <w:tblBorders>
+          <w:top w:val="none" w:sz="0" w:space="0" w:color="auto"/>
+          <w:left w:val="none" w:sz="0" w:space="0" w:color="auto"/>
+          <w:bottom w:val="none" w:sz="0" w:space="0" w:color="auto"/>
+          <w:right w:val="none" w:sz="0" w:space="0" w:color="auto"/>
+          <w:insideH w:val="none" w:sz="0" w:space="0" w:color="auto"/>
+          <w:insideV w:val="none" w:sz="0" w:space="0" w:color="auto"/>
+        </w:tblBorders>
+        <w:tblLook w:val="04A0" w:firstRow="1" w:lastRow="0" w:firstColumn="1" w:lastColumn="0" w:noHBand="0" w:noVBand="1"/>
+      </w:tblPr>
+      <w:tblGrid>
+        <w:gridCol w:w="9016"/>
+      </w:tblGrid>
+      <w:tr>
+        <w:tc>
+          <w:tcPr>
+            <w:tcW w:w="9016" w:type="dxa"/>
+          </w:tcPr>
+          <w:p>
+            <w:r>
+              <w:rPr>
+                <w:noProof/>
+              </w:rPr>
+              <w:lastRenderedPageBreak/>
+              <w:drawing>
+                <wp:inline distT="0" distB="0" distL="0" distR="0" wp14:anchorId="70D908C3" wp14:editId="658A4270">
+                  <wp:extent cx="5537771" cy="4113755"/>
+                  <wp:effectExtent l="0" t="0" r="0" b="1270"/>
+                  <wp:docPr id="1417198798" name="Picture 2"/>
+                  <wp:cNvGraphicFramePr>
+                    <a:graphicFrameLocks xmlns:a="http://schemas.openxmlformats.org/drawingml/2006/main" noChangeAspect="1"/>
+                  </wp:cNvGraphicFramePr>
+                  <a:graphic xmlns:a="http://schemas.openxmlformats.org/drawingml/2006/main">
+                    <a:graphicData uri="http://schemas.openxmlformats.org/drawingml/2006/picture">
+                      <pic:pic xmlns:pic="http://schemas.openxmlformats.org/drawingml/2006/picture">
+                        <pic:nvPicPr>
+                          <pic:cNvPr id="1417198798" name="Picture 1417198798"/>
+                          <pic:cNvPicPr/>
+                        </pic:nvPicPr>
+                        <pic:blipFill>
+                          <a:blip r:embed="rId9">
+                            <a:extLst>
+                              <a:ext uri="{28A0092B-C50C-407E-A947-70E740481C1C}">
+                                <a14:useLocalDpi xmlns:a14="http://schemas.microsoft.com/office/drawing/2010/main" val="0"/>
+                              </a:ext>
+                            </a:extLst>
+                          </a:blip>
+                          <a:stretch>
+                            <a:fillRect/>
+                          </a:stretch>
+                        </pic:blipFill>
+                        <pic:spPr>
+                          <a:xfrm>
+                            <a:off x="0" y="0"/>
+                            <a:ext cx="5545630" cy="4119593"/>
+                          </a:xfrm>
+                          <a:prstGeom prst="rect">
+                            <a:avLst/>
+                          </a:prstGeom>
+                        </pic:spPr>
+                      </pic:pic>
+                    </a:graphicData>
+                  </a:graphic>
+                </wp:inline>
+              </w:drawing>
+            </w:r>
+          </w:p>
+        </w:tc>
+      </w:tr>
+      <w:tr>
+        <w:tc>
+          <w:tcPr>
+            <w:tcW w:w="9016" w:type="dxa"/>
+          </w:tcPr>
+          <w:p>
+            <w:pPr>
+              <w:jc w:val="center"/>
+            </w:pPr>
+            <w:r>
+              <w:rPr>
+                <w:i/>
+                <w:iCs/>
+                <w:color w:val="808080" w:themeColor="background1" w:themeShade="80"/>
+                <w:sz w:val="22"/>
+                <w:szCs w:val="22"/>
+              </w:rPr>
+              <w:t>Export of “</w:t>
+            </w:r>
+            <w:r>
+              <w:rPr>
+                <w:i/>
+                <w:iCs/>
+                <w:color w:val="808080" w:themeColor="background1" w:themeShade="80"/>
+                <w:sz w:val="22"/>
+                <w:szCs w:val="22"/>
+              </w:rPr>
+              <w:t>Class</w:t>
+            </w:r>
+            <w:r>
+              <w:rPr>
+                <w:i/>
+                <w:iCs/>
+                <w:color w:val="808080" w:themeColor="background1" w:themeShade="80"/>
+                <w:sz w:val="22"/>
+                <w:szCs w:val="22"/>
+              </w:rPr>
+              <w:t xml:space="preserve"> Diagram” from Draw.io MacOS taken the 12</w:t>
+            </w:r>
+            <w:r>
+              <w:rPr>
+                <w:i/>
+                <w:iCs/>
+                <w:color w:val="808080" w:themeColor="background1" w:themeShade="80"/>
+                <w:sz w:val="22"/>
+                <w:szCs w:val="22"/>
+                <w:vertAlign w:val="superscript"/>
+              </w:rPr>
+              <w:t>th</w:t>
+            </w:r>
+            <w:r>
+              <w:rPr>
+                <w:i/>
+                <w:iCs/>
+                <w:color w:val="808080" w:themeColor="background1" w:themeShade="80"/>
+                <w:sz w:val="22"/>
+                <w:szCs w:val="22"/>
+              </w:rPr>
+              <w:t xml:space="preserve"> Aug 2026.</w:t>
+            </w:r>
+          </w:p>
+        </w:tc>
+      </w:tr>
+    </w:tbl>
+    <w:p/>
     <w:p/>
     <w:tbl>
       <w:tblPr>
         <w:tblStyle w:val="TableGrid"/>
         <w:tblW w:w="0" w:type="auto"/>
+        <w:tblBorders>
+          <w:top w:val="none" w:sz="0" w:space="0" w:color="auto"/>
+          <w:left w:val="none" w:sz="0" w:space="0" w:color="auto"/>
+          <w:bottom w:val="none" w:sz="0" w:space="0" w:color="auto"/>
+          <w:right w:val="none" w:sz="0" w:space="0" w:color="auto"/>
+          <w:insideH w:val="none" w:sz="0" w:space="0" w:color="auto"/>
+          <w:insideV w:val="none" w:sz="0" w:space="0" w:color="auto"/>
+        </w:tblBorders>
         <w:tblLook w:val="04A0" w:firstRow="1" w:lastRow="0" w:firstColumn="1" w:lastColumn="0" w:noHBand="0" w:noVBand="1"/>
       </w:tblPr>
       <w:tblGrid>
-        <w:gridCol w:w="4508"/>
-        <w:gridCol w:w="4508"/>
+        <w:gridCol w:w="9016"/>
       </w:tblGrid>
       <w:tr>
         <w:tc>
           <w:tcPr>
-            <w:tcW w:w="4508" w:type="dxa"/>
+            <w:tcW w:w="9016" w:type="dxa"/>
           </w:tcPr>
-          <w:p/>
-        </w:tc>
-        <w:tc>
-          <w:tcPr>
-            <w:tcW w:w="4508" w:type="dxa"/>
-          </w:tcPr>
-          <w:p/>
+          <w:p>
+            <w:r>
+              <w:rPr>
+                <w:noProof/>
+              </w:rPr>
+              <w:drawing>
+                <wp:inline distT="0" distB="0" distL="0" distR="0" wp14:anchorId="593A65F4" wp14:editId="18925EB6">
+                  <wp:extent cx="5584958" cy="1577228"/>
+                  <wp:effectExtent l="0" t="0" r="3175" b="0"/>
+                  <wp:docPr id="125874207" name="Picture 5"/>
+                  <wp:cNvGraphicFramePr>
+                    <a:graphicFrameLocks xmlns:a="http://schemas.openxmlformats.org/drawingml/2006/main" noChangeAspect="1"/>
+                  </wp:cNvGraphicFramePr>
+                  <a:graphic xmlns:a="http://schemas.openxmlformats.org/drawingml/2006/main">
+                    <a:graphicData uri="http://schemas.openxmlformats.org/drawingml/2006/picture">
+                      <pic:pic xmlns:pic="http://schemas.openxmlformats.org/drawingml/2006/picture">
+                        <pic:nvPicPr>
+                          <pic:cNvPr id="125874207" name="Picture 125874207"/>
+                          <pic:cNvPicPr/>
+                        </pic:nvPicPr>
+                        <pic:blipFill>
+                          <a:blip r:embed="rId10" cstate="print">
+                            <a:extLst>
+                              <a:ext uri="{28A0092B-C50C-407E-A947-70E740481C1C}">
+                                <a14:useLocalDpi xmlns:a14="http://schemas.microsoft.com/office/drawing/2010/main" val="0"/>
+                              </a:ext>
+                            </a:extLst>
+                          </a:blip>
+                          <a:stretch>
+                            <a:fillRect/>
+                          </a:stretch>
+                        </pic:blipFill>
+                        <pic:spPr>
+                          <a:xfrm>
+                            <a:off x="0" y="0"/>
+                            <a:ext cx="5696179" cy="1608637"/>
+                          </a:xfrm>
+                          <a:prstGeom prst="rect">
+                            <a:avLst/>
+                          </a:prstGeom>
+                        </pic:spPr>
+                      </pic:pic>
+                    </a:graphicData>
+                  </a:graphic>
+                </wp:inline>
+              </w:drawing>
+            </w:r>
+          </w:p>
         </w:tc>
       </w:tr>
       <w:tr>
         <w:tc>
           <w:tcPr>
-            <w:tcW w:w="4508" w:type="dxa"/>
+            <w:tcW w:w="9016" w:type="dxa"/>
           </w:tcPr>
-          <w:p/>
-        </w:tc>
-        <w:tc>
-          <w:tcPr>
-            <w:tcW w:w="4508" w:type="dxa"/>
-          </w:tcPr>
-          <w:p/>
+          <w:p>
+            <w:pPr>
+              <w:jc w:val="center"/>
+            </w:pPr>
+            <w:r>
+              <w:rPr>
+                <w:i/>
+                <w:iCs/>
+                <w:color w:val="808080" w:themeColor="background1" w:themeShade="80"/>
+                <w:sz w:val="22"/>
+                <w:szCs w:val="22"/>
+              </w:rPr>
+              <w:t>Export of “</w:t>
+            </w:r>
+            <w:r>
+              <w:rPr>
+                <w:i/>
+                <w:iCs/>
+                <w:color w:val="808080" w:themeColor="background1" w:themeShade="80"/>
+                <w:sz w:val="22"/>
+                <w:szCs w:val="22"/>
+              </w:rPr>
+              <w:t>Sequence</w:t>
+            </w:r>
+            <w:r>
+              <w:rPr>
+                <w:i/>
+                <w:iCs/>
+                <w:color w:val="808080" w:themeColor="background1" w:themeShade="80"/>
+                <w:sz w:val="22"/>
+                <w:szCs w:val="22"/>
+              </w:rPr>
+              <w:t xml:space="preserve"> Diagram” from Draw.io MacOS taken the 12</w:t>
+            </w:r>
+            <w:r>
+              <w:rPr>
+                <w:i/>
+                <w:iCs/>
+                <w:color w:val="808080" w:themeColor="background1" w:themeShade="80"/>
+                <w:sz w:val="22"/>
+                <w:szCs w:val="22"/>
+                <w:vertAlign w:val="superscript"/>
+              </w:rPr>
+              <w:t>th</w:t>
+            </w:r>
+            <w:r>
+              <w:rPr>
+                <w:i/>
+                <w:iCs/>
+                <w:color w:val="808080" w:themeColor="background1" w:themeShade="80"/>
+                <w:sz w:val="22"/>
+                <w:szCs w:val="22"/>
+              </w:rPr>
+              <w:t xml:space="preserve"> Aug 2026.</w:t>
+            </w:r>
+          </w:p>
         </w:tc>
       </w:tr>
     </w:tbl>
     <w:p/>
-    <w:tbl>
-      <w:tblPr>
-        <w:tblStyle w:val="TableGrid"/>
-        <w:tblW w:w="0" w:type="auto"/>
-        <w:tblLook w:val="04A0" w:firstRow="1" w:lastRow="0" w:firstColumn="1" w:lastColumn="0" w:noHBand="0" w:noVBand="1"/>
-      </w:tblPr>
-      <w:tblGrid>
-        <w:gridCol w:w="4508"/>
-        <w:gridCol w:w="4508"/>
-      </w:tblGrid>
-      <w:tr>
-        <w:tc>
-          <w:tcPr>
-            <w:tcW w:w="4508" w:type="dxa"/>
-          </w:tcPr>
-          <w:p/>
-        </w:tc>
-        <w:tc>
-          <w:tcPr>
-            <w:tcW w:w="4508" w:type="dxa"/>
-          </w:tcPr>
-          <w:p/>
-        </w:tc>
-      </w:tr>
-      <w:tr>
-        <w:tc>
-          <w:tcPr>
-            <w:tcW w:w="4508" w:type="dxa"/>
-          </w:tcPr>
-          <w:p/>
-        </w:tc>
-        <w:tc>
-          <w:tcPr>
-            <w:tcW w:w="4508" w:type="dxa"/>
-          </w:tcPr>
-          <w:p/>
-        </w:tc>
-      </w:tr>
-    </w:tbl>
-    <w:p/>
-    <w:p/>
     <w:p>
+      <w:pPr>
+        <w:rPr>
+          <w:rFonts w:hint="eastAsia"/>
+        </w:rPr>
+      </w:pPr>
+      <w:r>
+        <w:t>next page &gt;&gt;</w:t>
+      </w:r>
       <w:r>
         <w:br w:type="page"/>
+      </w:r>
+    </w:p>
+    <w:p>
+      <w:pPr>
+        <w:pStyle w:val="Title"/>
+        <w:jc w:val="center"/>
+        <w:rPr>
+          <w:rFonts w:hint="eastAsia"/>
+        </w:rPr>
+      </w:pPr>
+      <w:r>
+        <w:lastRenderedPageBreak/>
+        <w:t>Evidence and Evaluation</w:t>
       </w:r>
     </w:p>
     <w:p/>
     <w:p>
       <w:pPr>
-        <w:pStyle w:val="Heading1"/>
+        <w:pStyle w:val="Heading2"/>
         <w:rPr>
           <w:rFonts w:hint="eastAsia"/>
         </w:rPr>
       </w:pPr>
+      <w:r>
+        <w:t>Part 1</w:t>
+      </w:r>
+      <w:r>
+        <w:t>:</w:t>
+      </w:r>
+      <w:r>
+        <w:t xml:space="preserve"> (max of 1500 words)</w:t>
+      </w:r>
     </w:p>
     <w:p>
       <w:pPr>
-        <w:pStyle w:val="Heading1"/>
-        <w:rPr>
-          <w:rFonts w:hint="eastAsia"/>
-        </w:rPr>
-      </w:pPr>
-      <w:r>
-        <w:t>Evidence and Evaluation:</w:t>
-      </w:r>
-    </w:p>
-    <w:p/>
-    <w:p>
-      <w:pPr>
-        <w:pStyle w:val="Heading2"/>
-        <w:rPr>
-          <w:rFonts w:hint="eastAsia"/>
-        </w:rPr>
-      </w:pPr>
-      <w:r>
-        <w:t>Part 1</w:t>
-      </w:r>
-      <w:r>
-        <w:t>:</w:t>
-      </w:r>
-      <w:r>
-        <w:t xml:space="preserve"> (max of 1500 words)</w:t>
+        <w:rPr>
+          <w:lang w:eastAsia="en-GB"/>
+        </w:rPr>
+      </w:pPr>
+      <w:r>
+        <w:rPr>
+          <w:lang w:eastAsia="en-GB"/>
+        </w:rPr>
+        <w:t>Using evidence, evaluate how you have applied correct Object-oriented design principles in your refactoring by comparing it to the principles that were broken</w:t>
+      </w:r>
+      <w:r>
+        <w:rPr>
+          <w:lang w:eastAsia="en-GB"/>
+        </w:rPr>
+        <w:t xml:space="preserve"> in the original code</w:t>
+      </w:r>
+      <w:r>
+        <w:rPr>
+          <w:lang w:eastAsia="en-GB"/>
+        </w:rPr>
+        <w:t>. Provide a clear explanation of which design patterns were implemented, why they are appropriate and how they improve the design of your refactored system.</w:t>
       </w:r>
     </w:p>
     <w:p>
@@ -1311,24 +1630,6 @@
           <w:lang w:eastAsia="en-GB"/>
         </w:rPr>
       </w:pPr>
-      <w:r>
-        <w:rPr>
-          <w:lang w:eastAsia="en-GB"/>
-        </w:rPr>
-        <w:t>Using evidence, evaluate how you have applied correct Object-oriented design principles in your refactoring by comparing it to the principles that were broken</w:t>
-      </w:r>
-      <w:r>
-        <w:rPr>
-          <w:lang w:eastAsia="en-GB"/>
-        </w:rPr>
-        <w:t xml:space="preserve"> in the original code</w:t>
-      </w:r>
-      <w:r>
-        <w:rPr>
-          <w:lang w:eastAsia="en-GB"/>
-        </w:rPr>
-        <w:t>. Provide a clear explanation of which design patterns were implemented, why they are appropriate and how they improve the design of your refactored system.</w:t>
-      </w:r>
     </w:p>
     <w:p>
       <w:pPr>
@@ -1336,6 +1637,24 @@
           <w:lang w:eastAsia="en-GB"/>
         </w:rPr>
       </w:pPr>
+      <w:r>
+        <w:rPr>
+          <w:lang w:eastAsia="en-GB"/>
+        </w:rPr>
+        <w:t xml:space="preserve">Object Oriented </w:t>
+      </w:r>
+      <w:r>
+        <w:rPr>
+          <w:lang w:eastAsia="en-GB"/>
+        </w:rPr>
+        <w:t>principles</w:t>
+      </w:r>
+      <w:r>
+        <w:rPr>
+          <w:lang w:eastAsia="en-GB"/>
+        </w:rPr>
+        <w:t>:</w:t>
+      </w:r>
     </w:p>
     <w:p>
       <w:pPr>
@@ -1343,9 +1662,39 @@
           <w:lang w:eastAsia="en-GB"/>
         </w:rPr>
       </w:pPr>
+      <w:r>
+        <w:rPr>
+          <w:lang w:eastAsia="en-GB"/>
+        </w:rPr>
+        <w:t>Encapsulation, Abstraction</w:t>
+      </w:r>
+      <w:r>
+        <w:rPr>
+          <w:lang w:eastAsia="en-GB"/>
+        </w:rPr>
+        <w:t xml:space="preserve"> &amp; Polymorphism</w:t>
+      </w:r>
     </w:p>
-    <w:p/>
-    <w:p/>
+    <w:p>
+      <w:pPr>
+        <w:rPr>
+          <w:lang w:eastAsia="en-GB"/>
+        </w:rPr>
+      </w:pPr>
+    </w:p>
+    <w:p>
+      <w:r>
+        <w:t xml:space="preserve">Features that prove Testability, maintainability, </w:t>
+      </w:r>
+      <w:r>
+        <w:t xml:space="preserve">and extendibility. </w:t>
+      </w:r>
+    </w:p>
+    <w:p>
+      <w:r>
+        <w:t xml:space="preserve">Such as Immutability, Value Objects instead of Public Lists, Composition over Inheritance and Dependency Injection just to state some of the many principles used here. </w:t>
+      </w:r>
+    </w:p>
     <w:p/>
     <w:p/>
     <w:p>

</xml_diff>

<commit_message>
Some slight improvement on the report, but need some sleep before the flight this morning...
</commit_message>
<xml_diff>
--- a/CM2307_CW_StudentNumber.docx.docx
+++ b/CM2307_CW_StudentNumber.docx.docx
@@ -1602,97 +1602,526 @@
     <w:p>
       <w:pPr>
         <w:rPr>
+          <w:color w:val="808080" w:themeColor="background1" w:themeShade="80"/>
           <w:lang w:eastAsia="en-GB"/>
         </w:rPr>
       </w:pPr>
       <w:r>
         <w:rPr>
+          <w:color w:val="808080" w:themeColor="background1" w:themeShade="80"/>
           <w:lang w:eastAsia="en-GB"/>
         </w:rPr>
         <w:t>Using evidence, evaluate how you have applied correct Object-oriented design principles in your refactoring by comparing it to the principles that were broken</w:t>
       </w:r>
       <w:r>
         <w:rPr>
+          <w:color w:val="808080" w:themeColor="background1" w:themeShade="80"/>
           <w:lang w:eastAsia="en-GB"/>
         </w:rPr>
         <w:t xml:space="preserve"> in the original code</w:t>
       </w:r>
       <w:r>
         <w:rPr>
+          <w:color w:val="808080" w:themeColor="background1" w:themeShade="80"/>
           <w:lang w:eastAsia="en-GB"/>
         </w:rPr>
         <w:t>. Provide a clear explanation of which design patterns were implemented, why they are appropriate and how they improve the design of your refactored system.</w:t>
+      </w:r>
+    </w:p>
+    <w:p/>
+    <w:p>
+      <w:r>
+        <w:t xml:space="preserve">The improved implementation of the student job portal </w:t>
+      </w:r>
+      <w:r>
+        <w:t>manages to</w:t>
+      </w:r>
+      <w:r>
+        <w:t xml:space="preserve"> use object oriented (O.O.)</w:t>
+      </w:r>
+      <w:r>
+        <w:t xml:space="preserve"> principles to render the program more maintain-able, extend-able and test-able. It does this thanks to encapsulation, abstraction and polymorphism supported by several design patterns like immutability, value objects (UUIDs), composition, dependency injection and many more. </w:t>
+      </w:r>
+    </w:p>
+    <w:p/>
+    <w:tbl>
+      <w:tblPr>
+        <w:tblStyle w:val="TableGrid"/>
+        <w:tblW w:w="0" w:type="auto"/>
+        <w:tblBorders>
+          <w:top w:val="none" w:sz="0" w:space="0" w:color="auto"/>
+          <w:left w:val="none" w:sz="0" w:space="0" w:color="auto"/>
+          <w:bottom w:val="none" w:sz="0" w:space="0" w:color="auto"/>
+          <w:right w:val="none" w:sz="0" w:space="0" w:color="auto"/>
+          <w:insideH w:val="none" w:sz="0" w:space="0" w:color="auto"/>
+          <w:insideV w:val="none" w:sz="0" w:space="0" w:color="auto"/>
+        </w:tblBorders>
+        <w:tblLook w:val="04A0" w:firstRow="1" w:lastRow="0" w:firstColumn="1" w:lastColumn="0" w:noHBand="0" w:noVBand="1"/>
+      </w:tblPr>
+      <w:tblGrid>
+        <w:gridCol w:w="4508"/>
+        <w:gridCol w:w="4508"/>
+      </w:tblGrid>
+      <w:tr>
+        <w:tc>
+          <w:tcPr>
+            <w:tcW w:w="4508" w:type="dxa"/>
+          </w:tcPr>
+          <w:p>
+            <w:r>
+              <w:t>In the original application (seen to the right in this instance), the entire system was comprised in one file: “StudentJobPortal.java”</w:t>
+            </w:r>
+            <w:r>
+              <w:t xml:space="preserve"> inside its main() method</w:t>
+            </w:r>
+            <w:r>
+              <w:t xml:space="preserve">. Generally, having more than 1 responsibility inside a file makes things complicated, </w:t>
+            </w:r>
+            <w:r>
+              <w:t>maintenance heavy</w:t>
+            </w:r>
+            <w:r>
+              <w:t xml:space="preserve">, </w:t>
+            </w:r>
+            <w:r>
+              <w:t>hard to test</w:t>
+            </w:r>
+            <w:r>
+              <w:t xml:space="preserve"> and </w:t>
+            </w:r>
+            <w:r>
+              <w:t>very difficult to improve upon in future iterations.</w:t>
+            </w:r>
+            <w:r>
+              <w:t xml:space="preserve"> </w:t>
+            </w:r>
+          </w:p>
+        </w:tc>
+        <w:tc>
+          <w:tcPr>
+            <w:tcW w:w="4508" w:type="dxa"/>
+          </w:tcPr>
+          <w:tbl>
+            <w:tblPr>
+              <w:tblStyle w:val="TableGrid"/>
+              <w:tblW w:w="0" w:type="auto"/>
+              <w:tblLook w:val="04A0" w:firstRow="1" w:lastRow="0" w:firstColumn="1" w:lastColumn="0" w:noHBand="0" w:noVBand="1"/>
+            </w:tblPr>
+            <w:tblGrid>
+              <w:gridCol w:w="4282"/>
+            </w:tblGrid>
+            <w:tr>
+              <w:tc>
+                <w:tcPr>
+                  <w:tcW w:w="4282" w:type="dxa"/>
+                </w:tcPr>
+                <w:p/>
+              </w:tc>
+            </w:tr>
+            <w:tr>
+              <w:tc>
+                <w:tcPr>
+                  <w:tcW w:w="4282" w:type="dxa"/>
+                </w:tcPr>
+                <w:p/>
+              </w:tc>
+            </w:tr>
+          </w:tbl>
+          <w:p/>
+        </w:tc>
+      </w:tr>
+      <w:tr>
+        <w:tc>
+          <w:tcPr>
+            <w:tcW w:w="4508" w:type="dxa"/>
+          </w:tcPr>
+          <w:tbl>
+            <w:tblPr>
+              <w:tblStyle w:val="TableGrid"/>
+              <w:tblW w:w="0" w:type="auto"/>
+              <w:tblLook w:val="04A0" w:firstRow="1" w:lastRow="0" w:firstColumn="1" w:lastColumn="0" w:noHBand="0" w:noVBand="1"/>
+            </w:tblPr>
+            <w:tblGrid>
+              <w:gridCol w:w="4282"/>
+            </w:tblGrid>
+            <w:tr>
+              <w:tc>
+                <w:tcPr>
+                  <w:tcW w:w="4282" w:type="dxa"/>
+                </w:tcPr>
+                <w:p/>
+              </w:tc>
+            </w:tr>
+            <w:tr>
+              <w:tc>
+                <w:tcPr>
+                  <w:tcW w:w="4282" w:type="dxa"/>
+                </w:tcPr>
+                <w:p/>
+              </w:tc>
+            </w:tr>
+          </w:tbl>
+          <w:p/>
+        </w:tc>
+        <w:tc>
+          <w:tcPr>
+            <w:tcW w:w="4508" w:type="dxa"/>
+          </w:tcPr>
+          <w:p>
+            <w:r>
+              <w:t>On top of that, job information is represented in the form of 5 separate mutable static lists, which is generally not good practice, because the program is expecting very specific information, and if that information isn’t filled out as it</w:t>
+            </w:r>
+            <w:r>
+              <w:t>’s</w:t>
+            </w:r>
+            <w:r>
+              <w:t xml:space="preserve"> expected (for some reason) this could cause errors</w:t>
+            </w:r>
+            <w:r>
+              <w:t>,</w:t>
+            </w:r>
+            <w:r>
+              <w:t xml:space="preserve"> or </w:t>
+            </w:r>
+            <w:r>
+              <w:t>worst-case</w:t>
+            </w:r>
+            <w:r>
+              <w:t xml:space="preserve"> scenario, crashes further down the line.</w:t>
+            </w:r>
+          </w:p>
+        </w:tc>
+      </w:tr>
+    </w:tbl>
+    <w:p/>
+    <w:p>
+      <w:r>
+        <w:t xml:space="preserve">This is known as “breaking encapsulation”, because there is no “Job” object responsible for protecting and validating the state belonging to a single job; instead, </w:t>
+      </w:r>
+      <w:r>
+        <w:t xml:space="preserve">a job only exists through matching indexes across several different lists. </w:t>
       </w:r>
     </w:p>
     <w:p>
-      <w:pPr>
-        <w:rPr>
-          <w:lang w:eastAsia="en-GB"/>
-        </w:rPr>
-      </w:pPr>
+      <w:r>
+        <w:t xml:space="preserve">For example, in this instance: </w:t>
+      </w:r>
+      <w:proofErr w:type="spellStart"/>
+      <w:r>
+        <w:t>jobTitles.get</w:t>
+      </w:r>
+      <w:proofErr w:type="spellEnd"/>
+      <w:r>
+        <w:t>(</w:t>
+      </w:r>
+      <w:proofErr w:type="spellStart"/>
+      <w:r>
+        <w:t>i</w:t>
+      </w:r>
+      <w:proofErr w:type="spellEnd"/>
+      <w:r>
+        <w:t xml:space="preserve">), </w:t>
+      </w:r>
+      <w:proofErr w:type="spellStart"/>
+      <w:r>
+        <w:t>companies.get</w:t>
+      </w:r>
+      <w:proofErr w:type="spellEnd"/>
+      <w:r>
+        <w:t>(</w:t>
+      </w:r>
+      <w:proofErr w:type="spellStart"/>
+      <w:r>
+        <w:t>i</w:t>
+      </w:r>
+      <w:proofErr w:type="spellEnd"/>
+      <w:r>
+        <w:t xml:space="preserve">), </w:t>
+      </w:r>
+      <w:proofErr w:type="spellStart"/>
+      <w:r>
+        <w:t>jobTypes.get</w:t>
+      </w:r>
+      <w:proofErr w:type="spellEnd"/>
+      <w:r>
+        <w:t>(</w:t>
+      </w:r>
+      <w:proofErr w:type="spellStart"/>
+      <w:r>
+        <w:t>i</w:t>
+      </w:r>
+      <w:proofErr w:type="spellEnd"/>
+      <w:r>
+        <w:t>) etc…</w:t>
+      </w:r>
+    </w:p>
+    <w:p/>
+    <w:p>
+      <w:r>
+        <w:t xml:space="preserve">If a programming error occurs that adds an element </w:t>
+      </w:r>
+      <w:r>
+        <w:t>to one of the lists, it would place the system in to an “error / inconsistent state”.</w:t>
+      </w:r>
+    </w:p>
+    <w:p/>
+    <w:p>
+      <w:r>
+        <w:br w:type="page"/>
+      </w:r>
     </w:p>
     <w:p>
-      <w:pPr>
-        <w:rPr>
-          <w:lang w:eastAsia="en-GB"/>
-        </w:rPr>
-      </w:pPr>
-      <w:r>
-        <w:rPr>
-          <w:lang w:eastAsia="en-GB"/>
-        </w:rPr>
-        <w:t xml:space="preserve">Object Oriented </w:t>
-      </w:r>
-      <w:r>
-        <w:rPr>
-          <w:lang w:eastAsia="en-GB"/>
-        </w:rPr>
-        <w:t>principles</w:t>
-      </w:r>
-      <w:r>
-        <w:rPr>
-          <w:lang w:eastAsia="en-GB"/>
-        </w:rPr>
-        <w:t>:</w:t>
+      <w:r>
+        <w:lastRenderedPageBreak/>
+        <w:t>The updated version of the program addresses this by introducing an immutable domain class, and a job is now represented using the following;</w:t>
+      </w:r>
+    </w:p>
+    <w:p/>
+    <w:tbl>
+      <w:tblPr>
+        <w:tblStyle w:val="TableGrid"/>
+        <w:tblW w:w="0" w:type="auto"/>
+        <w:tblLook w:val="04A0" w:firstRow="1" w:lastRow="0" w:firstColumn="1" w:lastColumn="0" w:noHBand="0" w:noVBand="1"/>
+      </w:tblPr>
+      <w:tblGrid>
+        <w:gridCol w:w="9016"/>
+      </w:tblGrid>
+      <w:tr>
+        <w:tc>
+          <w:tcPr>
+            <w:tcW w:w="9016" w:type="dxa"/>
+          </w:tcPr>
+          <w:p/>
+        </w:tc>
+      </w:tr>
+      <w:tr>
+        <w:tc>
+          <w:tcPr>
+            <w:tcW w:w="9016" w:type="dxa"/>
+          </w:tcPr>
+          <w:p>
+            <w:pPr>
+              <w:jc w:val="center"/>
+            </w:pPr>
+            <w:r>
+              <w:rPr>
+                <w:color w:val="808080" w:themeColor="background1" w:themeShade="80"/>
+                <w:sz w:val="22"/>
+                <w:szCs w:val="22"/>
+              </w:rPr>
+              <w:t xml:space="preserve">Extract from </w:t>
+            </w:r>
+            <w:r>
+              <w:rPr>
+                <w:color w:val="808080" w:themeColor="background1" w:themeShade="80"/>
+                <w:sz w:val="22"/>
+                <w:szCs w:val="22"/>
+              </w:rPr>
+              <w:t>“</w:t>
+            </w:r>
+            <w:proofErr w:type="spellStart"/>
+            <w:r>
+              <w:rPr>
+                <w:color w:val="808080" w:themeColor="background1" w:themeShade="80"/>
+                <w:sz w:val="22"/>
+                <w:szCs w:val="22"/>
+              </w:rPr>
+              <w:t>src</w:t>
+            </w:r>
+            <w:proofErr w:type="spellEnd"/>
+            <w:r>
+              <w:rPr>
+                <w:color w:val="808080" w:themeColor="background1" w:themeShade="80"/>
+                <w:sz w:val="22"/>
+                <w:szCs w:val="22"/>
+              </w:rPr>
+              <w:t>/main/java/com/</w:t>
+            </w:r>
+            <w:proofErr w:type="spellStart"/>
+            <w:r>
+              <w:rPr>
+                <w:color w:val="808080" w:themeColor="background1" w:themeShade="80"/>
+                <w:sz w:val="22"/>
+                <w:szCs w:val="22"/>
+              </w:rPr>
+              <w:t>studentjobportal</w:t>
+            </w:r>
+            <w:proofErr w:type="spellEnd"/>
+            <w:r>
+              <w:rPr>
+                <w:color w:val="808080" w:themeColor="background1" w:themeShade="80"/>
+                <w:sz w:val="22"/>
+                <w:szCs w:val="22"/>
+              </w:rPr>
+              <w:t>/model/Job.java</w:t>
+            </w:r>
+            <w:r>
+              <w:rPr>
+                <w:color w:val="808080" w:themeColor="background1" w:themeShade="80"/>
+                <w:sz w:val="22"/>
+                <w:szCs w:val="22"/>
+              </w:rPr>
+              <w:t>”</w:t>
+            </w:r>
+            <w:r>
+              <w:rPr>
+                <w:color w:val="808080" w:themeColor="background1" w:themeShade="80"/>
+                <w:sz w:val="22"/>
+                <w:szCs w:val="22"/>
+              </w:rPr>
+              <w:t xml:space="preserve"> on the 13</w:t>
+            </w:r>
+            <w:r>
+              <w:rPr>
+                <w:color w:val="808080" w:themeColor="background1" w:themeShade="80"/>
+                <w:sz w:val="22"/>
+                <w:szCs w:val="22"/>
+                <w:vertAlign w:val="superscript"/>
+              </w:rPr>
+              <w:t>th</w:t>
+            </w:r>
+            <w:r>
+              <w:rPr>
+                <w:color w:val="808080" w:themeColor="background1" w:themeShade="80"/>
+                <w:sz w:val="22"/>
+                <w:szCs w:val="22"/>
+              </w:rPr>
+              <w:t xml:space="preserve"> Aug 2026.</w:t>
+            </w:r>
+          </w:p>
+        </w:tc>
+      </w:tr>
+    </w:tbl>
+    <w:p/>
+    <w:p>
+      <w:r>
+        <w:t>This on the other hand, does demonstrate encapsulation, because first of all; the internal state is private</w:t>
+      </w:r>
+      <w:r>
+        <w:t xml:space="preserve"> which means it can’t be modified, it can only be read using controlled “accessor methods” such as </w:t>
+      </w:r>
+      <w:proofErr w:type="spellStart"/>
+      <w:proofErr w:type="gramStart"/>
+      <w:r>
+        <w:t>getTitle</w:t>
+      </w:r>
+      <w:proofErr w:type="spellEnd"/>
+      <w:r>
+        <w:t>(</w:t>
+      </w:r>
+      <w:proofErr w:type="gramEnd"/>
+      <w:r>
+        <w:t xml:space="preserve">) to get the job title. </w:t>
       </w:r>
     </w:p>
     <w:p>
-      <w:pPr>
-        <w:rPr>
-          <w:lang w:eastAsia="en-GB"/>
-        </w:rPr>
-      </w:pPr>
-      <w:r>
-        <w:rPr>
-          <w:lang w:eastAsia="en-GB"/>
-        </w:rPr>
-        <w:t>Encapsulation, Abstraction</w:t>
-      </w:r>
-      <w:r>
-        <w:rPr>
-          <w:lang w:eastAsia="en-GB"/>
-        </w:rPr>
-        <w:t xml:space="preserve"> &amp; Polymorphism</w:t>
+      <w:r>
+        <w:t xml:space="preserve">This also demonstrates immutability, because fields are marked as “final”, which means the classes expose no setters, and a valid job can’t be changed unexpectedly by another part of the application. Their construction is controlled through the </w:t>
+      </w:r>
+      <w:proofErr w:type="spellStart"/>
+      <w:r>
+        <w:t>Job.Builder</w:t>
+      </w:r>
+      <w:proofErr w:type="spellEnd"/>
+      <w:r>
+        <w:t>(), which validates identifiers and text fields before allowing a “job” to be made thanks to its “</w:t>
+      </w:r>
+      <w:proofErr w:type="gramStart"/>
+      <w:r>
+        <w:t>build(</w:t>
+      </w:r>
+      <w:proofErr w:type="gramEnd"/>
+      <w:r>
+        <w:t xml:space="preserve">)” method. </w:t>
       </w:r>
     </w:p>
+    <w:p/>
+    <w:tbl>
+      <w:tblPr>
+        <w:tblStyle w:val="TableGrid"/>
+        <w:tblW w:w="0" w:type="auto"/>
+        <w:tblBorders>
+          <w:top w:val="none" w:sz="0" w:space="0" w:color="auto"/>
+          <w:left w:val="none" w:sz="0" w:space="0" w:color="auto"/>
+          <w:bottom w:val="none" w:sz="0" w:space="0" w:color="auto"/>
+          <w:right w:val="none" w:sz="0" w:space="0" w:color="auto"/>
+          <w:insideH w:val="none" w:sz="0" w:space="0" w:color="auto"/>
+          <w:insideV w:val="none" w:sz="0" w:space="0" w:color="auto"/>
+        </w:tblBorders>
+        <w:tblLook w:val="04A0" w:firstRow="1" w:lastRow="0" w:firstColumn="1" w:lastColumn="0" w:noHBand="0" w:noVBand="1"/>
+      </w:tblPr>
+      <w:tblGrid>
+        <w:gridCol w:w="4508"/>
+        <w:gridCol w:w="4508"/>
+      </w:tblGrid>
+      <w:tr>
+        <w:tc>
+          <w:tcPr>
+            <w:tcW w:w="4508" w:type="dxa"/>
+          </w:tcPr>
+          <w:p>
+            <w:r>
+              <w:t>This moves me swiftly to my implementation of the Gang of Four (</w:t>
+            </w:r>
+            <w:proofErr w:type="spellStart"/>
+            <w:r>
+              <w:t>G.o.F.</w:t>
+            </w:r>
+            <w:proofErr w:type="spellEnd"/>
+            <w:r>
+              <w:t xml:space="preserve">) Builder Creational Pattern. </w:t>
+            </w:r>
+            <w:r>
+              <w:t>It’s appropriate here because the object in question (a job) contains several related properties and validation rules. This prevents us from having a multitude of indexed lists to create a single job and makes construction much clearer.</w:t>
+            </w:r>
+          </w:p>
+        </w:tc>
+        <w:tc>
+          <w:tcPr>
+            <w:tcW w:w="4508" w:type="dxa"/>
+          </w:tcPr>
+          <w:tbl>
+            <w:tblPr>
+              <w:tblStyle w:val="TableGrid"/>
+              <w:tblW w:w="0" w:type="auto"/>
+              <w:tblLook w:val="04A0" w:firstRow="1" w:lastRow="0" w:firstColumn="1" w:lastColumn="0" w:noHBand="0" w:noVBand="1"/>
+            </w:tblPr>
+            <w:tblGrid>
+              <w:gridCol w:w="4282"/>
+            </w:tblGrid>
+            <w:tr>
+              <w:tc>
+                <w:tcPr>
+                  <w:tcW w:w="4282" w:type="dxa"/>
+                </w:tcPr>
+                <w:p/>
+              </w:tc>
+            </w:tr>
+            <w:tr>
+              <w:tc>
+                <w:tcPr>
+                  <w:tcW w:w="4282" w:type="dxa"/>
+                </w:tcPr>
+                <w:p/>
+              </w:tc>
+            </w:tr>
+          </w:tbl>
+          <w:p/>
+        </w:tc>
+      </w:tr>
+    </w:tbl>
+    <w:p/>
     <w:p>
-      <w:pPr>
-        <w:rPr>
-          <w:lang w:eastAsia="en-GB"/>
-        </w:rPr>
-      </w:pPr>
-    </w:p>
-    <w:p>
-      <w:r>
-        <w:t xml:space="preserve">Features that prove Testability, maintainability, </w:t>
-      </w:r>
-      <w:r>
-        <w:t xml:space="preserve">and extendibility. </w:t>
-      </w:r>
-    </w:p>
-    <w:p>
-      <w:r>
-        <w:t xml:space="preserve">Such as Immutability, Value Objects instead of Public Lists, Composition over Inheritance and Dependency Injection just to state some of the many principles used here. </w:t>
+      <w:r>
+        <w:t xml:space="preserve">The same approach is used in model/Application.java where Application is also immutable and created using the </w:t>
+      </w:r>
+      <w:proofErr w:type="spellStart"/>
+      <w:r>
+        <w:t>Application.Builder</w:t>
+      </w:r>
+      <w:proofErr w:type="spellEnd"/>
+      <w:r>
+        <w:t>.</w:t>
       </w:r>
     </w:p>
     <w:p/>

</xml_diff>

<commit_message>
Backing up progress of report work
</commit_message>
<xml_diff>
--- a/CM2307_CW_StudentNumber.docx.docx
+++ b/CM2307_CW_StudentNumber.docx.docx
@@ -1585,9 +1585,6 @@
     <w:p>
       <w:pPr>
         <w:pStyle w:val="Heading2"/>
-        <w:rPr>
-          <w:rFonts w:hint="eastAsia"/>
-        </w:rPr>
       </w:pPr>
       <w:r>
         <w:t>Part 1</w:t>
@@ -1600,47 +1597,734 @@
       </w:r>
     </w:p>
     <w:p>
-      <w:pPr>
-        <w:rPr>
-          <w:color w:val="808080" w:themeColor="background1" w:themeShade="80"/>
-          <w:lang w:eastAsia="en-GB"/>
-        </w:rPr>
-      </w:pPr>
-      <w:r>
-        <w:rPr>
-          <w:color w:val="808080" w:themeColor="background1" w:themeShade="80"/>
-          <w:lang w:eastAsia="en-GB"/>
-        </w:rPr>
-        <w:t>Using evidence, evaluate how you have applied correct Object-oriented design principles in your refactoring by comparing it to the principles that were broken</w:t>
-      </w:r>
-      <w:r>
-        <w:rPr>
-          <w:color w:val="808080" w:themeColor="background1" w:themeShade="80"/>
-          <w:lang w:eastAsia="en-GB"/>
-        </w:rPr>
-        <w:t xml:space="preserve"> in the original code</w:t>
-      </w:r>
-      <w:r>
-        <w:rPr>
-          <w:color w:val="808080" w:themeColor="background1" w:themeShade="80"/>
-          <w:lang w:eastAsia="en-GB"/>
-        </w:rPr>
-        <w:t>. Provide a clear explanation of which design patterns were implemented, why they are appropriate and how they improve the design of your refactored system.</w:t>
+      <w:r>
+        <w:t xml:space="preserve">The improved implementation of the student job portal </w:t>
+      </w:r>
+      <w:r>
+        <w:t>manages to</w:t>
+      </w:r>
+      <w:r>
+        <w:t xml:space="preserve"> use object oriented (O.O.)</w:t>
+      </w:r>
+      <w:r>
+        <w:t xml:space="preserve"> principles to render the program more maintain-able, extend-able and test-able. It does this thanks to encapsulation, abstraction and polymorphism supported by several design patterns like immutability, value objects (UUIDs), composition, dependency injection and many more. </w:t>
       </w:r>
     </w:p>
     <w:p/>
     <w:p>
-      <w:r>
-        <w:t xml:space="preserve">The improved implementation of the student job portal </w:t>
-      </w:r>
-      <w:r>
-        <w:t>manages to</w:t>
-      </w:r>
-      <w:r>
-        <w:t xml:space="preserve"> use object oriented (O.O.)</w:t>
-      </w:r>
-      <w:r>
-        <w:t xml:space="preserve"> principles to render the program more maintain-able, extend-able and test-able. It does this thanks to encapsulation, abstraction and polymorphism supported by several design patterns like immutability, value objects (UUIDs), composition, dependency injection and many more. </w:t>
+      <w:pPr>
+        <w:jc w:val="both"/>
+      </w:pPr>
+      <w:r>
+        <w:t xml:space="preserve">In the original application (seen </w:t>
+      </w:r>
+      <w:r>
+        <w:t>bellow</w:t>
+      </w:r>
+      <w:r>
+        <w:t xml:space="preserve"> in this instance), the entire system was comprised in one file: “StudentJobPortal.java” inside its </w:t>
+      </w:r>
+      <w:proofErr w:type="gramStart"/>
+      <w:r>
+        <w:t>main(</w:t>
+      </w:r>
+      <w:proofErr w:type="gramEnd"/>
+      <w:r>
+        <w:t xml:space="preserve">) method. Generally, having more than 1 responsibility inside a file makes things complicated, maintenance heavy, hard to test and very difficult to improve upon in future iterations. </w:t>
+      </w:r>
+    </w:p>
+    <w:p/>
+    <w:tbl>
+      <w:tblPr>
+        <w:tblStyle w:val="TableGrid"/>
+        <w:tblW w:w="0" w:type="auto"/>
+        <w:tblBorders>
+          <w:top w:val="none" w:sz="0" w:space="0" w:color="auto"/>
+          <w:left w:val="none" w:sz="0" w:space="0" w:color="auto"/>
+          <w:bottom w:val="none" w:sz="0" w:space="0" w:color="auto"/>
+          <w:right w:val="none" w:sz="0" w:space="0" w:color="auto"/>
+          <w:insideH w:val="none" w:sz="0" w:space="0" w:color="auto"/>
+          <w:insideV w:val="none" w:sz="0" w:space="0" w:color="auto"/>
+        </w:tblBorders>
+        <w:tblLook w:val="04A0" w:firstRow="1" w:lastRow="0" w:firstColumn="1" w:lastColumn="0" w:noHBand="0" w:noVBand="1"/>
+      </w:tblPr>
+      <w:tblGrid>
+        <w:gridCol w:w="9016"/>
+      </w:tblGrid>
+      <w:tr>
+        <w:tc>
+          <w:tcPr>
+            <w:tcW w:w="9016" w:type="dxa"/>
+          </w:tcPr>
+          <w:p>
+            <w:r>
+              <w:rPr>
+                <w:noProof/>
+              </w:rPr>
+              <w:drawing>
+                <wp:anchor distT="0" distB="0" distL="114300" distR="114300" simplePos="0" relativeHeight="251658240" behindDoc="0" locked="0" layoutInCell="1" allowOverlap="1" wp14:anchorId="3B918720" wp14:editId="3E95BB09">
+                  <wp:simplePos x="0" y="0"/>
+                  <wp:positionH relativeFrom="margin">
+                    <wp:align>center</wp:align>
+                  </wp:positionH>
+                  <wp:positionV relativeFrom="margin">
+                    <wp:align>top</wp:align>
+                  </wp:positionV>
+                  <wp:extent cx="4383405" cy="5226685"/>
+                  <wp:effectExtent l="0" t="0" r="0" b="5715"/>
+                  <wp:wrapSquare wrapText="bothSides"/>
+                  <wp:docPr id="631568811" name="Picture 10"/>
+                  <wp:cNvGraphicFramePr>
+                    <a:graphicFrameLocks xmlns:a="http://schemas.openxmlformats.org/drawingml/2006/main" noChangeAspect="1"/>
+                  </wp:cNvGraphicFramePr>
+                  <a:graphic xmlns:a="http://schemas.openxmlformats.org/drawingml/2006/main">
+                    <a:graphicData uri="http://schemas.openxmlformats.org/drawingml/2006/picture">
+                      <pic:pic xmlns:pic="http://schemas.openxmlformats.org/drawingml/2006/picture">
+                        <pic:nvPicPr>
+                          <pic:cNvPr id="631568811" name="Picture 631568811"/>
+                          <pic:cNvPicPr/>
+                        </pic:nvPicPr>
+                        <pic:blipFill rotWithShape="1">
+                          <a:blip r:embed="rId11">
+                            <a:extLst>
+                              <a:ext uri="{28A0092B-C50C-407E-A947-70E740481C1C}">
+                                <a14:useLocalDpi xmlns:a14="http://schemas.microsoft.com/office/drawing/2010/main" val="0"/>
+                              </a:ext>
+                            </a:extLst>
+                          </a:blip>
+                          <a:srcRect l="12786" t="26155" b="4480"/>
+                          <a:stretch/>
+                        </pic:blipFill>
+                        <pic:spPr bwMode="auto">
+                          <a:xfrm>
+                            <a:off x="0" y="0"/>
+                            <a:ext cx="4383405" cy="5226685"/>
+                          </a:xfrm>
+                          <a:prstGeom prst="rect">
+                            <a:avLst/>
+                          </a:prstGeom>
+                          <a:ln>
+                            <a:noFill/>
+                          </a:ln>
+                          <a:extLst>
+                            <a:ext uri="{53640926-AAD7-44D8-BBD7-CCE9431645EC}">
+                              <a14:shadowObscured xmlns:a14="http://schemas.microsoft.com/office/drawing/2010/main"/>
+                            </a:ext>
+                          </a:extLst>
+                        </pic:spPr>
+                      </pic:pic>
+                    </a:graphicData>
+                  </a:graphic>
+                  <wp14:sizeRelH relativeFrom="margin">
+                    <wp14:pctWidth>0</wp14:pctWidth>
+                  </wp14:sizeRelH>
+                  <wp14:sizeRelV relativeFrom="margin">
+                    <wp14:pctHeight>0</wp14:pctHeight>
+                  </wp14:sizeRelV>
+                </wp:anchor>
+              </w:drawing>
+            </w:r>
+          </w:p>
+        </w:tc>
+      </w:tr>
+      <w:tr>
+        <w:tc>
+          <w:tcPr>
+            <w:tcW w:w="9016" w:type="dxa"/>
+          </w:tcPr>
+          <w:p>
+            <w:pPr>
+              <w:jc w:val="center"/>
+            </w:pPr>
+            <w:r>
+              <w:rPr>
+                <w:i/>
+                <w:iCs/>
+                <w:color w:val="808080" w:themeColor="background1" w:themeShade="80"/>
+                <w:sz w:val="22"/>
+                <w:szCs w:val="22"/>
+              </w:rPr>
+              <w:t>Export of “</w:t>
+            </w:r>
+            <w:r>
+              <w:rPr>
+                <w:i/>
+                <w:iCs/>
+                <w:color w:val="808080" w:themeColor="background1" w:themeShade="80"/>
+                <w:sz w:val="22"/>
+                <w:szCs w:val="22"/>
+              </w:rPr>
+              <w:t>StudentJobPortal.java</w:t>
+            </w:r>
+            <w:r>
+              <w:rPr>
+                <w:i/>
+                <w:iCs/>
+                <w:color w:val="808080" w:themeColor="background1" w:themeShade="80"/>
+                <w:sz w:val="22"/>
+                <w:szCs w:val="22"/>
+              </w:rPr>
+              <w:t xml:space="preserve">” from </w:t>
+            </w:r>
+            <w:proofErr w:type="spellStart"/>
+            <w:r>
+              <w:rPr>
+                <w:i/>
+                <w:iCs/>
+                <w:color w:val="808080" w:themeColor="background1" w:themeShade="80"/>
+                <w:sz w:val="22"/>
+                <w:szCs w:val="22"/>
+              </w:rPr>
+              <w:t>VSCode</w:t>
+            </w:r>
+            <w:proofErr w:type="spellEnd"/>
+            <w:r>
+              <w:rPr>
+                <w:i/>
+                <w:iCs/>
+                <w:color w:val="808080" w:themeColor="background1" w:themeShade="80"/>
+                <w:sz w:val="22"/>
+                <w:szCs w:val="22"/>
+              </w:rPr>
+              <w:t xml:space="preserve"> MacOS taken the </w:t>
+            </w:r>
+            <w:r>
+              <w:rPr>
+                <w:i/>
+                <w:iCs/>
+                <w:color w:val="808080" w:themeColor="background1" w:themeShade="80"/>
+                <w:sz w:val="22"/>
+                <w:szCs w:val="22"/>
+              </w:rPr>
+              <w:t>13</w:t>
+            </w:r>
+            <w:r>
+              <w:rPr>
+                <w:i/>
+                <w:iCs/>
+                <w:color w:val="808080" w:themeColor="background1" w:themeShade="80"/>
+                <w:sz w:val="22"/>
+                <w:szCs w:val="22"/>
+                <w:vertAlign w:val="superscript"/>
+              </w:rPr>
+              <w:t>th</w:t>
+            </w:r>
+            <w:r>
+              <w:rPr>
+                <w:i/>
+                <w:iCs/>
+                <w:color w:val="808080" w:themeColor="background1" w:themeShade="80"/>
+                <w:sz w:val="22"/>
+                <w:szCs w:val="22"/>
+              </w:rPr>
+              <w:t xml:space="preserve"> Aug 2026.</w:t>
+            </w:r>
+          </w:p>
+        </w:tc>
+      </w:tr>
+    </w:tbl>
+    <w:p/>
+    <w:p/>
+    <w:tbl>
+      <w:tblPr>
+        <w:tblStyle w:val="TableGrid"/>
+        <w:tblW w:w="0" w:type="auto"/>
+        <w:tblBorders>
+          <w:top w:val="none" w:sz="0" w:space="0" w:color="auto"/>
+          <w:left w:val="none" w:sz="0" w:space="0" w:color="auto"/>
+          <w:bottom w:val="none" w:sz="0" w:space="0" w:color="auto"/>
+          <w:right w:val="none" w:sz="0" w:space="0" w:color="auto"/>
+          <w:insideH w:val="none" w:sz="0" w:space="0" w:color="auto"/>
+          <w:insideV w:val="none" w:sz="0" w:space="0" w:color="auto"/>
+        </w:tblBorders>
+        <w:tblLook w:val="04A0" w:firstRow="1" w:lastRow="0" w:firstColumn="1" w:lastColumn="0" w:noHBand="0" w:noVBand="1"/>
+      </w:tblPr>
+      <w:tblGrid>
+        <w:gridCol w:w="4148"/>
+        <w:gridCol w:w="4878"/>
+      </w:tblGrid>
+      <w:tr>
+        <w:tc>
+          <w:tcPr>
+            <w:tcW w:w="4148" w:type="dxa"/>
+          </w:tcPr>
+          <w:p>
+            <w:r>
+              <w:t>On top of that, job information is represented in the form of 5 separate mutable static lists, which is generally not good practice, because the program is expecting very specific information, and if that information isn’t filled out as it’s expected (for some reason) this could cause errors, or worst-case scenario, crashes further down the line.</w:t>
+            </w:r>
+          </w:p>
+          <w:p/>
+          <w:p/>
+          <w:p>
+            <w:r>
+              <w:t xml:space="preserve">This is known as “breaking encapsulation”, because there is no “Job” object responsible for protecting and validating the state belonging to a single job; instead, a job only exists through matching indexes across several different lists. </w:t>
+            </w:r>
+          </w:p>
+          <w:p>
+            <w:r>
+              <w:t>For example, in this instance: “jobTitles.get(i)”, “companies.get(i)”, “jobTypes.get(i)” etc…</w:t>
+            </w:r>
+          </w:p>
+          <w:p/>
+          <w:p/>
+        </w:tc>
+        <w:tc>
+          <w:tcPr>
+            <w:tcW w:w="4878" w:type="dxa"/>
+          </w:tcPr>
+          <w:p>
+            <w:r>
+              <w:rPr>
+                <w:noProof/>
+              </w:rPr>
+              <w:drawing>
+                <wp:inline distT="0" distB="0" distL="0" distR="0" wp14:anchorId="4A97FC9B" wp14:editId="48DCFA36">
+                  <wp:extent cx="2955073" cy="4330864"/>
+                  <wp:effectExtent l="0" t="0" r="4445" b="0"/>
+                  <wp:docPr id="983814769" name="Picture 13"/>
+                  <wp:cNvGraphicFramePr>
+                    <a:graphicFrameLocks xmlns:a="http://schemas.openxmlformats.org/drawingml/2006/main" noChangeAspect="1"/>
+                  </wp:cNvGraphicFramePr>
+                  <a:graphic xmlns:a="http://schemas.openxmlformats.org/drawingml/2006/main">
+                    <a:graphicData uri="http://schemas.openxmlformats.org/drawingml/2006/picture">
+                      <pic:pic xmlns:pic="http://schemas.openxmlformats.org/drawingml/2006/picture">
+                        <pic:nvPicPr>
+                          <pic:cNvPr id="983814769" name="Picture 983814769"/>
+                          <pic:cNvPicPr/>
+                        </pic:nvPicPr>
+                        <pic:blipFill rotWithShape="1">
+                          <a:blip r:embed="rId12">
+                            <a:extLst>
+                              <a:ext uri="{28A0092B-C50C-407E-A947-70E740481C1C}">
+                                <a14:useLocalDpi xmlns:a14="http://schemas.microsoft.com/office/drawing/2010/main" val="0"/>
+                              </a:ext>
+                            </a:extLst>
+                          </a:blip>
+                          <a:srcRect l="22180" t="11384" r="55248" b="37680"/>
+                          <a:stretch/>
+                        </pic:blipFill>
+                        <pic:spPr bwMode="auto">
+                          <a:xfrm>
+                            <a:off x="0" y="0"/>
+                            <a:ext cx="3024573" cy="4432721"/>
+                          </a:xfrm>
+                          <a:prstGeom prst="rect">
+                            <a:avLst/>
+                          </a:prstGeom>
+                          <a:ln>
+                            <a:noFill/>
+                          </a:ln>
+                          <a:extLst>
+                            <a:ext uri="{53640926-AAD7-44D8-BBD7-CCE9431645EC}">
+                              <a14:shadowObscured xmlns:a14="http://schemas.microsoft.com/office/drawing/2010/main"/>
+                            </a:ext>
+                          </a:extLst>
+                        </pic:spPr>
+                      </pic:pic>
+                    </a:graphicData>
+                  </a:graphic>
+                </wp:inline>
+              </w:drawing>
+            </w:r>
+          </w:p>
+        </w:tc>
+      </w:tr>
+      <w:tr>
+        <w:tc>
+          <w:tcPr>
+            <w:tcW w:w="4148" w:type="dxa"/>
+          </w:tcPr>
+          <w:p>
+            <w:r>
+              <w:t>If a programming error occurs that adds an element to one of the lists, it would place the system in to an “error / inconsistent state”.</w:t>
+            </w:r>
+          </w:p>
+          <w:p/>
+        </w:tc>
+        <w:tc>
+          <w:tcPr>
+            <w:tcW w:w="4878" w:type="dxa"/>
+          </w:tcPr>
+          <w:p>
+            <w:pPr>
+              <w:jc w:val="center"/>
+            </w:pPr>
+            <w:r>
+              <w:rPr>
+                <w:i/>
+                <w:iCs/>
+                <w:color w:val="808080" w:themeColor="background1" w:themeShade="80"/>
+                <w:sz w:val="22"/>
+                <w:szCs w:val="22"/>
+              </w:rPr>
+              <w:t>Export of “</w:t>
+            </w:r>
+            <w:r>
+              <w:rPr>
+                <w:i/>
+                <w:iCs/>
+                <w:color w:val="808080" w:themeColor="background1" w:themeShade="80"/>
+                <w:sz w:val="22"/>
+                <w:szCs w:val="22"/>
+              </w:rPr>
+              <w:t>StudentJobPortal.java</w:t>
+            </w:r>
+            <w:r>
+              <w:rPr>
+                <w:i/>
+                <w:iCs/>
+                <w:color w:val="808080" w:themeColor="background1" w:themeShade="80"/>
+                <w:sz w:val="22"/>
+                <w:szCs w:val="22"/>
+              </w:rPr>
+              <w:t xml:space="preserve">” from </w:t>
+            </w:r>
+            <w:r>
+              <w:rPr>
+                <w:i/>
+                <w:iCs/>
+                <w:color w:val="808080" w:themeColor="background1" w:themeShade="80"/>
+                <w:sz w:val="22"/>
+                <w:szCs w:val="22"/>
+              </w:rPr>
+              <w:t>VSCode</w:t>
+            </w:r>
+            <w:r>
+              <w:rPr>
+                <w:i/>
+                <w:iCs/>
+                <w:color w:val="808080" w:themeColor="background1" w:themeShade="80"/>
+                <w:sz w:val="22"/>
+                <w:szCs w:val="22"/>
+              </w:rPr>
+              <w:t xml:space="preserve"> MacOS taken the 1</w:t>
+            </w:r>
+            <w:r>
+              <w:rPr>
+                <w:i/>
+                <w:iCs/>
+                <w:color w:val="808080" w:themeColor="background1" w:themeShade="80"/>
+                <w:sz w:val="22"/>
+                <w:szCs w:val="22"/>
+              </w:rPr>
+              <w:t>3</w:t>
+            </w:r>
+            <w:r>
+              <w:rPr>
+                <w:i/>
+                <w:iCs/>
+                <w:color w:val="808080" w:themeColor="background1" w:themeShade="80"/>
+                <w:sz w:val="22"/>
+                <w:szCs w:val="22"/>
+                <w:vertAlign w:val="superscript"/>
+              </w:rPr>
+              <w:t>th</w:t>
+            </w:r>
+            <w:r>
+              <w:rPr>
+                <w:i/>
+                <w:iCs/>
+                <w:color w:val="808080" w:themeColor="background1" w:themeShade="80"/>
+                <w:sz w:val="22"/>
+                <w:szCs w:val="22"/>
+              </w:rPr>
+              <w:t xml:space="preserve"> Aug 2026.</w:t>
+            </w:r>
+          </w:p>
+        </w:tc>
+      </w:tr>
+    </w:tbl>
+    <w:p/>
+    <w:p>
+      <w:r>
+        <w:t>next page &gt;&gt;</w:t>
+      </w:r>
+    </w:p>
+    <w:p>
+      <w:r>
+        <w:br w:type="page"/>
+      </w:r>
+    </w:p>
+    <w:p>
+      <w:pPr>
+        <w:jc w:val="center"/>
+      </w:pPr>
+      <w:r>
+        <w:lastRenderedPageBreak/>
+        <w:t>The updated version of the program addresses th</w:t>
+      </w:r>
+      <w:r>
+        <w:t>ese issues</w:t>
+      </w:r>
+      <w:r>
+        <w:t xml:space="preserve"> by introducing an immutable domain class, and a job is now represented using the following;</w:t>
+      </w:r>
+    </w:p>
+    <w:p/>
+    <w:tbl>
+      <w:tblPr>
+        <w:tblStyle w:val="TableGrid"/>
+        <w:tblW w:w="0" w:type="auto"/>
+        <w:tblBorders>
+          <w:top w:val="none" w:sz="0" w:space="0" w:color="auto"/>
+          <w:left w:val="none" w:sz="0" w:space="0" w:color="auto"/>
+          <w:bottom w:val="none" w:sz="0" w:space="0" w:color="auto"/>
+          <w:right w:val="none" w:sz="0" w:space="0" w:color="auto"/>
+          <w:insideH w:val="none" w:sz="0" w:space="0" w:color="auto"/>
+          <w:insideV w:val="none" w:sz="0" w:space="0" w:color="auto"/>
+        </w:tblBorders>
+        <w:tblLook w:val="04A0" w:firstRow="1" w:lastRow="0" w:firstColumn="1" w:lastColumn="0" w:noHBand="0" w:noVBand="1"/>
+      </w:tblPr>
+      <w:tblGrid>
+        <w:gridCol w:w="9016"/>
+      </w:tblGrid>
+      <w:tr>
+        <w:tc>
+          <w:tcPr>
+            <w:tcW w:w="9016" w:type="dxa"/>
+          </w:tcPr>
+          <w:tbl>
+            <w:tblPr>
+              <w:tblStyle w:val="TableGrid"/>
+              <w:tblW w:w="0" w:type="auto"/>
+              <w:tblBorders>
+                <w:top w:val="none" w:sz="0" w:space="0" w:color="auto"/>
+                <w:left w:val="none" w:sz="0" w:space="0" w:color="auto"/>
+                <w:bottom w:val="none" w:sz="0" w:space="0" w:color="auto"/>
+                <w:right w:val="none" w:sz="0" w:space="0" w:color="auto"/>
+                <w:insideH w:val="none" w:sz="0" w:space="0" w:color="auto"/>
+                <w:insideV w:val="none" w:sz="0" w:space="0" w:color="auto"/>
+              </w:tblBorders>
+              <w:tblLook w:val="04A0" w:firstRow="1" w:lastRow="0" w:firstColumn="1" w:lastColumn="0" w:noHBand="0" w:noVBand="1"/>
+            </w:tblPr>
+            <w:tblGrid>
+              <w:gridCol w:w="4395"/>
+              <w:gridCol w:w="4395"/>
+            </w:tblGrid>
+            <w:tr>
+              <w:tc>
+                <w:tcPr>
+                  <w:tcW w:w="4395" w:type="dxa"/>
+                </w:tcPr>
+                <w:p>
+                  <w:r>
+                    <w:rPr>
+                      <w:noProof/>
+                    </w:rPr>
+                    <w:drawing>
+                      <wp:inline distT="0" distB="0" distL="0" distR="0" wp14:anchorId="03ED673D" wp14:editId="6E69AF3B">
+                        <wp:extent cx="2609215" cy="3211551"/>
+                        <wp:effectExtent l="0" t="0" r="0" b="1905"/>
+                        <wp:docPr id="2006363960" name="Picture 15"/>
+                        <wp:cNvGraphicFramePr>
+                          <a:graphicFrameLocks xmlns:a="http://schemas.openxmlformats.org/drawingml/2006/main" noChangeAspect="1"/>
+                        </wp:cNvGraphicFramePr>
+                        <a:graphic xmlns:a="http://schemas.openxmlformats.org/drawingml/2006/main">
+                          <a:graphicData uri="http://schemas.openxmlformats.org/drawingml/2006/picture">
+                            <pic:pic xmlns:pic="http://schemas.openxmlformats.org/drawingml/2006/picture">
+                              <pic:nvPicPr>
+                                <pic:cNvPr id="2006363960" name="Picture 2006363960"/>
+                                <pic:cNvPicPr/>
+                              </pic:nvPicPr>
+                              <pic:blipFill rotWithShape="1">
+                                <a:blip r:embed="rId13">
+                                  <a:extLst>
+                                    <a:ext uri="{28A0092B-C50C-407E-A947-70E740481C1C}">
+                                      <a14:useLocalDpi xmlns:a14="http://schemas.microsoft.com/office/drawing/2010/main" val="0"/>
+                                    </a:ext>
+                                  </a:extLst>
+                                </a:blip>
+                                <a:srcRect b="38458"/>
+                                <a:stretch/>
+                              </pic:blipFill>
+                              <pic:spPr bwMode="auto">
+                                <a:xfrm>
+                                  <a:off x="0" y="0"/>
+                                  <a:ext cx="2662997" cy="3277749"/>
+                                </a:xfrm>
+                                <a:prstGeom prst="rect">
+                                  <a:avLst/>
+                                </a:prstGeom>
+                                <a:ln>
+                                  <a:noFill/>
+                                </a:ln>
+                                <a:extLst>
+                                  <a:ext uri="{53640926-AAD7-44D8-BBD7-CCE9431645EC}">
+                                    <a14:shadowObscured xmlns:a14="http://schemas.microsoft.com/office/drawing/2010/main"/>
+                                  </a:ext>
+                                </a:extLst>
+                              </pic:spPr>
+                            </pic:pic>
+                          </a:graphicData>
+                        </a:graphic>
+                      </wp:inline>
+                    </w:drawing>
+                  </w:r>
+                </w:p>
+              </w:tc>
+              <w:tc>
+                <w:tcPr>
+                  <w:tcW w:w="4395" w:type="dxa"/>
+                </w:tcPr>
+                <w:p>
+                  <w:r>
+                    <w:t>This on the other hand, does demonstrate encapsulation, because first of all; the internal state is private which means it can’t be modified, it can only be read using controlled “accessor methods” such as “</w:t>
+                  </w:r>
+                  <w:proofErr w:type="gramStart"/>
+                  <w:r>
+                    <w:t>getTitle(</w:t>
+                  </w:r>
+                  <w:proofErr w:type="gramEnd"/>
+                  <w:r>
+                    <w:t xml:space="preserve">)” to get the job title. </w:t>
+                  </w:r>
+                </w:p>
+                <w:p>
+                  <w:r>
+                    <w:t>This also demonstrates immutability, because fields are marked as “final”, which means the classes expose no setters, and a valid job can’t be changed unexpectedly by another part of the application. Their construction is controlled through the “Job.Builder()”, which validates identifiers and text fields before allowing a “job” to be made thanks to its “</w:t>
+                  </w:r>
+                  <w:proofErr w:type="gramStart"/>
+                  <w:r>
+                    <w:t>build(</w:t>
+                  </w:r>
+                  <w:proofErr w:type="gramEnd"/>
+                  <w:r>
+                    <w:t xml:space="preserve">)” method. </w:t>
+                  </w:r>
+                </w:p>
+                <w:p/>
+              </w:tc>
+            </w:tr>
+          </w:tbl>
+          <w:p/>
+        </w:tc>
+      </w:tr>
+      <w:tr>
+        <w:tc>
+          <w:tcPr>
+            <w:tcW w:w="9016" w:type="dxa"/>
+          </w:tcPr>
+          <w:p>
+            <w:pPr>
+              <w:jc w:val="center"/>
+            </w:pPr>
+            <w:r>
+              <w:rPr>
+                <w:color w:val="808080" w:themeColor="background1" w:themeShade="80"/>
+                <w:sz w:val="22"/>
+                <w:szCs w:val="22"/>
+              </w:rPr>
+              <w:t xml:space="preserve">Extract from </w:t>
+            </w:r>
+            <w:r>
+              <w:rPr>
+                <w:color w:val="808080" w:themeColor="background1" w:themeShade="80"/>
+                <w:sz w:val="22"/>
+                <w:szCs w:val="22"/>
+              </w:rPr>
+              <w:t>“</w:t>
+            </w:r>
+            <w:proofErr w:type="spellStart"/>
+            <w:r>
+              <w:rPr>
+                <w:color w:val="808080" w:themeColor="background1" w:themeShade="80"/>
+                <w:sz w:val="22"/>
+                <w:szCs w:val="22"/>
+              </w:rPr>
+              <w:t>src</w:t>
+            </w:r>
+            <w:proofErr w:type="spellEnd"/>
+            <w:r>
+              <w:rPr>
+                <w:color w:val="808080" w:themeColor="background1" w:themeShade="80"/>
+                <w:sz w:val="22"/>
+                <w:szCs w:val="22"/>
+              </w:rPr>
+              <w:t>/main/java/com/studentjobportal/model/Job.java</w:t>
+            </w:r>
+            <w:r>
+              <w:rPr>
+                <w:color w:val="808080" w:themeColor="background1" w:themeShade="80"/>
+                <w:sz w:val="22"/>
+                <w:szCs w:val="22"/>
+              </w:rPr>
+              <w:t>”</w:t>
+            </w:r>
+            <w:r>
+              <w:rPr>
+                <w:color w:val="808080" w:themeColor="background1" w:themeShade="80"/>
+                <w:sz w:val="22"/>
+                <w:szCs w:val="22"/>
+              </w:rPr>
+              <w:t xml:space="preserve"> on the 13</w:t>
+            </w:r>
+            <w:r>
+              <w:rPr>
+                <w:color w:val="808080" w:themeColor="background1" w:themeShade="80"/>
+                <w:sz w:val="22"/>
+                <w:szCs w:val="22"/>
+                <w:vertAlign w:val="superscript"/>
+              </w:rPr>
+              <w:t>th</w:t>
+            </w:r>
+            <w:r>
+              <w:rPr>
+                <w:color w:val="808080" w:themeColor="background1" w:themeShade="80"/>
+                <w:sz w:val="22"/>
+                <w:szCs w:val="22"/>
+              </w:rPr>
+              <w:t xml:space="preserve"> Aug 2026.</w:t>
+            </w:r>
+          </w:p>
+        </w:tc>
+      </w:tr>
+    </w:tbl>
+    <w:p/>
+    <w:p>
+      <w:r>
+        <w:t>This moves me swiftly to my implementation of the Gang of Four (G.o.F.) Builder Creational Pattern. It’s appropriate here because the object in question (a job) contains several related properties and validation rules. This prevents us from having a multitude of indexed lists to create a single job and makes construction much clearer.</w:t>
+      </w:r>
+    </w:p>
+    <w:p/>
+    <w:p>
+      <w:r>
+        <w:t xml:space="preserve">The same approach is used in </w:t>
+      </w:r>
+      <w:r>
+        <w:t>“</w:t>
+      </w:r>
+      <w:r>
+        <w:t>model/Application.java</w:t>
+      </w:r>
+      <w:r>
+        <w:t>”</w:t>
+      </w:r>
+      <w:r>
+        <w:t xml:space="preserve"> where </w:t>
+      </w:r>
+      <w:r>
+        <w:t>“</w:t>
+      </w:r>
+      <w:r>
+        <w:t>Application</w:t>
+      </w:r>
+      <w:r>
+        <w:t>”</w:t>
+      </w:r>
+      <w:r>
+        <w:t xml:space="preserve"> is also immutable and created using the </w:t>
+      </w:r>
+      <w:r>
+        <w:t>“</w:t>
+      </w:r>
+      <w:r>
+        <w:t>Application.Builder</w:t>
+      </w:r>
+      <w:r>
+        <w:t>”</w:t>
+      </w:r>
+      <w:r>
+        <w:t>.</w:t>
       </w:r>
     </w:p>
     <w:p/>
@@ -1662,74 +2346,6 @@
         <w:gridCol w:w="4508"/>
         <w:gridCol w:w="4508"/>
       </w:tblGrid>
-      <w:tr>
-        <w:tc>
-          <w:tcPr>
-            <w:tcW w:w="4508" w:type="dxa"/>
-          </w:tcPr>
-          <w:p>
-            <w:r>
-              <w:t>In the original application (seen to the right in this instance), the entire system was comprised in one file: “StudentJobPortal.java”</w:t>
-            </w:r>
-            <w:r>
-              <w:t xml:space="preserve"> inside its main() method</w:t>
-            </w:r>
-            <w:r>
-              <w:t xml:space="preserve">. Generally, having more than 1 responsibility inside a file makes things complicated, </w:t>
-            </w:r>
-            <w:r>
-              <w:t>maintenance heavy</w:t>
-            </w:r>
-            <w:r>
-              <w:t xml:space="preserve">, </w:t>
-            </w:r>
-            <w:r>
-              <w:t>hard to test</w:t>
-            </w:r>
-            <w:r>
-              <w:t xml:space="preserve"> and </w:t>
-            </w:r>
-            <w:r>
-              <w:t>very difficult to improve upon in future iterations.</w:t>
-            </w:r>
-            <w:r>
-              <w:t xml:space="preserve"> </w:t>
-            </w:r>
-          </w:p>
-        </w:tc>
-        <w:tc>
-          <w:tcPr>
-            <w:tcW w:w="4508" w:type="dxa"/>
-          </w:tcPr>
-          <w:tbl>
-            <w:tblPr>
-              <w:tblStyle w:val="TableGrid"/>
-              <w:tblW w:w="0" w:type="auto"/>
-              <w:tblLook w:val="04A0" w:firstRow="1" w:lastRow="0" w:firstColumn="1" w:lastColumn="0" w:noHBand="0" w:noVBand="1"/>
-            </w:tblPr>
-            <w:tblGrid>
-              <w:gridCol w:w="4282"/>
-            </w:tblGrid>
-            <w:tr>
-              <w:tc>
-                <w:tcPr>
-                  <w:tcW w:w="4282" w:type="dxa"/>
-                </w:tcPr>
-                <w:p/>
-              </w:tc>
-            </w:tr>
-            <w:tr>
-              <w:tc>
-                <w:tcPr>
-                  <w:tcW w:w="4282" w:type="dxa"/>
-                </w:tcPr>
-                <w:p/>
-              </w:tc>
-            </w:tr>
-          </w:tbl>
-          <w:p/>
-        </w:tc>
-      </w:tr>
       <w:tr>
         <w:tc>
           <w:tcPr>
@@ -1769,362 +2385,13 @@
           </w:tcPr>
           <w:p>
             <w:r>
-              <w:t>On top of that, job information is represented in the form of 5 separate mutable static lists, which is generally not good practice, because the program is expecting very specific information, and if that information isn’t filled out as it</w:t>
-            </w:r>
-            <w:r>
-              <w:t>’s</w:t>
-            </w:r>
-            <w:r>
-              <w:t xml:space="preserve"> expected (for some reason) this could cause errors</w:t>
-            </w:r>
-            <w:r>
-              <w:t>,</w:t>
-            </w:r>
-            <w:r>
-              <w:t xml:space="preserve"> or </w:t>
-            </w:r>
-            <w:r>
-              <w:t>worst-case</w:t>
-            </w:r>
-            <w:r>
-              <w:t xml:space="preserve"> scenario, crashes further down the line.</w:t>
+              <w:t xml:space="preserve">Value Objects are yet another improvement to the encapsulation, more specifically the “JobID”’ and “ApplicationID”’. Instead of identifying each job or job application with an indexed list number (i), both encapsulate a UUID. </w:t>
             </w:r>
           </w:p>
-        </w:tc>
-      </w:tr>
-    </w:tbl>
-    <w:p/>
-    <w:p>
-      <w:r>
-        <w:t xml:space="preserve">This is known as “breaking encapsulation”, because there is no “Job” object responsible for protecting and validating the state belonging to a single job; instead, </w:t>
-      </w:r>
-      <w:r>
-        <w:t xml:space="preserve">a job only exists through matching indexes across several different lists. </w:t>
-      </w:r>
-    </w:p>
-    <w:p>
-      <w:r>
-        <w:t xml:space="preserve">For example, in this instance: </w:t>
-      </w:r>
-      <w:proofErr w:type="spellStart"/>
-      <w:r>
-        <w:t>jobTitles.get</w:t>
-      </w:r>
-      <w:proofErr w:type="spellEnd"/>
-      <w:r>
-        <w:t>(</w:t>
-      </w:r>
-      <w:proofErr w:type="spellStart"/>
-      <w:r>
-        <w:t>i</w:t>
-      </w:r>
-      <w:proofErr w:type="spellEnd"/>
-      <w:r>
-        <w:t xml:space="preserve">), </w:t>
-      </w:r>
-      <w:proofErr w:type="spellStart"/>
-      <w:r>
-        <w:t>companies.get</w:t>
-      </w:r>
-      <w:proofErr w:type="spellEnd"/>
-      <w:r>
-        <w:t>(</w:t>
-      </w:r>
-      <w:proofErr w:type="spellStart"/>
-      <w:r>
-        <w:t>i</w:t>
-      </w:r>
-      <w:proofErr w:type="spellEnd"/>
-      <w:r>
-        <w:t xml:space="preserve">), </w:t>
-      </w:r>
-      <w:proofErr w:type="spellStart"/>
-      <w:r>
-        <w:t>jobTypes.get</w:t>
-      </w:r>
-      <w:proofErr w:type="spellEnd"/>
-      <w:r>
-        <w:t>(</w:t>
-      </w:r>
-      <w:proofErr w:type="spellStart"/>
-      <w:r>
-        <w:t>i</w:t>
-      </w:r>
-      <w:proofErr w:type="spellEnd"/>
-      <w:r>
-        <w:t>) etc…</w:t>
-      </w:r>
-    </w:p>
-    <w:p/>
-    <w:p>
-      <w:r>
-        <w:t xml:space="preserve">If a programming error occurs that adds an element </w:t>
-      </w:r>
-      <w:r>
-        <w:t>to one of the lists, it would place the system in to an “error / inconsistent state”.</w:t>
-      </w:r>
-    </w:p>
-    <w:p/>
-    <w:p>
-      <w:r>
-        <w:br w:type="page"/>
-      </w:r>
-    </w:p>
-    <w:p>
-      <w:r>
-        <w:lastRenderedPageBreak/>
-        <w:t>The updated version of the program addresses this by introducing an immutable domain class, and a job is now represented using the following;</w:t>
-      </w:r>
-    </w:p>
-    <w:p/>
-    <w:tbl>
-      <w:tblPr>
-        <w:tblStyle w:val="TableGrid"/>
-        <w:tblW w:w="0" w:type="auto"/>
-        <w:tblLook w:val="04A0" w:firstRow="1" w:lastRow="0" w:firstColumn="1" w:lastColumn="0" w:noHBand="0" w:noVBand="1"/>
-      </w:tblPr>
-      <w:tblGrid>
-        <w:gridCol w:w="9016"/>
-      </w:tblGrid>
-      <w:tr>
-        <w:tc>
-          <w:tcPr>
-            <w:tcW w:w="9016" w:type="dxa"/>
-          </w:tcPr>
-          <w:p/>
-        </w:tc>
-      </w:tr>
-      <w:tr>
-        <w:tc>
-          <w:tcPr>
-            <w:tcW w:w="9016" w:type="dxa"/>
-          </w:tcPr>
-          <w:p>
-            <w:pPr>
-              <w:jc w:val="center"/>
-            </w:pPr>
-            <w:r>
-              <w:rPr>
-                <w:color w:val="808080" w:themeColor="background1" w:themeShade="80"/>
-                <w:sz w:val="22"/>
-                <w:szCs w:val="22"/>
-              </w:rPr>
-              <w:t xml:space="preserve">Extract from </w:t>
-            </w:r>
-            <w:r>
-              <w:rPr>
-                <w:color w:val="808080" w:themeColor="background1" w:themeShade="80"/>
-                <w:sz w:val="22"/>
-                <w:szCs w:val="22"/>
-              </w:rPr>
-              <w:t>“</w:t>
-            </w:r>
-            <w:proofErr w:type="spellStart"/>
-            <w:r>
-              <w:rPr>
-                <w:color w:val="808080" w:themeColor="background1" w:themeShade="80"/>
-                <w:sz w:val="22"/>
-                <w:szCs w:val="22"/>
-              </w:rPr>
-              <w:t>src</w:t>
-            </w:r>
-            <w:proofErr w:type="spellEnd"/>
-            <w:r>
-              <w:rPr>
-                <w:color w:val="808080" w:themeColor="background1" w:themeShade="80"/>
-                <w:sz w:val="22"/>
-                <w:szCs w:val="22"/>
-              </w:rPr>
-              <w:t>/main/java/com/</w:t>
-            </w:r>
-            <w:proofErr w:type="spellStart"/>
-            <w:r>
-              <w:rPr>
-                <w:color w:val="808080" w:themeColor="background1" w:themeShade="80"/>
-                <w:sz w:val="22"/>
-                <w:szCs w:val="22"/>
-              </w:rPr>
-              <w:t>studentjobportal</w:t>
-            </w:r>
-            <w:proofErr w:type="spellEnd"/>
-            <w:r>
-              <w:rPr>
-                <w:color w:val="808080" w:themeColor="background1" w:themeShade="80"/>
-                <w:sz w:val="22"/>
-                <w:szCs w:val="22"/>
-              </w:rPr>
-              <w:t>/model/Job.java</w:t>
-            </w:r>
-            <w:r>
-              <w:rPr>
-                <w:color w:val="808080" w:themeColor="background1" w:themeShade="80"/>
-                <w:sz w:val="22"/>
-                <w:szCs w:val="22"/>
-              </w:rPr>
-              <w:t>”</w:t>
-            </w:r>
-            <w:r>
-              <w:rPr>
-                <w:color w:val="808080" w:themeColor="background1" w:themeShade="80"/>
-                <w:sz w:val="22"/>
-                <w:szCs w:val="22"/>
-              </w:rPr>
-              <w:t xml:space="preserve"> on the 13</w:t>
-            </w:r>
-            <w:r>
-              <w:rPr>
-                <w:color w:val="808080" w:themeColor="background1" w:themeShade="80"/>
-                <w:sz w:val="22"/>
-                <w:szCs w:val="22"/>
-                <w:vertAlign w:val="superscript"/>
-              </w:rPr>
-              <w:t>th</w:t>
-            </w:r>
-            <w:r>
-              <w:rPr>
-                <w:color w:val="808080" w:themeColor="background1" w:themeShade="80"/>
-                <w:sz w:val="22"/>
-                <w:szCs w:val="22"/>
-              </w:rPr>
-              <w:t xml:space="preserve"> Aug 2026.</w:t>
-            </w:r>
-          </w:p>
-        </w:tc>
-      </w:tr>
-    </w:tbl>
-    <w:p/>
-    <w:p>
-      <w:r>
-        <w:t>This on the other hand, does demonstrate encapsulation, because first of all; the internal state is private</w:t>
-      </w:r>
-      <w:r>
-        <w:t xml:space="preserve"> which means it can’t be modified, it can only be read using controlled “accessor methods” such as </w:t>
-      </w:r>
-      <w:proofErr w:type="spellStart"/>
-      <w:proofErr w:type="gramStart"/>
-      <w:r>
-        <w:t>getTitle</w:t>
-      </w:r>
-      <w:proofErr w:type="spellEnd"/>
-      <w:r>
-        <w:t>(</w:t>
-      </w:r>
-      <w:proofErr w:type="gramEnd"/>
-      <w:r>
-        <w:t xml:space="preserve">) to get the job title. </w:t>
-      </w:r>
-    </w:p>
-    <w:p>
-      <w:r>
-        <w:t xml:space="preserve">This also demonstrates immutability, because fields are marked as “final”, which means the classes expose no setters, and a valid job can’t be changed unexpectedly by another part of the application. Their construction is controlled through the </w:t>
-      </w:r>
-      <w:proofErr w:type="spellStart"/>
-      <w:r>
-        <w:t>Job.Builder</w:t>
-      </w:r>
-      <w:proofErr w:type="spellEnd"/>
-      <w:r>
-        <w:t>(), which validates identifiers and text fields before allowing a “job” to be made thanks to its “</w:t>
-      </w:r>
-      <w:proofErr w:type="gramStart"/>
-      <w:r>
-        <w:t>build(</w:t>
-      </w:r>
-      <w:proofErr w:type="gramEnd"/>
-      <w:r>
-        <w:t xml:space="preserve">)” method. </w:t>
-      </w:r>
-    </w:p>
-    <w:p/>
-    <w:tbl>
-      <w:tblPr>
-        <w:tblStyle w:val="TableGrid"/>
-        <w:tblW w:w="0" w:type="auto"/>
-        <w:tblBorders>
-          <w:top w:val="none" w:sz="0" w:space="0" w:color="auto"/>
-          <w:left w:val="none" w:sz="0" w:space="0" w:color="auto"/>
-          <w:bottom w:val="none" w:sz="0" w:space="0" w:color="auto"/>
-          <w:right w:val="none" w:sz="0" w:space="0" w:color="auto"/>
-          <w:insideH w:val="none" w:sz="0" w:space="0" w:color="auto"/>
-          <w:insideV w:val="none" w:sz="0" w:space="0" w:color="auto"/>
-        </w:tblBorders>
-        <w:tblLook w:val="04A0" w:firstRow="1" w:lastRow="0" w:firstColumn="1" w:lastColumn="0" w:noHBand="0" w:noVBand="1"/>
-      </w:tblPr>
-      <w:tblGrid>
-        <w:gridCol w:w="4508"/>
-        <w:gridCol w:w="4508"/>
-      </w:tblGrid>
-      <w:tr>
-        <w:tc>
-          <w:tcPr>
-            <w:tcW w:w="4508" w:type="dxa"/>
-          </w:tcPr>
-          <w:p>
-            <w:r>
-              <w:t>This moves me swiftly to my implementation of the Gang of Four (</w:t>
-            </w:r>
-            <w:proofErr w:type="spellStart"/>
-            <w:r>
-              <w:t>G.o.F.</w:t>
-            </w:r>
-            <w:proofErr w:type="spellEnd"/>
-            <w:r>
-              <w:t xml:space="preserve">) Builder Creational Pattern. </w:t>
-            </w:r>
-            <w:r>
-              <w:t>It’s appropriate here because the object in question (a job) contains several related properties and validation rules. This prevents us from having a multitude of indexed lists to create a single job and makes construction much clearer.</w:t>
-            </w:r>
-          </w:p>
-        </w:tc>
-        <w:tc>
-          <w:tcPr>
-            <w:tcW w:w="4508" w:type="dxa"/>
-          </w:tcPr>
-          <w:tbl>
-            <w:tblPr>
-              <w:tblStyle w:val="TableGrid"/>
-              <w:tblW w:w="0" w:type="auto"/>
-              <w:tblLook w:val="04A0" w:firstRow="1" w:lastRow="0" w:firstColumn="1" w:lastColumn="0" w:noHBand="0" w:noVBand="1"/>
-            </w:tblPr>
-            <w:tblGrid>
-              <w:gridCol w:w="4282"/>
-            </w:tblGrid>
-            <w:tr>
-              <w:tc>
-                <w:tcPr>
-                  <w:tcW w:w="4282" w:type="dxa"/>
-                </w:tcPr>
-                <w:p/>
-              </w:tc>
-            </w:tr>
-            <w:tr>
-              <w:tc>
-                <w:tcPr>
-                  <w:tcW w:w="4282" w:type="dxa"/>
-                </w:tcPr>
-                <w:p/>
-              </w:tc>
-            </w:tr>
-          </w:tbl>
           <w:p/>
         </w:tc>
       </w:tr>
     </w:tbl>
-    <w:p/>
-    <w:p>
-      <w:r>
-        <w:t xml:space="preserve">The same approach is used in model/Application.java where Application is also immutable and created using the </w:t>
-      </w:r>
-      <w:proofErr w:type="spellStart"/>
-      <w:r>
-        <w:t>Application.Builder</w:t>
-      </w:r>
-      <w:proofErr w:type="spellEnd"/>
-      <w:r>
-        <w:t>.</w:t>
-      </w:r>
-    </w:p>
-    <w:p/>
     <w:p/>
     <w:p>
       <w:pPr>

</xml_diff>

<commit_message>
Saving progress because battery is about to die
</commit_message>
<xml_diff>
--- a/CM2307_CW_StudentNumber.docx.docx
+++ b/CM2307_CW_StudentNumber.docx.docx
@@ -2286,48 +2286,6 @@
       </w:r>
     </w:p>
     <w:p/>
-    <w:p>
-      <w:r>
-        <w:t xml:space="preserve">The same approach is used in </w:t>
-      </w:r>
-      <w:r>
-        <w:t>“</w:t>
-      </w:r>
-      <w:r>
-        <w:t>model/Application.java</w:t>
-      </w:r>
-      <w:r>
-        <w:t>”</w:t>
-      </w:r>
-      <w:r>
-        <w:t xml:space="preserve"> where </w:t>
-      </w:r>
-      <w:r>
-        <w:t>“</w:t>
-      </w:r>
-      <w:r>
-        <w:t>Application</w:t>
-      </w:r>
-      <w:r>
-        <w:t>”</w:t>
-      </w:r>
-      <w:r>
-        <w:t xml:space="preserve"> is also immutable and created using the </w:t>
-      </w:r>
-      <w:r>
-        <w:t>“</w:t>
-      </w:r>
-      <w:r>
-        <w:t>Application.Builder</w:t>
-      </w:r>
-      <w:r>
-        <w:t>”</w:t>
-      </w:r>
-      <w:r>
-        <w:t>.</w:t>
-      </w:r>
-    </w:p>
-    <w:p/>
     <w:tbl>
       <w:tblPr>
         <w:tblStyle w:val="TableGrid"/>
@@ -2343,18 +2301,241 @@
         <w:tblLook w:val="04A0" w:firstRow="1" w:lastRow="0" w:firstColumn="1" w:lastColumn="0" w:noHBand="0" w:noVBand="1"/>
       </w:tblPr>
       <w:tblGrid>
-        <w:gridCol w:w="4508"/>
-        <w:gridCol w:w="4508"/>
+        <w:gridCol w:w="9016"/>
       </w:tblGrid>
       <w:tr>
         <w:tc>
           <w:tcPr>
-            <w:tcW w:w="4508" w:type="dxa"/>
+            <w:tcW w:w="9016" w:type="dxa"/>
+          </w:tcPr>
+          <w:p>
+            <w:r>
+              <w:rPr>
+                <w:noProof/>
+              </w:rPr>
+              <w:drawing>
+                <wp:anchor distT="0" distB="0" distL="114300" distR="114300" simplePos="0" relativeHeight="251659264" behindDoc="0" locked="0" layoutInCell="1" allowOverlap="1" wp14:anchorId="7390EFE9" wp14:editId="3C62CB69">
+                  <wp:simplePos x="0" y="0"/>
+                  <wp:positionH relativeFrom="margin">
+                    <wp:align>center</wp:align>
+                  </wp:positionH>
+                  <wp:positionV relativeFrom="margin">
+                    <wp:align>top</wp:align>
+                  </wp:positionV>
+                  <wp:extent cx="3225800" cy="2269892"/>
+                  <wp:effectExtent l="0" t="0" r="0" b="3810"/>
+                  <wp:wrapSquare wrapText="bothSides"/>
+                  <wp:docPr id="225968307" name="Picture 16"/>
+                  <wp:cNvGraphicFramePr>
+                    <a:graphicFrameLocks xmlns:a="http://schemas.openxmlformats.org/drawingml/2006/main" noChangeAspect="1"/>
+                  </wp:cNvGraphicFramePr>
+                  <a:graphic xmlns:a="http://schemas.openxmlformats.org/drawingml/2006/main">
+                    <a:graphicData uri="http://schemas.openxmlformats.org/drawingml/2006/picture">
+                      <pic:pic xmlns:pic="http://schemas.openxmlformats.org/drawingml/2006/picture">
+                        <pic:nvPicPr>
+                          <pic:cNvPr id="225968307" name="Picture 225968307"/>
+                          <pic:cNvPicPr/>
+                        </pic:nvPicPr>
+                        <pic:blipFill rotWithShape="1">
+                          <a:blip r:embed="rId13">
+                            <a:extLst>
+                              <a:ext uri="{28A0092B-C50C-407E-A947-70E740481C1C}">
+                                <a14:useLocalDpi xmlns:a14="http://schemas.microsoft.com/office/drawing/2010/main" val="0"/>
+                              </a:ext>
+                            </a:extLst>
+                          </a:blip>
+                          <a:srcRect t="64816"/>
+                          <a:stretch/>
+                        </pic:blipFill>
+                        <pic:spPr bwMode="auto">
+                          <a:xfrm>
+                            <a:off x="0" y="0"/>
+                            <a:ext cx="3225800" cy="2269892"/>
+                          </a:xfrm>
+                          <a:prstGeom prst="rect">
+                            <a:avLst/>
+                          </a:prstGeom>
+                          <a:ln>
+                            <a:noFill/>
+                          </a:ln>
+                          <a:extLst>
+                            <a:ext uri="{53640926-AAD7-44D8-BBD7-CCE9431645EC}">
+                              <a14:shadowObscured xmlns:a14="http://schemas.microsoft.com/office/drawing/2010/main"/>
+                            </a:ext>
+                          </a:extLst>
+                        </pic:spPr>
+                      </pic:pic>
+                    </a:graphicData>
+                  </a:graphic>
+                </wp:anchor>
+              </w:drawing>
+            </w:r>
+          </w:p>
+        </w:tc>
+      </w:tr>
+      <w:tr>
+        <w:tc>
+          <w:tcPr>
+            <w:tcW w:w="9016" w:type="dxa"/>
+          </w:tcPr>
+          <w:p>
+            <w:pPr>
+              <w:jc w:val="center"/>
+            </w:pPr>
+            <w:r>
+              <w:rPr>
+                <w:color w:val="808080" w:themeColor="background1" w:themeShade="80"/>
+                <w:sz w:val="22"/>
+                <w:szCs w:val="22"/>
+              </w:rPr>
+              <w:t xml:space="preserve">Extract from </w:t>
+            </w:r>
+            <w:r>
+              <w:rPr>
+                <w:color w:val="808080" w:themeColor="background1" w:themeShade="80"/>
+                <w:sz w:val="22"/>
+                <w:szCs w:val="22"/>
+              </w:rPr>
+              <w:t>“</w:t>
+            </w:r>
+            <w:proofErr w:type="spellStart"/>
+            <w:r>
+              <w:rPr>
+                <w:color w:val="808080" w:themeColor="background1" w:themeShade="80"/>
+                <w:sz w:val="22"/>
+                <w:szCs w:val="22"/>
+              </w:rPr>
+              <w:t>src</w:t>
+            </w:r>
+            <w:proofErr w:type="spellEnd"/>
+            <w:r>
+              <w:rPr>
+                <w:color w:val="808080" w:themeColor="background1" w:themeShade="80"/>
+                <w:sz w:val="22"/>
+                <w:szCs w:val="22"/>
+              </w:rPr>
+              <w:t>/main/java/com/studentjobportal/model/Job.java</w:t>
+            </w:r>
+            <w:r>
+              <w:rPr>
+                <w:color w:val="808080" w:themeColor="background1" w:themeShade="80"/>
+                <w:sz w:val="22"/>
+                <w:szCs w:val="22"/>
+              </w:rPr>
+              <w:t>”</w:t>
+            </w:r>
+            <w:r>
+              <w:rPr>
+                <w:color w:val="808080" w:themeColor="background1" w:themeShade="80"/>
+                <w:sz w:val="22"/>
+                <w:szCs w:val="22"/>
+              </w:rPr>
+              <w:t xml:space="preserve"> on the 13</w:t>
+            </w:r>
+            <w:r>
+              <w:rPr>
+                <w:color w:val="808080" w:themeColor="background1" w:themeShade="80"/>
+                <w:sz w:val="22"/>
+                <w:szCs w:val="22"/>
+                <w:vertAlign w:val="superscript"/>
+              </w:rPr>
+              <w:t>th</w:t>
+            </w:r>
+            <w:r>
+              <w:rPr>
+                <w:color w:val="808080" w:themeColor="background1" w:themeShade="80"/>
+                <w:sz w:val="22"/>
+                <w:szCs w:val="22"/>
+              </w:rPr>
+              <w:t xml:space="preserve"> Aug 2026.</w:t>
+            </w:r>
+          </w:p>
+        </w:tc>
+      </w:tr>
+    </w:tbl>
+    <w:p/>
+    <w:p>
+      <w:r>
+        <w:t>next page &gt;&gt;</w:t>
+      </w:r>
+    </w:p>
+    <w:p>
+      <w:r>
+        <w:br w:type="page"/>
+      </w:r>
+    </w:p>
+    <w:p>
+      <w:r>
+        <w:lastRenderedPageBreak/>
+        <w:t xml:space="preserve">The same approach is used in </w:t>
+      </w:r>
+      <w:r>
+        <w:t>“</w:t>
+      </w:r>
+      <w:r>
+        <w:t>model/Application.java</w:t>
+      </w:r>
+      <w:r>
+        <w:t>”</w:t>
+      </w:r>
+      <w:r>
+        <w:t xml:space="preserve"> where </w:t>
+      </w:r>
+      <w:r>
+        <w:t>“</w:t>
+      </w:r>
+      <w:r>
+        <w:t>Application</w:t>
+      </w:r>
+      <w:r>
+        <w:t>”</w:t>
+      </w:r>
+      <w:r>
+        <w:t xml:space="preserve"> is also immutable and created using the </w:t>
+      </w:r>
+      <w:r>
+        <w:t>“</w:t>
+      </w:r>
+      <w:r>
+        <w:t>Application.Builder</w:t>
+      </w:r>
+      <w:r>
+        <w:t>”</w:t>
+      </w:r>
+      <w:r>
+        <w:t>.</w:t>
+      </w:r>
+    </w:p>
+    <w:p/>
+    <w:tbl>
+      <w:tblPr>
+        <w:tblStyle w:val="TableGrid"/>
+        <w:tblW w:w="0" w:type="auto"/>
+        <w:tblBorders>
+          <w:top w:val="none" w:sz="0" w:space="0" w:color="auto"/>
+          <w:left w:val="none" w:sz="0" w:space="0" w:color="auto"/>
+          <w:bottom w:val="none" w:sz="0" w:space="0" w:color="auto"/>
+          <w:right w:val="none" w:sz="0" w:space="0" w:color="auto"/>
+          <w:insideH w:val="none" w:sz="0" w:space="0" w:color="auto"/>
+          <w:insideV w:val="none" w:sz="0" w:space="0" w:color="auto"/>
+        </w:tblBorders>
+        <w:tblLayout w:type="fixed"/>
+        <w:tblLook w:val="04A0" w:firstRow="1" w:lastRow="0" w:firstColumn="1" w:lastColumn="0" w:noHBand="0" w:noVBand="1"/>
+      </w:tblPr>
+      <w:tblGrid>
+        <w:gridCol w:w="4395"/>
+        <w:gridCol w:w="4631"/>
+      </w:tblGrid>
+      <w:tr>
+        <w:tc>
+          <w:tcPr>
+            <w:tcW w:w="4395" w:type="dxa"/>
           </w:tcPr>
           <w:tbl>
             <w:tblPr>
               <w:tblStyle w:val="TableGrid"/>
-              <w:tblW w:w="0" w:type="auto"/>
+              <w:tblW w:w="4282" w:type="dxa"/>
+              <w:tblLayout w:type="fixed"/>
               <w:tblLook w:val="04A0" w:firstRow="1" w:lastRow="0" w:firstColumn="1" w:lastColumn="0" w:noHBand="0" w:noVBand="1"/>
             </w:tblPr>
             <w:tblGrid>
@@ -2365,7 +2546,61 @@
                 <w:tcPr>
                   <w:tcW w:w="4282" w:type="dxa"/>
                 </w:tcPr>
-                <w:p/>
+                <w:p>
+                  <w:r>
+                    <w:rPr>
+                      <w:noProof/>
+                    </w:rPr>
+                    <w:drawing>
+                      <wp:inline distT="0" distB="0" distL="0" distR="0" wp14:anchorId="45D75B71" wp14:editId="71DBC767">
+                        <wp:extent cx="2592160" cy="100739"/>
+                        <wp:effectExtent l="0" t="0" r="0" b="1270"/>
+                        <wp:docPr id="1114557656" name="Picture 17"/>
+                        <wp:cNvGraphicFramePr>
+                          <a:graphicFrameLocks xmlns:a="http://schemas.openxmlformats.org/drawingml/2006/main" noChangeAspect="1"/>
+                        </wp:cNvGraphicFramePr>
+                        <a:graphic xmlns:a="http://schemas.openxmlformats.org/drawingml/2006/main">
+                          <a:graphicData uri="http://schemas.openxmlformats.org/drawingml/2006/picture">
+                            <pic:pic xmlns:pic="http://schemas.openxmlformats.org/drawingml/2006/picture">
+                              <pic:nvPicPr>
+                                <pic:cNvPr id="1114557656" name="Picture 1114557656"/>
+                                <pic:cNvPicPr/>
+                              </pic:nvPicPr>
+                              <pic:blipFill rotWithShape="1">
+                                <a:blip r:embed="rId14" cstate="print">
+                                  <a:extLst>
+                                    <a:ext uri="{28A0092B-C50C-407E-A947-70E740481C1C}">
+                                      <a14:useLocalDpi xmlns:a14="http://schemas.microsoft.com/office/drawing/2010/main" val="0"/>
+                                    </a:ext>
+                                  </a:extLst>
+                                </a:blip>
+                                <a:srcRect t="5841" b="91095"/>
+                                <a:stretch/>
+                              </pic:blipFill>
+                              <pic:spPr bwMode="auto">
+                                <a:xfrm>
+                                  <a:off x="0" y="0"/>
+                                  <a:ext cx="8552604" cy="332379"/>
+                                </a:xfrm>
+                                <a:prstGeom prst="rect">
+                                  <a:avLst/>
+                                </a:prstGeom>
+                                <a:ln>
+                                  <a:noFill/>
+                                </a:ln>
+                                <a:extLst>
+                                  <a:ext uri="{53640926-AAD7-44D8-BBD7-CCE9431645EC}">
+                                    <a14:shadowObscured xmlns:a14="http://schemas.microsoft.com/office/drawing/2010/main"/>
+                                  </a:ext>
+                                </a:extLst>
+                              </pic:spPr>
+                            </pic:pic>
+                          </a:graphicData>
+                        </a:graphic>
+                      </wp:inline>
+                    </w:drawing>
+                  </w:r>
+                </w:p>
               </w:tc>
             </w:tr>
             <w:tr>
@@ -2373,7 +2608,295 @@
                 <w:tcPr>
                   <w:tcW w:w="4282" w:type="dxa"/>
                 </w:tcPr>
-                <w:p/>
+                <w:p>
+                  <w:r>
+                    <w:rPr>
+                      <w:noProof/>
+                    </w:rPr>
+                    <w:drawing>
+                      <wp:inline distT="0" distB="0" distL="0" distR="0" wp14:anchorId="1EC988EB" wp14:editId="50E91A7A">
+                        <wp:extent cx="2581910" cy="571500"/>
+                        <wp:effectExtent l="0" t="0" r="0" b="0"/>
+                        <wp:docPr id="1385614268" name="Picture 18"/>
+                        <wp:cNvGraphicFramePr>
+                          <a:graphicFrameLocks xmlns:a="http://schemas.openxmlformats.org/drawingml/2006/main" noChangeAspect="1"/>
+                        </wp:cNvGraphicFramePr>
+                        <a:graphic xmlns:a="http://schemas.openxmlformats.org/drawingml/2006/main">
+                          <a:graphicData uri="http://schemas.openxmlformats.org/drawingml/2006/picture">
+                            <pic:pic xmlns:pic="http://schemas.openxmlformats.org/drawingml/2006/picture">
+                              <pic:nvPicPr>
+                                <pic:cNvPr id="1385614268" name="Picture 1385614268"/>
+                                <pic:cNvPicPr/>
+                              </pic:nvPicPr>
+                              <pic:blipFill rotWithShape="1">
+                                <a:blip r:embed="rId15" cstate="print">
+                                  <a:extLst>
+                                    <a:ext uri="{28A0092B-C50C-407E-A947-70E740481C1C}">
+                                      <a14:useLocalDpi xmlns:a14="http://schemas.microsoft.com/office/drawing/2010/main" val="0"/>
+                                    </a:ext>
+                                  </a:extLst>
+                                </a:blip>
+                                <a:srcRect t="19201" b="63344"/>
+                                <a:stretch/>
+                              </pic:blipFill>
+                              <pic:spPr bwMode="auto">
+                                <a:xfrm>
+                                  <a:off x="0" y="0"/>
+                                  <a:ext cx="2581910" cy="571500"/>
+                                </a:xfrm>
+                                <a:prstGeom prst="rect">
+                                  <a:avLst/>
+                                </a:prstGeom>
+                                <a:ln>
+                                  <a:noFill/>
+                                </a:ln>
+                                <a:extLst>
+                                  <a:ext uri="{53640926-AAD7-44D8-BBD7-CCE9431645EC}">
+                                    <a14:shadowObscured xmlns:a14="http://schemas.microsoft.com/office/drawing/2010/main"/>
+                                  </a:ext>
+                                </a:extLst>
+                              </pic:spPr>
+                            </pic:pic>
+                          </a:graphicData>
+                        </a:graphic>
+                      </wp:inline>
+                    </w:drawing>
+                  </w:r>
+                </w:p>
+              </w:tc>
+            </w:tr>
+            <w:tr>
+              <w:tc>
+                <w:tcPr>
+                  <w:tcW w:w="4282" w:type="dxa"/>
+                </w:tcPr>
+                <w:p>
+                  <w:pPr>
+                    <w:jc w:val="center"/>
+                  </w:pPr>
+                  <w:r>
+                    <w:rPr>
+                      <w:color w:val="808080" w:themeColor="background1" w:themeShade="80"/>
+                      <w:sz w:val="22"/>
+                      <w:szCs w:val="22"/>
+                    </w:rPr>
+                    <w:t xml:space="preserve">Extract from </w:t>
+                  </w:r>
+                  <w:r>
+                    <w:rPr>
+                      <w:color w:val="808080" w:themeColor="background1" w:themeShade="80"/>
+                      <w:sz w:val="22"/>
+                      <w:szCs w:val="22"/>
+                    </w:rPr>
+                    <w:t>“</w:t>
+                  </w:r>
+                  <w:proofErr w:type="spellStart"/>
+                  <w:r>
+                    <w:rPr>
+                      <w:color w:val="808080" w:themeColor="background1" w:themeShade="80"/>
+                      <w:sz w:val="22"/>
+                      <w:szCs w:val="22"/>
+                    </w:rPr>
+                    <w:t>src</w:t>
+                  </w:r>
+                  <w:proofErr w:type="spellEnd"/>
+                  <w:r>
+                    <w:rPr>
+                      <w:color w:val="808080" w:themeColor="background1" w:themeShade="80"/>
+                      <w:sz w:val="22"/>
+                      <w:szCs w:val="22"/>
+                    </w:rPr>
+                    <w:t>/main/java/com/studentjobportal/model/</w:t>
+                  </w:r>
+                  <w:r>
+                    <w:rPr>
+                      <w:color w:val="808080" w:themeColor="background1" w:themeShade="80"/>
+                      <w:sz w:val="22"/>
+                      <w:szCs w:val="22"/>
+                    </w:rPr>
+                    <w:t>ApplicationID</w:t>
+                  </w:r>
+                  <w:r>
+                    <w:rPr>
+                      <w:color w:val="808080" w:themeColor="background1" w:themeShade="80"/>
+                      <w:sz w:val="22"/>
+                      <w:szCs w:val="22"/>
+                    </w:rPr>
+                    <w:t>.java</w:t>
+                  </w:r>
+                  <w:r>
+                    <w:rPr>
+                      <w:color w:val="808080" w:themeColor="background1" w:themeShade="80"/>
+                      <w:sz w:val="22"/>
+                      <w:szCs w:val="22"/>
+                    </w:rPr>
+                    <w:t>”</w:t>
+                  </w:r>
+                  <w:r>
+                    <w:rPr>
+                      <w:color w:val="808080" w:themeColor="background1" w:themeShade="80"/>
+                      <w:sz w:val="22"/>
+                      <w:szCs w:val="22"/>
+                    </w:rPr>
+                    <w:t xml:space="preserve"> on the 13</w:t>
+                  </w:r>
+                  <w:r>
+                    <w:rPr>
+                      <w:color w:val="808080" w:themeColor="background1" w:themeShade="80"/>
+                      <w:sz w:val="22"/>
+                      <w:szCs w:val="22"/>
+                      <w:vertAlign w:val="superscript"/>
+                    </w:rPr>
+                    <w:t>th</w:t>
+                  </w:r>
+                  <w:r>
+                    <w:rPr>
+                      <w:color w:val="808080" w:themeColor="background1" w:themeShade="80"/>
+                      <w:sz w:val="22"/>
+                      <w:szCs w:val="22"/>
+                    </w:rPr>
+                    <w:t xml:space="preserve"> Aug 2026.</w:t>
+                  </w:r>
+                </w:p>
+              </w:tc>
+            </w:tr>
+            <w:tr>
+              <w:tc>
+                <w:tcPr>
+                  <w:tcW w:w="4282" w:type="dxa"/>
+                </w:tcPr>
+                <w:p>
+                  <w:r>
+                    <w:rPr>
+                      <w:noProof/>
+                    </w:rPr>
+                    <w:drawing>
+                      <wp:inline distT="0" distB="0" distL="0" distR="0" wp14:anchorId="0BE3C7DE" wp14:editId="00BFBD34">
+                        <wp:extent cx="2577931" cy="1720312"/>
+                        <wp:effectExtent l="0" t="0" r="635" b="0"/>
+                        <wp:docPr id="1549883060" name="Picture 20"/>
+                        <wp:cNvGraphicFramePr>
+                          <a:graphicFrameLocks xmlns:a="http://schemas.openxmlformats.org/drawingml/2006/main" noChangeAspect="1"/>
+                        </wp:cNvGraphicFramePr>
+                        <a:graphic xmlns:a="http://schemas.openxmlformats.org/drawingml/2006/main">
+                          <a:graphicData uri="http://schemas.openxmlformats.org/drawingml/2006/picture">
+                            <pic:pic xmlns:pic="http://schemas.openxmlformats.org/drawingml/2006/picture">
+                              <pic:nvPicPr>
+                                <pic:cNvPr id="1549883060" name="Picture 1549883060"/>
+                                <pic:cNvPicPr/>
+                              </pic:nvPicPr>
+                              <pic:blipFill rotWithShape="1">
+                                <a:blip r:embed="rId16" cstate="print">
+                                  <a:extLst>
+                                    <a:ext uri="{28A0092B-C50C-407E-A947-70E740481C1C}">
+                                      <a14:useLocalDpi xmlns:a14="http://schemas.microsoft.com/office/drawing/2010/main" val="0"/>
+                                    </a:ext>
+                                  </a:extLst>
+                                </a:blip>
+                                <a:srcRect l="1" t="47432" r="42887" b="20702"/>
+                                <a:stretch/>
+                              </pic:blipFill>
+                              <pic:spPr bwMode="auto">
+                                <a:xfrm>
+                                  <a:off x="0" y="0"/>
+                                  <a:ext cx="2652190" cy="1769867"/>
+                                </a:xfrm>
+                                <a:prstGeom prst="rect">
+                                  <a:avLst/>
+                                </a:prstGeom>
+                                <a:ln>
+                                  <a:noFill/>
+                                </a:ln>
+                                <a:extLst>
+                                  <a:ext uri="{53640926-AAD7-44D8-BBD7-CCE9431645EC}">
+                                    <a14:shadowObscured xmlns:a14="http://schemas.microsoft.com/office/drawing/2010/main"/>
+                                  </a:ext>
+                                </a:extLst>
+                              </pic:spPr>
+                            </pic:pic>
+                          </a:graphicData>
+                        </a:graphic>
+                      </wp:inline>
+                    </w:drawing>
+                  </w:r>
+                </w:p>
+              </w:tc>
+            </w:tr>
+            <w:tr>
+              <w:tc>
+                <w:tcPr>
+                  <w:tcW w:w="4282" w:type="dxa"/>
+                </w:tcPr>
+                <w:p>
+                  <w:pPr>
+                    <w:jc w:val="center"/>
+                  </w:pPr>
+                  <w:r>
+                    <w:rPr>
+                      <w:color w:val="808080" w:themeColor="background1" w:themeShade="80"/>
+                      <w:sz w:val="22"/>
+                      <w:szCs w:val="22"/>
+                    </w:rPr>
+                    <w:t xml:space="preserve">Extract from </w:t>
+                  </w:r>
+                  <w:r>
+                    <w:rPr>
+                      <w:color w:val="808080" w:themeColor="background1" w:themeShade="80"/>
+                      <w:sz w:val="22"/>
+                      <w:szCs w:val="22"/>
+                    </w:rPr>
+                    <w:t>“</w:t>
+                  </w:r>
+                  <w:r>
+                    <w:rPr>
+                      <w:color w:val="808080" w:themeColor="background1" w:themeShade="80"/>
+                      <w:sz w:val="22"/>
+                      <w:szCs w:val="22"/>
+                    </w:rPr>
+                    <w:t>src/main/java/com/studentjobportal/</w:t>
+                  </w:r>
+                  <w:r>
+                    <w:rPr>
+                      <w:color w:val="808080" w:themeColor="background1" w:themeShade="80"/>
+                      <w:sz w:val="22"/>
+                      <w:szCs w:val="22"/>
+                    </w:rPr>
+                    <w:t>services/ApplicationService.java</w:t>
+                  </w:r>
+                  <w:r>
+                    <w:rPr>
+                      <w:color w:val="808080" w:themeColor="background1" w:themeShade="80"/>
+                      <w:sz w:val="22"/>
+                      <w:szCs w:val="22"/>
+                    </w:rPr>
+                    <w:t>”</w:t>
+                  </w:r>
+                  <w:r>
+                    <w:rPr>
+                      <w:color w:val="808080" w:themeColor="background1" w:themeShade="80"/>
+                      <w:sz w:val="22"/>
+                      <w:szCs w:val="22"/>
+                    </w:rPr>
+                    <w:t xml:space="preserve"> on the 13</w:t>
+                  </w:r>
+                  <w:r>
+                    <w:rPr>
+                      <w:color w:val="808080" w:themeColor="background1" w:themeShade="80"/>
+                      <w:sz w:val="22"/>
+                      <w:szCs w:val="22"/>
+                      <w:vertAlign w:val="superscript"/>
+                    </w:rPr>
+                    <w:t>th</w:t>
+                  </w:r>
+                  <w:r>
+                    <w:rPr>
+                      <w:color w:val="808080" w:themeColor="background1" w:themeShade="80"/>
+                      <w:sz w:val="22"/>
+                      <w:szCs w:val="22"/>
+                    </w:rPr>
+                    <w:t xml:space="preserve"> Aug 2026.</w:t>
+                  </w:r>
+                </w:p>
               </w:tc>
             </w:tr>
           </w:tbl>
@@ -2381,7 +2904,7 @@
         </w:tc>
         <w:tc>
           <w:tcPr>
-            <w:tcW w:w="4508" w:type="dxa"/>
+            <w:tcW w:w="4631" w:type="dxa"/>
           </w:tcPr>
           <w:p>
             <w:r>

</xml_diff>

<commit_message>
Part 1 report needs reviewing, but otherwise complete
</commit_message>
<xml_diff>
--- a/CM2307_CW_StudentNumber.docx.docx
+++ b/CM2307_CW_StudentNumber.docx.docx
@@ -1766,7 +1766,6 @@
               </w:rPr>
               <w:t xml:space="preserve">” from </w:t>
             </w:r>
-            <w:proofErr w:type="spellStart"/>
             <w:r>
               <w:rPr>
                 <w:i/>
@@ -1777,7 +1776,6 @@
               </w:rPr>
               <w:t>VSCode</w:t>
             </w:r>
-            <w:proofErr w:type="spellEnd"/>
             <w:r>
               <w:rPr>
                 <w:i/>
@@ -2545,6 +2543,12 @@
               <w:tc>
                 <w:tcPr>
                   <w:tcW w:w="4282" w:type="dxa"/>
+                  <w:tcBorders>
+                    <w:top w:val="nil"/>
+                    <w:left w:val="nil"/>
+                    <w:bottom w:val="nil"/>
+                    <w:right w:val="nil"/>
+                  </w:tcBorders>
                 </w:tcPr>
                 <w:p>
                   <w:r>
@@ -2607,6 +2611,12 @@
               <w:tc>
                 <w:tcPr>
                   <w:tcW w:w="4282" w:type="dxa"/>
+                  <w:tcBorders>
+                    <w:top w:val="nil"/>
+                    <w:left w:val="nil"/>
+                    <w:bottom w:val="nil"/>
+                    <w:right w:val="nil"/>
+                  </w:tcBorders>
                 </w:tcPr>
                 <w:p>
                   <w:r>
@@ -2669,6 +2679,12 @@
               <w:tc>
                 <w:tcPr>
                   <w:tcW w:w="4282" w:type="dxa"/>
+                  <w:tcBorders>
+                    <w:top w:val="nil"/>
+                    <w:left w:val="nil"/>
+                    <w:bottom w:val="nil"/>
+                    <w:right w:val="nil"/>
+                  </w:tcBorders>
                 </w:tcPr>
                 <w:p>
                   <w:pPr>
@@ -2680,7 +2696,23 @@
                       <w:sz w:val="22"/>
                       <w:szCs w:val="22"/>
                     </w:rPr>
-                    <w:t xml:space="preserve">Extract from </w:t>
+                    <w:t>Extract</w:t>
+                  </w:r>
+                  <w:r>
+                    <w:rPr>
+                      <w:color w:val="808080" w:themeColor="background1" w:themeShade="80"/>
+                      <w:sz w:val="22"/>
+                      <w:szCs w:val="22"/>
+                    </w:rPr>
+                    <w:t>s (2)</w:t>
+                  </w:r>
+                  <w:r>
+                    <w:rPr>
+                      <w:color w:val="808080" w:themeColor="background1" w:themeShade="80"/>
+                      <w:sz w:val="22"/>
+                      <w:szCs w:val="22"/>
+                    </w:rPr>
+                    <w:t xml:space="preserve"> from </w:t>
                   </w:r>
                   <w:r>
                     <w:rPr>
@@ -2764,6 +2796,12 @@
               <w:tc>
                 <w:tcPr>
                   <w:tcW w:w="4282" w:type="dxa"/>
+                  <w:tcBorders>
+                    <w:top w:val="nil"/>
+                    <w:left w:val="nil"/>
+                    <w:bottom w:val="nil"/>
+                    <w:right w:val="nil"/>
+                  </w:tcBorders>
                 </w:tcPr>
                 <w:p>
                   <w:r>
@@ -2826,6 +2864,12 @@
               <w:tc>
                 <w:tcPr>
                   <w:tcW w:w="4282" w:type="dxa"/>
+                  <w:tcBorders>
+                    <w:top w:val="nil"/>
+                    <w:left w:val="nil"/>
+                    <w:bottom w:val="nil"/>
+                    <w:right w:val="nil"/>
+                  </w:tcBorders>
                 </w:tcPr>
                 <w:p>
                   <w:pPr>
@@ -2908,13 +2952,1353 @@
           </w:tcPr>
           <w:p>
             <w:r>
-              <w:t xml:space="preserve">Value Objects are yet another improvement to the encapsulation, more specifically the “JobID”’ and “ApplicationID”’. Instead of identifying each job or job application with an indexed list number (i), both encapsulate a UUID. </w:t>
+              <w:t xml:space="preserve">Value Objects are yet another improvement </w:t>
+            </w:r>
+            <w:r>
+              <w:t>in</w:t>
+            </w:r>
+            <w:r>
+              <w:t xml:space="preserve"> encapsulation, more specifically the “JobID”’ and “ApplicationID”’. </w:t>
             </w:r>
           </w:p>
+          <w:p>
+            <w:r>
+              <w:t xml:space="preserve">Instead of identifying each job or job application with an indexed list number (i), both encapsulate a UUID. </w:t>
+            </w:r>
+          </w:p>
+          <w:p/>
+          <w:p>
+            <w:r>
+              <w:t>Also, their creation is controlled through a generator like “ApplicationID.generate()” for example, which improves safety &amp; maintainability due to the methods used: such as “applyForJob(JobID jobID)” which explicitly require a JobID rather than an indexed value (i).</w:t>
+            </w:r>
+          </w:p>
+        </w:tc>
+      </w:tr>
+    </w:tbl>
+    <w:p/>
+    <w:p>
+      <w:r>
+        <w:t>Another problem with the initial code that was provided is that there was no visible abstraction</w:t>
+      </w:r>
+      <w:r>
+        <w:t>, and all storage, searching, input, output and application behaviour more generally, were implemented in “</w:t>
+      </w:r>
+      <w:proofErr w:type="gramStart"/>
+      <w:r>
+        <w:t>main(</w:t>
+      </w:r>
+      <w:proofErr w:type="gramEnd"/>
+      <w:r>
+        <w:t xml:space="preserve">)”. </w:t>
+      </w:r>
+    </w:p>
+    <w:p>
+      <w:r>
+        <w:t>A good example of this would be the search function in the provided “StudentJobProtal.java” file:</w:t>
+      </w:r>
+    </w:p>
+    <w:p/>
+    <w:tbl>
+      <w:tblPr>
+        <w:tblStyle w:val="TableGrid"/>
+        <w:tblW w:w="0" w:type="auto"/>
+        <w:tblBorders>
+          <w:top w:val="none" w:sz="0" w:space="0" w:color="auto"/>
+          <w:left w:val="none" w:sz="0" w:space="0" w:color="auto"/>
+          <w:bottom w:val="none" w:sz="0" w:space="0" w:color="auto"/>
+          <w:right w:val="none" w:sz="0" w:space="0" w:color="auto"/>
+          <w:insideH w:val="none" w:sz="0" w:space="0" w:color="auto"/>
+          <w:insideV w:val="none" w:sz="0" w:space="0" w:color="auto"/>
+        </w:tblBorders>
+        <w:tblLook w:val="04A0" w:firstRow="1" w:lastRow="0" w:firstColumn="1" w:lastColumn="0" w:noHBand="0" w:noVBand="1"/>
+      </w:tblPr>
+      <w:tblGrid>
+        <w:gridCol w:w="9026"/>
+      </w:tblGrid>
+      <w:tr>
+        <w:tc>
+          <w:tcPr>
+            <w:tcW w:w="9016" w:type="dxa"/>
+          </w:tcPr>
+          <w:p>
+            <w:r>
+              <w:rPr>
+                <w:noProof/>
+              </w:rPr>
+              <w:drawing>
+                <wp:inline distT="0" distB="0" distL="0" distR="0" wp14:anchorId="534B236C" wp14:editId="4F293C7F">
+                  <wp:extent cx="5731067" cy="1480088"/>
+                  <wp:effectExtent l="0" t="0" r="0" b="6350"/>
+                  <wp:docPr id="566774742" name="Picture 21"/>
+                  <wp:cNvGraphicFramePr>
+                    <a:graphicFrameLocks xmlns:a="http://schemas.openxmlformats.org/drawingml/2006/main" noChangeAspect="1"/>
+                  </wp:cNvGraphicFramePr>
+                  <a:graphic xmlns:a="http://schemas.openxmlformats.org/drawingml/2006/main">
+                    <a:graphicData uri="http://schemas.openxmlformats.org/drawingml/2006/picture">
+                      <pic:pic xmlns:pic="http://schemas.openxmlformats.org/drawingml/2006/picture">
+                        <pic:nvPicPr>
+                          <pic:cNvPr id="566774742" name="Picture 566774742"/>
+                          <pic:cNvPicPr/>
+                        </pic:nvPicPr>
+                        <pic:blipFill rotWithShape="1">
+                          <a:blip r:embed="rId11">
+                            <a:extLst>
+                              <a:ext uri="{28A0092B-C50C-407E-A947-70E740481C1C}">
+                                <a14:useLocalDpi xmlns:a14="http://schemas.microsoft.com/office/drawing/2010/main" val="0"/>
+                              </a:ext>
+                            </a:extLst>
+                          </a:blip>
+                          <a:srcRect t="49874" b="32898"/>
+                          <a:stretch/>
+                        </pic:blipFill>
+                        <pic:spPr bwMode="auto">
+                          <a:xfrm>
+                            <a:off x="0" y="0"/>
+                            <a:ext cx="5731510" cy="1480202"/>
+                          </a:xfrm>
+                          <a:prstGeom prst="rect">
+                            <a:avLst/>
+                          </a:prstGeom>
+                          <a:ln>
+                            <a:noFill/>
+                          </a:ln>
+                          <a:extLst>
+                            <a:ext uri="{53640926-AAD7-44D8-BBD7-CCE9431645EC}">
+                              <a14:shadowObscured xmlns:a14="http://schemas.microsoft.com/office/drawing/2010/main"/>
+                            </a:ext>
+                          </a:extLst>
+                        </pic:spPr>
+                      </pic:pic>
+                    </a:graphicData>
+                  </a:graphic>
+                </wp:inline>
+              </w:drawing>
+            </w:r>
+          </w:p>
+        </w:tc>
+      </w:tr>
+      <w:tr>
+        <w:tc>
+          <w:tcPr>
+            <w:tcW w:w="9016" w:type="dxa"/>
+          </w:tcPr>
+          <w:p>
+            <w:pPr>
+              <w:jc w:val="center"/>
+            </w:pPr>
+            <w:r>
+              <w:rPr>
+                <w:i/>
+                <w:iCs/>
+                <w:color w:val="808080" w:themeColor="background1" w:themeShade="80"/>
+                <w:sz w:val="22"/>
+                <w:szCs w:val="22"/>
+              </w:rPr>
+              <w:t>Export of “</w:t>
+            </w:r>
+            <w:r>
+              <w:rPr>
+                <w:i/>
+                <w:iCs/>
+                <w:color w:val="808080" w:themeColor="background1" w:themeShade="80"/>
+                <w:sz w:val="22"/>
+                <w:szCs w:val="22"/>
+              </w:rPr>
+              <w:t>StudentJobPortal.java</w:t>
+            </w:r>
+            <w:r>
+              <w:rPr>
+                <w:i/>
+                <w:iCs/>
+                <w:color w:val="808080" w:themeColor="background1" w:themeShade="80"/>
+                <w:sz w:val="22"/>
+                <w:szCs w:val="22"/>
+              </w:rPr>
+              <w:t xml:space="preserve">” from </w:t>
+            </w:r>
+            <w:r>
+              <w:rPr>
+                <w:i/>
+                <w:iCs/>
+                <w:color w:val="808080" w:themeColor="background1" w:themeShade="80"/>
+                <w:sz w:val="22"/>
+                <w:szCs w:val="22"/>
+              </w:rPr>
+              <w:t>VSCode</w:t>
+            </w:r>
+            <w:r>
+              <w:rPr>
+                <w:i/>
+                <w:iCs/>
+                <w:color w:val="808080" w:themeColor="background1" w:themeShade="80"/>
+                <w:sz w:val="22"/>
+                <w:szCs w:val="22"/>
+              </w:rPr>
+              <w:t xml:space="preserve"> MacOS taken the 1</w:t>
+            </w:r>
+            <w:r>
+              <w:rPr>
+                <w:i/>
+                <w:iCs/>
+                <w:color w:val="808080" w:themeColor="background1" w:themeShade="80"/>
+                <w:sz w:val="22"/>
+                <w:szCs w:val="22"/>
+              </w:rPr>
+              <w:t>3</w:t>
+            </w:r>
+            <w:r>
+              <w:rPr>
+                <w:i/>
+                <w:iCs/>
+                <w:color w:val="808080" w:themeColor="background1" w:themeShade="80"/>
+                <w:sz w:val="22"/>
+                <w:szCs w:val="22"/>
+                <w:vertAlign w:val="superscript"/>
+              </w:rPr>
+              <w:t>th</w:t>
+            </w:r>
+            <w:r>
+              <w:rPr>
+                <w:i/>
+                <w:iCs/>
+                <w:color w:val="808080" w:themeColor="background1" w:themeShade="80"/>
+                <w:sz w:val="22"/>
+                <w:szCs w:val="22"/>
+              </w:rPr>
+              <w:t xml:space="preserve"> Aug 2026.</w:t>
+            </w:r>
+          </w:p>
+        </w:tc>
+      </w:tr>
+    </w:tbl>
+    <w:p/>
+    <w:p>
+      <w:r>
+        <w:t>next page &gt;&gt;</w:t>
+      </w:r>
+    </w:p>
+    <w:p>
+      <w:r>
+        <w:br w:type="page"/>
+      </w:r>
+    </w:p>
+    <w:p>
+      <w:r>
+        <w:lastRenderedPageBreak/>
+        <w:t>Any extension, modification or replacement of this search method would require editing this conditional directly. The refactored version of the program replaces this direct conditional with the “JobSearchStrategy” interface shown below.</w:t>
+      </w:r>
+    </w:p>
+    <w:p/>
+    <w:tbl>
+      <w:tblPr>
+        <w:tblStyle w:val="TableGrid"/>
+        <w:tblW w:w="0" w:type="auto"/>
+        <w:tblBorders>
+          <w:top w:val="none" w:sz="0" w:space="0" w:color="auto"/>
+          <w:left w:val="none" w:sz="0" w:space="0" w:color="auto"/>
+          <w:bottom w:val="none" w:sz="0" w:space="0" w:color="auto"/>
+          <w:right w:val="none" w:sz="0" w:space="0" w:color="auto"/>
+          <w:insideH w:val="none" w:sz="0" w:space="0" w:color="auto"/>
+          <w:insideV w:val="none" w:sz="0" w:space="0" w:color="auto"/>
+        </w:tblBorders>
+        <w:tblLook w:val="04A0" w:firstRow="1" w:lastRow="0" w:firstColumn="1" w:lastColumn="0" w:noHBand="0" w:noVBand="1"/>
+      </w:tblPr>
+      <w:tblGrid>
+        <w:gridCol w:w="9016"/>
+      </w:tblGrid>
+      <w:tr>
+        <w:tc>
+          <w:tcPr>
+            <w:tcW w:w="9016" w:type="dxa"/>
+          </w:tcPr>
+          <w:p>
+            <w:r>
+              <w:rPr>
+                <w:noProof/>
+              </w:rPr>
+              <w:drawing>
+                <wp:inline distT="0" distB="0" distL="0" distR="0" wp14:anchorId="68E50AEC" wp14:editId="2E2CD2A2">
+                  <wp:extent cx="5588347" cy="1534332"/>
+                  <wp:effectExtent l="0" t="0" r="0" b="2540"/>
+                  <wp:docPr id="1374711400" name="Picture 22"/>
+                  <wp:cNvGraphicFramePr>
+                    <a:graphicFrameLocks xmlns:a="http://schemas.openxmlformats.org/drawingml/2006/main" noChangeAspect="1"/>
+                  </wp:cNvGraphicFramePr>
+                  <a:graphic xmlns:a="http://schemas.openxmlformats.org/drawingml/2006/main">
+                    <a:graphicData uri="http://schemas.openxmlformats.org/drawingml/2006/picture">
+                      <pic:pic xmlns:pic="http://schemas.openxmlformats.org/drawingml/2006/picture">
+                        <pic:nvPicPr>
+                          <pic:cNvPr id="1374711400" name="Picture 1374711400"/>
+                          <pic:cNvPicPr/>
+                        </pic:nvPicPr>
+                        <pic:blipFill>
+                          <a:blip r:embed="rId17">
+                            <a:extLst>
+                              <a:ext uri="{28A0092B-C50C-407E-A947-70E740481C1C}">
+                                <a14:useLocalDpi xmlns:a14="http://schemas.microsoft.com/office/drawing/2010/main" val="0"/>
+                              </a:ext>
+                            </a:extLst>
+                          </a:blip>
+                          <a:stretch>
+                            <a:fillRect/>
+                          </a:stretch>
+                        </pic:blipFill>
+                        <pic:spPr>
+                          <a:xfrm>
+                            <a:off x="0" y="0"/>
+                            <a:ext cx="5658274" cy="1553531"/>
+                          </a:xfrm>
+                          <a:prstGeom prst="rect">
+                            <a:avLst/>
+                          </a:prstGeom>
+                        </pic:spPr>
+                      </pic:pic>
+                    </a:graphicData>
+                  </a:graphic>
+                </wp:inline>
+              </w:drawing>
+            </w:r>
+          </w:p>
+        </w:tc>
+      </w:tr>
+      <w:tr>
+        <w:tc>
+          <w:tcPr>
+            <w:tcW w:w="9016" w:type="dxa"/>
+          </w:tcPr>
+          <w:p>
+            <w:pPr>
+              <w:jc w:val="center"/>
+            </w:pPr>
+            <w:r>
+              <w:rPr>
+                <w:color w:val="808080" w:themeColor="background1" w:themeShade="80"/>
+                <w:sz w:val="22"/>
+                <w:szCs w:val="22"/>
+              </w:rPr>
+              <w:t xml:space="preserve">Extract from </w:t>
+            </w:r>
+            <w:r>
+              <w:rPr>
+                <w:color w:val="808080" w:themeColor="background1" w:themeShade="80"/>
+                <w:sz w:val="22"/>
+                <w:szCs w:val="22"/>
+              </w:rPr>
+              <w:t>“</w:t>
+            </w:r>
+            <w:r>
+              <w:rPr>
+                <w:color w:val="808080" w:themeColor="background1" w:themeShade="80"/>
+                <w:sz w:val="22"/>
+                <w:szCs w:val="22"/>
+              </w:rPr>
+              <w:t>src/main/java/com/studentjobportal/</w:t>
+            </w:r>
+            <w:r>
+              <w:rPr>
+                <w:color w:val="808080" w:themeColor="background1" w:themeShade="80"/>
+                <w:sz w:val="22"/>
+                <w:szCs w:val="22"/>
+              </w:rPr>
+              <w:t>search</w:t>
+            </w:r>
+            <w:r>
+              <w:rPr>
+                <w:color w:val="808080" w:themeColor="background1" w:themeShade="80"/>
+                <w:sz w:val="22"/>
+                <w:szCs w:val="22"/>
+              </w:rPr>
+              <w:t>/</w:t>
+            </w:r>
+            <w:r>
+              <w:rPr>
+                <w:color w:val="808080" w:themeColor="background1" w:themeShade="80"/>
+                <w:sz w:val="22"/>
+                <w:szCs w:val="22"/>
+              </w:rPr>
+              <w:t>JobSearchStrategy</w:t>
+            </w:r>
+            <w:r>
+              <w:rPr>
+                <w:color w:val="808080" w:themeColor="background1" w:themeShade="80"/>
+                <w:sz w:val="22"/>
+                <w:szCs w:val="22"/>
+              </w:rPr>
+              <w:t>.java”</w:t>
+            </w:r>
+            <w:r>
+              <w:rPr>
+                <w:color w:val="808080" w:themeColor="background1" w:themeShade="80"/>
+                <w:sz w:val="22"/>
+                <w:szCs w:val="22"/>
+              </w:rPr>
+              <w:t xml:space="preserve"> on the 13</w:t>
+            </w:r>
+            <w:r>
+              <w:rPr>
+                <w:color w:val="808080" w:themeColor="background1" w:themeShade="80"/>
+                <w:sz w:val="22"/>
+                <w:szCs w:val="22"/>
+                <w:vertAlign w:val="superscript"/>
+              </w:rPr>
+              <w:t>th</w:t>
+            </w:r>
+            <w:r>
+              <w:rPr>
+                <w:color w:val="808080" w:themeColor="background1" w:themeShade="80"/>
+                <w:sz w:val="22"/>
+                <w:szCs w:val="22"/>
+              </w:rPr>
+              <w:t xml:space="preserve"> Aug 2026.</w:t>
+            </w:r>
+          </w:p>
+        </w:tc>
+      </w:tr>
+    </w:tbl>
+    <w:p/>
+    <w:p>
+      <w:r>
+        <w:t xml:space="preserve">This concrete implementation allows for the inclusion of “TitleSearchStrategy”, “CompanySearchStrategy”, </w:t>
+      </w:r>
+      <w:r>
+        <w:t xml:space="preserve">“LocationSearchStrategy” and finally “JobTypeSearchStrategy” which can each have their own “algorithms”. As an </w:t>
+      </w:r>
+      <w:proofErr w:type="gramStart"/>
+      <w:r>
+        <w:t>example</w:t>
+      </w:r>
+      <w:proofErr w:type="gramEnd"/>
+      <w:r>
+        <w:t xml:space="preserve"> to this; “TitleSearchStrategy.matches()” is relevant to the following </w:t>
+      </w:r>
+      <w:r>
+        <w:t xml:space="preserve">algorithm: </w:t>
+      </w:r>
+    </w:p>
+    <w:p>
+      <w:r>
+        <w:t>“</w:t>
+      </w:r>
+      <w:r>
+        <w:t>return SearchSupport.contains(</w:t>
+      </w:r>
+      <w:proofErr w:type="gramStart"/>
+      <w:r>
+        <w:t>Job::</w:t>
+      </w:r>
+      <w:proofErr w:type="gramEnd"/>
+      <w:r>
+        <w:t>getTitle, job, searchTerm);</w:t>
+      </w:r>
+      <w:r>
+        <w:t>”</w:t>
+      </w:r>
+      <w:r>
+        <w:t>.</w:t>
+      </w:r>
+    </w:p>
+    <w:p/>
+    <w:tbl>
+      <w:tblPr>
+        <w:tblStyle w:val="TableGrid"/>
+        <w:tblW w:w="0" w:type="auto"/>
+        <w:tblBorders>
+          <w:top w:val="none" w:sz="0" w:space="0" w:color="auto"/>
+          <w:left w:val="none" w:sz="0" w:space="0" w:color="auto"/>
+          <w:bottom w:val="none" w:sz="0" w:space="0" w:color="auto"/>
+          <w:right w:val="none" w:sz="0" w:space="0" w:color="auto"/>
+          <w:insideH w:val="none" w:sz="0" w:space="0" w:color="auto"/>
+          <w:insideV w:val="none" w:sz="0" w:space="0" w:color="auto"/>
+        </w:tblBorders>
+        <w:tblLook w:val="04A0" w:firstRow="1" w:lastRow="0" w:firstColumn="1" w:lastColumn="0" w:noHBand="0" w:noVBand="1"/>
+      </w:tblPr>
+      <w:tblGrid>
+        <w:gridCol w:w="9016"/>
+      </w:tblGrid>
+      <w:tr>
+        <w:tc>
+          <w:tcPr>
+            <w:tcW w:w="9016" w:type="dxa"/>
+          </w:tcPr>
+          <w:p>
+            <w:r>
+              <w:rPr>
+                <w:noProof/>
+              </w:rPr>
+              <w:drawing>
+                <wp:inline distT="0" distB="0" distL="0" distR="0" wp14:anchorId="20830E44" wp14:editId="6B1844B2">
+                  <wp:extent cx="5588000" cy="923079"/>
+                  <wp:effectExtent l="0" t="0" r="0" b="4445"/>
+                  <wp:docPr id="394815323" name="Picture 23"/>
+                  <wp:cNvGraphicFramePr>
+                    <a:graphicFrameLocks xmlns:a="http://schemas.openxmlformats.org/drawingml/2006/main" noChangeAspect="1"/>
+                  </wp:cNvGraphicFramePr>
+                  <a:graphic xmlns:a="http://schemas.openxmlformats.org/drawingml/2006/main">
+                    <a:graphicData uri="http://schemas.openxmlformats.org/drawingml/2006/picture">
+                      <pic:pic xmlns:pic="http://schemas.openxmlformats.org/drawingml/2006/picture">
+                        <pic:nvPicPr>
+                          <pic:cNvPr id="394815323" name="Picture 394815323"/>
+                          <pic:cNvPicPr/>
+                        </pic:nvPicPr>
+                        <pic:blipFill>
+                          <a:blip r:embed="rId18">
+                            <a:extLst>
+                              <a:ext uri="{28A0092B-C50C-407E-A947-70E740481C1C}">
+                                <a14:useLocalDpi xmlns:a14="http://schemas.microsoft.com/office/drawing/2010/main" val="0"/>
+                              </a:ext>
+                            </a:extLst>
+                          </a:blip>
+                          <a:stretch>
+                            <a:fillRect/>
+                          </a:stretch>
+                        </pic:blipFill>
+                        <pic:spPr>
+                          <a:xfrm>
+                            <a:off x="0" y="0"/>
+                            <a:ext cx="5651066" cy="933497"/>
+                          </a:xfrm>
+                          <a:prstGeom prst="rect">
+                            <a:avLst/>
+                          </a:prstGeom>
+                        </pic:spPr>
+                      </pic:pic>
+                    </a:graphicData>
+                  </a:graphic>
+                </wp:inline>
+              </w:drawing>
+            </w:r>
+          </w:p>
+        </w:tc>
+      </w:tr>
+      <w:tr>
+        <w:tc>
+          <w:tcPr>
+            <w:tcW w:w="9016" w:type="dxa"/>
+          </w:tcPr>
+          <w:p>
+            <w:pPr>
+              <w:jc w:val="center"/>
+            </w:pPr>
+            <w:r>
+              <w:rPr>
+                <w:color w:val="808080" w:themeColor="background1" w:themeShade="80"/>
+                <w:sz w:val="22"/>
+                <w:szCs w:val="22"/>
+              </w:rPr>
+              <w:t xml:space="preserve">Extract from </w:t>
+            </w:r>
+            <w:r>
+              <w:rPr>
+                <w:color w:val="808080" w:themeColor="background1" w:themeShade="80"/>
+                <w:sz w:val="22"/>
+                <w:szCs w:val="22"/>
+              </w:rPr>
+              <w:t>“</w:t>
+            </w:r>
+            <w:r>
+              <w:rPr>
+                <w:color w:val="808080" w:themeColor="background1" w:themeShade="80"/>
+                <w:sz w:val="22"/>
+                <w:szCs w:val="22"/>
+              </w:rPr>
+              <w:t>src/main/java/com/studentjobportal/</w:t>
+            </w:r>
+            <w:r>
+              <w:rPr>
+                <w:color w:val="808080" w:themeColor="background1" w:themeShade="80"/>
+                <w:sz w:val="22"/>
+                <w:szCs w:val="22"/>
+              </w:rPr>
+              <w:t>search/</w:t>
+            </w:r>
+            <w:r>
+              <w:rPr>
+                <w:color w:val="808080" w:themeColor="background1" w:themeShade="80"/>
+                <w:sz w:val="22"/>
+                <w:szCs w:val="22"/>
+              </w:rPr>
+              <w:t>Title</w:t>
+            </w:r>
+            <w:r>
+              <w:rPr>
+                <w:color w:val="808080" w:themeColor="background1" w:themeShade="80"/>
+                <w:sz w:val="22"/>
+                <w:szCs w:val="22"/>
+              </w:rPr>
+              <w:t>SearchStrategy.java”</w:t>
+            </w:r>
+            <w:r>
+              <w:rPr>
+                <w:color w:val="808080" w:themeColor="background1" w:themeShade="80"/>
+                <w:sz w:val="22"/>
+                <w:szCs w:val="22"/>
+              </w:rPr>
+              <w:t xml:space="preserve"> on the 13</w:t>
+            </w:r>
+            <w:r>
+              <w:rPr>
+                <w:color w:val="808080" w:themeColor="background1" w:themeShade="80"/>
+                <w:sz w:val="22"/>
+                <w:szCs w:val="22"/>
+                <w:vertAlign w:val="superscript"/>
+              </w:rPr>
+              <w:t>th</w:t>
+            </w:r>
+            <w:r>
+              <w:rPr>
+                <w:color w:val="808080" w:themeColor="background1" w:themeShade="80"/>
+                <w:sz w:val="22"/>
+                <w:szCs w:val="22"/>
+              </w:rPr>
+              <w:t xml:space="preserve"> Aug 2026.</w:t>
+            </w:r>
+          </w:p>
+        </w:tc>
+      </w:tr>
+    </w:tbl>
+    <w:p/>
+    <w:p>
+      <w:r>
+        <w:t>This is also a good example of the inclusion of Polymorphism due to the fact that the “JobService” works with the “JobSearchStrategy” interface</w:t>
+      </w:r>
+      <w:r>
+        <w:t xml:space="preserve"> rather than needing to know which search algorithm has been supplied. This also serves as the second Gang of Four (G.o.F.) implementa</w:t>
+      </w:r>
+      <w:r>
+        <w:t xml:space="preserve">tion, this time the Strategy Behavioural Pattern. It’s appropriate here because searching is inherently expected to vary based on what the user needs; and alternative strategies can be substituted without rewriting the “JobService”. </w:t>
+      </w:r>
+    </w:p>
+    <w:p/>
+    <w:p>
+      <w:r>
+        <w:t xml:space="preserve">This is great for our requirements of improving Extend-ability </w:t>
+      </w:r>
+      <w:r>
+        <w:t xml:space="preserve">because another implementation, such as </w:t>
+      </w:r>
+      <w:r>
+        <w:t>“</w:t>
+      </w:r>
+      <w:r>
+        <w:t>SalarySearchStrategy</w:t>
+      </w:r>
+      <w:r>
+        <w:t>”</w:t>
+      </w:r>
+      <w:r>
+        <w:t>, could implement</w:t>
+      </w:r>
+      <w:r>
+        <w:t xml:space="preserve"> “</w:t>
+      </w:r>
+      <w:r>
+        <w:t>JobSearchStrategy</w:t>
+      </w:r>
+      <w:r>
+        <w:t>”</w:t>
+      </w:r>
+      <w:r>
+        <w:t xml:space="preserve"> while the existing service remains un</w:t>
+      </w:r>
+      <w:r>
+        <w:t>touched.</w:t>
+      </w:r>
+    </w:p>
+    <w:p/>
+    <w:p>
+      <w:r>
+        <w:t>next page &gt;&gt;</w:t>
+      </w:r>
+    </w:p>
+    <w:p>
+      <w:r>
+        <w:br w:type="page"/>
+      </w:r>
+    </w:p>
+    <w:p>
+      <w:r>
+        <w:lastRenderedPageBreak/>
+        <w:t>This also allowed me to make the “CombinedKeywordSearchStrategy” which further demonstrates composition over inheritance by holding multiple “JobSearchStrategy” objects</w:t>
+      </w:r>
+    </w:p>
+    <w:p/>
+    <w:tbl>
+      <w:tblPr>
+        <w:tblStyle w:val="TableGrid"/>
+        <w:tblW w:w="0" w:type="auto"/>
+        <w:tblBorders>
+          <w:top w:val="none" w:sz="0" w:space="0" w:color="auto"/>
+          <w:left w:val="none" w:sz="0" w:space="0" w:color="auto"/>
+          <w:bottom w:val="none" w:sz="0" w:space="0" w:color="auto"/>
+          <w:right w:val="none" w:sz="0" w:space="0" w:color="auto"/>
+          <w:insideH w:val="none" w:sz="0" w:space="0" w:color="auto"/>
+          <w:insideV w:val="none" w:sz="0" w:space="0" w:color="auto"/>
+        </w:tblBorders>
+        <w:tblLook w:val="04A0" w:firstRow="1" w:lastRow="0" w:firstColumn="1" w:lastColumn="0" w:noHBand="0" w:noVBand="1"/>
+      </w:tblPr>
+      <w:tblGrid>
+        <w:gridCol w:w="9016"/>
+      </w:tblGrid>
+      <w:tr>
+        <w:tc>
+          <w:tcPr>
+            <w:tcW w:w="9016" w:type="dxa"/>
+          </w:tcPr>
+          <w:p>
+            <w:r>
+              <w:rPr>
+                <w:noProof/>
+              </w:rPr>
+              <w:drawing>
+                <wp:inline distT="0" distB="0" distL="0" distR="0" wp14:anchorId="3A0900AA" wp14:editId="4F649874">
+                  <wp:extent cx="5573999" cy="960615"/>
+                  <wp:effectExtent l="0" t="0" r="1905" b="5080"/>
+                  <wp:docPr id="1972523978" name="Picture 24"/>
+                  <wp:cNvGraphicFramePr>
+                    <a:graphicFrameLocks xmlns:a="http://schemas.openxmlformats.org/drawingml/2006/main" noChangeAspect="1"/>
+                  </wp:cNvGraphicFramePr>
+                  <a:graphic xmlns:a="http://schemas.openxmlformats.org/drawingml/2006/main">
+                    <a:graphicData uri="http://schemas.openxmlformats.org/drawingml/2006/picture">
+                      <pic:pic xmlns:pic="http://schemas.openxmlformats.org/drawingml/2006/picture">
+                        <pic:nvPicPr>
+                          <pic:cNvPr id="1972523978" name="Picture 1972523978"/>
+                          <pic:cNvPicPr/>
+                        </pic:nvPicPr>
+                        <pic:blipFill rotWithShape="1">
+                          <a:blip r:embed="rId19">
+                            <a:extLst>
+                              <a:ext uri="{28A0092B-C50C-407E-A947-70E740481C1C}">
+                                <a14:useLocalDpi xmlns:a14="http://schemas.microsoft.com/office/drawing/2010/main" val="0"/>
+                              </a:ext>
+                            </a:extLst>
+                          </a:blip>
+                          <a:srcRect t="14744" b="57137"/>
+                          <a:stretch/>
+                        </pic:blipFill>
+                        <pic:spPr bwMode="auto">
+                          <a:xfrm>
+                            <a:off x="0" y="0"/>
+                            <a:ext cx="5579895" cy="961631"/>
+                          </a:xfrm>
+                          <a:prstGeom prst="rect">
+                            <a:avLst/>
+                          </a:prstGeom>
+                          <a:ln>
+                            <a:noFill/>
+                          </a:ln>
+                          <a:extLst>
+                            <a:ext uri="{53640926-AAD7-44D8-BBD7-CCE9431645EC}">
+                              <a14:shadowObscured xmlns:a14="http://schemas.microsoft.com/office/drawing/2010/main"/>
+                            </a:ext>
+                          </a:extLst>
+                        </pic:spPr>
+                      </pic:pic>
+                    </a:graphicData>
+                  </a:graphic>
+                </wp:inline>
+              </w:drawing>
+            </w:r>
+          </w:p>
+        </w:tc>
+      </w:tr>
+      <w:tr>
+        <w:tc>
+          <w:tcPr>
+            <w:tcW w:w="9016" w:type="dxa"/>
+          </w:tcPr>
+          <w:p>
+            <w:pPr>
+              <w:jc w:val="center"/>
+            </w:pPr>
+            <w:r>
+              <w:rPr>
+                <w:color w:val="808080" w:themeColor="background1" w:themeShade="80"/>
+                <w:sz w:val="22"/>
+                <w:szCs w:val="22"/>
+              </w:rPr>
+              <w:t xml:space="preserve">Extract from </w:t>
+            </w:r>
+            <w:r>
+              <w:rPr>
+                <w:color w:val="808080" w:themeColor="background1" w:themeShade="80"/>
+                <w:sz w:val="22"/>
+                <w:szCs w:val="22"/>
+              </w:rPr>
+              <w:t>“</w:t>
+            </w:r>
+            <w:r>
+              <w:rPr>
+                <w:color w:val="808080" w:themeColor="background1" w:themeShade="80"/>
+                <w:sz w:val="22"/>
+                <w:szCs w:val="22"/>
+              </w:rPr>
+              <w:t>src/main/java/com/studentjobportal/</w:t>
+            </w:r>
+            <w:r>
+              <w:rPr>
+                <w:color w:val="808080" w:themeColor="background1" w:themeShade="80"/>
+                <w:sz w:val="22"/>
+                <w:szCs w:val="22"/>
+              </w:rPr>
+              <w:t>search/</w:t>
+            </w:r>
+            <w:r>
+              <w:rPr>
+                <w:color w:val="808080" w:themeColor="background1" w:themeShade="80"/>
+                <w:sz w:val="22"/>
+                <w:szCs w:val="22"/>
+              </w:rPr>
+              <w:t>CombinedKeyword</w:t>
+            </w:r>
+            <w:r>
+              <w:rPr>
+                <w:color w:val="808080" w:themeColor="background1" w:themeShade="80"/>
+                <w:sz w:val="22"/>
+                <w:szCs w:val="22"/>
+              </w:rPr>
+              <w:t>SearchStrategy.java”</w:t>
+            </w:r>
+            <w:r>
+              <w:rPr>
+                <w:color w:val="808080" w:themeColor="background1" w:themeShade="80"/>
+                <w:sz w:val="22"/>
+                <w:szCs w:val="22"/>
+              </w:rPr>
+              <w:t xml:space="preserve"> on the 13</w:t>
+            </w:r>
+            <w:r>
+              <w:rPr>
+                <w:color w:val="808080" w:themeColor="background1" w:themeShade="80"/>
+                <w:sz w:val="22"/>
+                <w:szCs w:val="22"/>
+                <w:vertAlign w:val="superscript"/>
+              </w:rPr>
+              <w:t>th</w:t>
+            </w:r>
+            <w:r>
+              <w:rPr>
+                <w:color w:val="808080" w:themeColor="background1" w:themeShade="80"/>
+                <w:sz w:val="22"/>
+                <w:szCs w:val="22"/>
+              </w:rPr>
+              <w:t xml:space="preserve"> Aug 2026.</w:t>
+            </w:r>
+          </w:p>
+        </w:tc>
+      </w:tr>
+    </w:tbl>
+    <w:p/>
+    <w:p/>
+    <w:p>
+      <w:r>
+        <w:t xml:space="preserve">Another key abstraction in the revised “StudentJobPortal” </w:t>
+      </w:r>
+      <w:r>
+        <w:t xml:space="preserve">application is the repository layer. These interfaces hide how information </w:t>
+      </w:r>
+      <w:r>
+        <w:t xml:space="preserve">is </w:t>
+      </w:r>
+      <w:r>
+        <w:t xml:space="preserve">actually stored, </w:t>
+      </w:r>
+      <w:r>
+        <w:t>whereas classes containing “</w:t>
+      </w:r>
+      <w:proofErr w:type="spellStart"/>
+      <w:r>
+        <w:t>InMemory</w:t>
+      </w:r>
+      <w:proofErr w:type="spellEnd"/>
+      <w:r>
+        <w:t>…” supply a current implementation. The following example is given:</w:t>
+      </w:r>
+    </w:p>
+    <w:p/>
+    <w:tbl>
+      <w:tblPr>
+        <w:tblStyle w:val="TableGrid"/>
+        <w:tblW w:w="0" w:type="auto"/>
+        <w:tblBorders>
+          <w:top w:val="none" w:sz="0" w:space="0" w:color="auto"/>
+          <w:left w:val="none" w:sz="0" w:space="0" w:color="auto"/>
+          <w:bottom w:val="none" w:sz="0" w:space="0" w:color="auto"/>
+          <w:right w:val="none" w:sz="0" w:space="0" w:color="auto"/>
+          <w:insideH w:val="none" w:sz="0" w:space="0" w:color="auto"/>
+          <w:insideV w:val="none" w:sz="0" w:space="0" w:color="auto"/>
+        </w:tblBorders>
+        <w:tblLook w:val="04A0" w:firstRow="1" w:lastRow="0" w:firstColumn="1" w:lastColumn="0" w:noHBand="0" w:noVBand="1"/>
+      </w:tblPr>
+      <w:tblGrid>
+        <w:gridCol w:w="9016"/>
+      </w:tblGrid>
+      <w:tr>
+        <w:tc>
+          <w:tcPr>
+            <w:tcW w:w="9016" w:type="dxa"/>
+          </w:tcPr>
+          <w:p>
+            <w:r>
+              <w:rPr>
+                <w:noProof/>
+              </w:rPr>
+              <w:drawing>
+                <wp:inline distT="0" distB="0" distL="0" distR="0" wp14:anchorId="57456254" wp14:editId="48D10603">
+                  <wp:extent cx="5573395" cy="1480854"/>
+                  <wp:effectExtent l="0" t="0" r="1905" b="5080"/>
+                  <wp:docPr id="1703098266" name="Picture 25"/>
+                  <wp:cNvGraphicFramePr>
+                    <a:graphicFrameLocks xmlns:a="http://schemas.openxmlformats.org/drawingml/2006/main" noChangeAspect="1"/>
+                  </wp:cNvGraphicFramePr>
+                  <a:graphic xmlns:a="http://schemas.openxmlformats.org/drawingml/2006/main">
+                    <a:graphicData uri="http://schemas.openxmlformats.org/drawingml/2006/picture">
+                      <pic:pic xmlns:pic="http://schemas.openxmlformats.org/drawingml/2006/picture">
+                        <pic:nvPicPr>
+                          <pic:cNvPr id="1703098266" name="Picture 1703098266"/>
+                          <pic:cNvPicPr/>
+                        </pic:nvPicPr>
+                        <pic:blipFill>
+                          <a:blip r:embed="rId20">
+                            <a:extLst>
+                              <a:ext uri="{28A0092B-C50C-407E-A947-70E740481C1C}">
+                                <a14:useLocalDpi xmlns:a14="http://schemas.microsoft.com/office/drawing/2010/main" val="0"/>
+                              </a:ext>
+                            </a:extLst>
+                          </a:blip>
+                          <a:stretch>
+                            <a:fillRect/>
+                          </a:stretch>
+                        </pic:blipFill>
+                        <pic:spPr>
+                          <a:xfrm>
+                            <a:off x="0" y="0"/>
+                            <a:ext cx="5648888" cy="1500912"/>
+                          </a:xfrm>
+                          <a:prstGeom prst="rect">
+                            <a:avLst/>
+                          </a:prstGeom>
+                        </pic:spPr>
+                      </pic:pic>
+                    </a:graphicData>
+                  </a:graphic>
+                </wp:inline>
+              </w:drawing>
+            </w:r>
+          </w:p>
+        </w:tc>
+      </w:tr>
+      <w:tr>
+        <w:tc>
+          <w:tcPr>
+            <w:tcW w:w="9016" w:type="dxa"/>
+          </w:tcPr>
+          <w:p>
+            <w:pPr>
+              <w:jc w:val="center"/>
+            </w:pPr>
+            <w:r>
+              <w:rPr>
+                <w:color w:val="808080" w:themeColor="background1" w:themeShade="80"/>
+                <w:sz w:val="22"/>
+                <w:szCs w:val="22"/>
+              </w:rPr>
+              <w:t xml:space="preserve">Extract from </w:t>
+            </w:r>
+            <w:r>
+              <w:rPr>
+                <w:color w:val="808080" w:themeColor="background1" w:themeShade="80"/>
+                <w:sz w:val="22"/>
+                <w:szCs w:val="22"/>
+              </w:rPr>
+              <w:t>“</w:t>
+            </w:r>
+            <w:r>
+              <w:rPr>
+                <w:color w:val="808080" w:themeColor="background1" w:themeShade="80"/>
+                <w:sz w:val="22"/>
+                <w:szCs w:val="22"/>
+              </w:rPr>
+              <w:t>src/main/java/com/studentjobportal/</w:t>
+            </w:r>
+            <w:r>
+              <w:rPr>
+                <w:color w:val="808080" w:themeColor="background1" w:themeShade="80"/>
+                <w:sz w:val="22"/>
+                <w:szCs w:val="22"/>
+              </w:rPr>
+              <w:t>repository</w:t>
+            </w:r>
+            <w:r>
+              <w:rPr>
+                <w:color w:val="808080" w:themeColor="background1" w:themeShade="80"/>
+                <w:sz w:val="22"/>
+                <w:szCs w:val="22"/>
+              </w:rPr>
+              <w:t>/</w:t>
+            </w:r>
+            <w:r>
+              <w:rPr>
+                <w:color w:val="808080" w:themeColor="background1" w:themeShade="80"/>
+                <w:sz w:val="22"/>
+                <w:szCs w:val="22"/>
+              </w:rPr>
+              <w:t>ApplicationRepository</w:t>
+            </w:r>
+            <w:r>
+              <w:rPr>
+                <w:color w:val="808080" w:themeColor="background1" w:themeShade="80"/>
+                <w:sz w:val="22"/>
+                <w:szCs w:val="22"/>
+              </w:rPr>
+              <w:t>.java”</w:t>
+            </w:r>
+            <w:r>
+              <w:rPr>
+                <w:color w:val="808080" w:themeColor="background1" w:themeShade="80"/>
+                <w:sz w:val="22"/>
+                <w:szCs w:val="22"/>
+              </w:rPr>
+              <w:t xml:space="preserve"> on the 13</w:t>
+            </w:r>
+            <w:r>
+              <w:rPr>
+                <w:color w:val="808080" w:themeColor="background1" w:themeShade="80"/>
+                <w:sz w:val="22"/>
+                <w:szCs w:val="22"/>
+                <w:vertAlign w:val="superscript"/>
+              </w:rPr>
+              <w:t>th</w:t>
+            </w:r>
+            <w:r>
+              <w:rPr>
+                <w:color w:val="808080" w:themeColor="background1" w:themeShade="80"/>
+                <w:sz w:val="22"/>
+                <w:szCs w:val="22"/>
+              </w:rPr>
+              <w:t xml:space="preserve"> Aug 2026.</w:t>
+            </w:r>
+          </w:p>
+        </w:tc>
+      </w:tr>
+    </w:tbl>
+    <w:p/>
+    <w:p>
+      <w:r>
+        <w:t>The above example, applies the repository pattern, which hides the “LinkedHashMap” used by the in-memory implementation. This allows for a later upgrade to a full database-backed system</w:t>
+      </w:r>
+      <w:r>
+        <w:t xml:space="preserve"> all whilst not affecting any of the service layer because they continue to depend on the same interface.</w:t>
+      </w:r>
+    </w:p>
+    <w:p/>
+    <w:p>
+      <w:r>
+        <w:t>next page &gt;&gt;</w:t>
+      </w:r>
+      <w:r>
+        <w:br w:type="page"/>
+      </w:r>
+    </w:p>
+    <w:p/>
+    <w:tbl>
+      <w:tblPr>
+        <w:tblStyle w:val="TableGrid"/>
+        <w:tblW w:w="0" w:type="auto"/>
+        <w:tblBorders>
+          <w:top w:val="none" w:sz="0" w:space="0" w:color="auto"/>
+          <w:left w:val="none" w:sz="0" w:space="0" w:color="auto"/>
+          <w:bottom w:val="none" w:sz="0" w:space="0" w:color="auto"/>
+          <w:right w:val="none" w:sz="0" w:space="0" w:color="auto"/>
+          <w:insideH w:val="none" w:sz="0" w:space="0" w:color="auto"/>
+          <w:insideV w:val="none" w:sz="0" w:space="0" w:color="auto"/>
+        </w:tblBorders>
+        <w:tblLook w:val="04A0" w:firstRow="1" w:lastRow="0" w:firstColumn="1" w:lastColumn="0" w:noHBand="0" w:noVBand="1"/>
+      </w:tblPr>
+      <w:tblGrid>
+        <w:gridCol w:w="4508"/>
+        <w:gridCol w:w="4508"/>
+      </w:tblGrid>
+      <w:tr>
+        <w:tc>
+          <w:tcPr>
+            <w:tcW w:w="4508" w:type="dxa"/>
+          </w:tcPr>
+          <w:p>
+            <w:r>
+              <w:rPr>
+                <w:noProof/>
+              </w:rPr>
+              <w:drawing>
+                <wp:inline distT="0" distB="0" distL="0" distR="0" wp14:anchorId="3EA7965A" wp14:editId="0DFFFA83">
+                  <wp:extent cx="2720385" cy="2115185"/>
+                  <wp:effectExtent l="0" t="0" r="0" b="5715"/>
+                  <wp:docPr id="1866304779" name="Picture 26"/>
+                  <wp:cNvGraphicFramePr>
+                    <a:graphicFrameLocks xmlns:a="http://schemas.openxmlformats.org/drawingml/2006/main" noChangeAspect="1"/>
+                  </wp:cNvGraphicFramePr>
+                  <a:graphic xmlns:a="http://schemas.openxmlformats.org/drawingml/2006/main">
+                    <a:graphicData uri="http://schemas.openxmlformats.org/drawingml/2006/picture">
+                      <pic:pic xmlns:pic="http://schemas.openxmlformats.org/drawingml/2006/picture">
+                        <pic:nvPicPr>
+                          <pic:cNvPr id="1866304779" name="Picture 1866304779"/>
+                          <pic:cNvPicPr/>
+                        </pic:nvPicPr>
+                        <pic:blipFill>
+                          <a:blip r:embed="rId21" cstate="print">
+                            <a:extLst>
+                              <a:ext uri="{28A0092B-C50C-407E-A947-70E740481C1C}">
+                                <a14:useLocalDpi xmlns:a14="http://schemas.microsoft.com/office/drawing/2010/main" val="0"/>
+                              </a:ext>
+                            </a:extLst>
+                          </a:blip>
+                          <a:stretch>
+                            <a:fillRect/>
+                          </a:stretch>
+                        </pic:blipFill>
+                        <pic:spPr>
+                          <a:xfrm>
+                            <a:off x="0" y="0"/>
+                            <a:ext cx="2872592" cy="2233530"/>
+                          </a:xfrm>
+                          <a:prstGeom prst="rect">
+                            <a:avLst/>
+                          </a:prstGeom>
+                        </pic:spPr>
+                      </pic:pic>
+                    </a:graphicData>
+                  </a:graphic>
+                </wp:inline>
+              </w:drawing>
+            </w:r>
+          </w:p>
+        </w:tc>
+        <w:tc>
+          <w:tcPr>
+            <w:tcW w:w="4508" w:type="dxa"/>
+          </w:tcPr>
+          <w:p>
+            <w:r>
+              <w:t>Thi</w:t>
+            </w:r>
+            <w:r>
+              <w:t>s</w:t>
+            </w:r>
+            <w:r>
+              <w:t xml:space="preserve"> brings me swiftly to the “Single Responsibility Principle”. The provided source code</w:t>
+            </w:r>
+            <w:r>
+              <w:t xml:space="preserve"> had all of the program in a single file: “StudentJobPortal.java”, however, the new, updated system divides these responsibilities between several focussed classes. </w:t>
+            </w:r>
+          </w:p>
+          <w:p>
+            <w:pPr>
+              <w:pStyle w:val="ListParagraph"/>
+              <w:numPr>
+                <w:ilvl w:val="0"/>
+                <w:numId w:val="5"/>
+              </w:numPr>
+            </w:pPr>
+            <w:proofErr w:type="spellStart"/>
+            <w:r>
+              <w:t>JobPortalCli</w:t>
+            </w:r>
+            <w:proofErr w:type="spellEnd"/>
+          </w:p>
+          <w:p>
+            <w:pPr>
+              <w:pStyle w:val="ListParagraph"/>
+              <w:numPr>
+                <w:ilvl w:val="0"/>
+                <w:numId w:val="5"/>
+              </w:numPr>
+            </w:pPr>
+            <w:r>
+              <w:t>JobService</w:t>
+            </w:r>
+          </w:p>
+          <w:p>
+            <w:pPr>
+              <w:pStyle w:val="ListParagraph"/>
+              <w:numPr>
+                <w:ilvl w:val="0"/>
+                <w:numId w:val="5"/>
+              </w:numPr>
+            </w:pPr>
+            <w:proofErr w:type="spellStart"/>
+            <w:r>
+              <w:t>SavedJobService</w:t>
+            </w:r>
+            <w:proofErr w:type="spellEnd"/>
+          </w:p>
+          <w:p>
+            <w:pPr>
+              <w:pStyle w:val="ListParagraph"/>
+              <w:numPr>
+                <w:ilvl w:val="0"/>
+                <w:numId w:val="5"/>
+              </w:numPr>
+            </w:pPr>
+            <w:proofErr w:type="spellStart"/>
+            <w:r>
+              <w:t>ApplicationService</w:t>
+            </w:r>
+            <w:proofErr w:type="spellEnd"/>
+            <w:r>
+              <w:t xml:space="preserve"> &amp;</w:t>
+            </w:r>
+          </w:p>
+          <w:p>
+            <w:pPr>
+              <w:pStyle w:val="ListParagraph"/>
+              <w:numPr>
+                <w:ilvl w:val="0"/>
+                <w:numId w:val="5"/>
+              </w:numPr>
+            </w:pPr>
+            <w:proofErr w:type="spellStart"/>
+            <w:r>
+              <w:t>SampleJobDataSeeder</w:t>
+            </w:r>
+            <w:proofErr w:type="spellEnd"/>
+          </w:p>
+        </w:tc>
+      </w:tr>
+      <w:tr>
+        <w:tc>
+          <w:tcPr>
+            <w:tcW w:w="4508" w:type="dxa"/>
+          </w:tcPr>
+          <w:p>
+            <w:pPr>
+              <w:jc w:val="center"/>
+            </w:pPr>
+            <w:r>
+              <w:rPr>
+                <w:color w:val="808080" w:themeColor="background1" w:themeShade="80"/>
+                <w:sz w:val="21"/>
+                <w:szCs w:val="21"/>
+              </w:rPr>
+              <w:t>Extract from new “StudentJobPortal.java” on the 13</w:t>
+            </w:r>
+            <w:r>
+              <w:rPr>
+                <w:color w:val="808080" w:themeColor="background1" w:themeShade="80"/>
+                <w:sz w:val="21"/>
+                <w:szCs w:val="21"/>
+                <w:vertAlign w:val="superscript"/>
+              </w:rPr>
+              <w:t>th</w:t>
+            </w:r>
+            <w:r>
+              <w:rPr>
+                <w:color w:val="808080" w:themeColor="background1" w:themeShade="80"/>
+                <w:sz w:val="21"/>
+                <w:szCs w:val="21"/>
+              </w:rPr>
+              <w:t xml:space="preserve"> Aug 2026</w:t>
+            </w:r>
+          </w:p>
+        </w:tc>
+        <w:tc>
+          <w:tcPr>
+            <w:tcW w:w="4508" w:type="dxa"/>
+          </w:tcPr>
           <w:p/>
         </w:tc>
       </w:tr>
     </w:tbl>
+    <w:p/>
+    <w:p>
+      <w:r>
+        <w:t>This means that the new refactored “main()” is largely empty, and only contains the composition root.</w:t>
+      </w:r>
+    </w:p>
+    <w:p/>
+    <w:p>
+      <w:r>
+        <w:t>To summarise</w:t>
+      </w:r>
+      <w:r>
+        <w:t>, t</w:t>
+      </w:r>
+      <w:r>
+        <w:t>he original version of the StudentJobPortal technically used a java class but it behaved as a procedural, single file program with shared mutable states, parallel connections</w:t>
+      </w:r>
+      <w:r>
+        <w:t xml:space="preserve">, </w:t>
+      </w:r>
+      <w:r>
+        <w:t>hard coded algorithms</w:t>
+      </w:r>
+      <w:r>
+        <w:t xml:space="preserve"> and tightly coupled input &amp; output. The revised program has a much stronger object-oriented design with Encapsulation to protect domain states through the use of private immutable fields; Abstraction is available through repository and strategy interfaces; and Polymorphism that allows for multiple repository and search implementations to be used. </w:t>
+      </w:r>
+    </w:p>
+    <w:p>
+      <w:r>
+        <w:t xml:space="preserve">The inclusion of immutability, value objects, defensive collections and composition over inheritance further improve the systems testability, maintainability and extendibility. </w:t>
+      </w:r>
+    </w:p>
+    <w:p>
+      <w:r>
+        <w:t xml:space="preserve">The Gang of Four (G.o.F.) </w:t>
+      </w:r>
+      <w:r>
+        <w:t xml:space="preserve">Builder and Strategy patterns have been implemented and the “CombinedKeywordSearchStrategy” showcases a composite style structural design. Additional Repository and Service Layer patterns separate persistence and business logic </w:t>
+      </w:r>
+      <w:r>
+        <w:t>even though they are</w:t>
+      </w:r>
+      <w:r>
+        <w:t>n’</w:t>
+      </w:r>
+      <w:r>
+        <w:t>t part of the original G</w:t>
+      </w:r>
+      <w:r>
+        <w:t xml:space="preserve">ang </w:t>
+      </w:r>
+      <w:r>
+        <w:t>o</w:t>
+      </w:r>
+      <w:r>
+        <w:t xml:space="preserve">f </w:t>
+      </w:r>
+      <w:r>
+        <w:t>F</w:t>
+      </w:r>
+      <w:r>
+        <w:t>our (G.o.F.)</w:t>
+      </w:r>
+      <w:r>
+        <w:t xml:space="preserve"> catalogue. Th</w:t>
+      </w:r>
+      <w:r>
+        <w:t xml:space="preserve">ey’re </w:t>
+      </w:r>
+      <w:r>
+        <w:t xml:space="preserve">appropriate because they isolate areas of the system that are likely to vary independently, </w:t>
+      </w:r>
+      <w:r>
+        <w:t>which results in</w:t>
+      </w:r>
+      <w:r>
+        <w:t xml:space="preserve"> future changes such as alternative search algorithms, database persistence or additional job fields</w:t>
+      </w:r>
+      <w:r>
+        <w:t xml:space="preserve">, </w:t>
+      </w:r>
+      <w:r>
+        <w:t>be</w:t>
+      </w:r>
+      <w:r>
+        <w:t>ing</w:t>
+      </w:r>
+      <w:r>
+        <w:t xml:space="preserve"> introduced with significantly less modification to existing code.  </w:t>
+      </w:r>
+    </w:p>
+    <w:p/>
     <w:p/>
     <w:p>
       <w:pPr>
@@ -3348,6 +4732,119 @@
       </w:pPr>
     </w:lvl>
   </w:abstractNum>
+  <w:abstractNum w:abstractNumId="4" w15:restartNumberingAfterBreak="0">
+    <w:nsid w:val="7FCB6BD1"/>
+    <w:multiLevelType w:val="hybridMultilevel"/>
+    <w:tmpl w:val="EF0C2236"/>
+    <w:lvl w:ilvl="0" w:tplc="72744308">
+      <w:start w:val="1"/>
+      <w:numFmt w:val="bullet"/>
+      <w:lvlText w:val="-"/>
+      <w:lvlJc w:val="left"/>
+      <w:pPr>
+        <w:ind w:left="720" w:hanging="360"/>
+      </w:pPr>
+      <w:rPr>
+        <w:rFonts w:ascii="Aptos" w:eastAsiaTheme="minorHAnsi" w:hAnsi="Aptos" w:cstheme="minorBidi" w:hint="default"/>
+      </w:rPr>
+    </w:lvl>
+    <w:lvl w:ilvl="1" w:tplc="08090003" w:tentative="1">
+      <w:start w:val="1"/>
+      <w:numFmt w:val="bullet"/>
+      <w:lvlText w:val="o"/>
+      <w:lvlJc w:val="left"/>
+      <w:pPr>
+        <w:ind w:left="1440" w:hanging="360"/>
+      </w:pPr>
+      <w:rPr>
+        <w:rFonts w:ascii="Courier New" w:hAnsi="Courier New" w:hint="default"/>
+      </w:rPr>
+    </w:lvl>
+    <w:lvl w:ilvl="2" w:tplc="08090005" w:tentative="1">
+      <w:start w:val="1"/>
+      <w:numFmt w:val="bullet"/>
+      <w:lvlText w:val=""/>
+      <w:lvlJc w:val="left"/>
+      <w:pPr>
+        <w:ind w:left="2160" w:hanging="360"/>
+      </w:pPr>
+      <w:rPr>
+        <w:rFonts w:ascii="Wingdings" w:hAnsi="Wingdings" w:hint="default"/>
+      </w:rPr>
+    </w:lvl>
+    <w:lvl w:ilvl="3" w:tplc="08090001" w:tentative="1">
+      <w:start w:val="1"/>
+      <w:numFmt w:val="bullet"/>
+      <w:lvlText w:val=""/>
+      <w:lvlJc w:val="left"/>
+      <w:pPr>
+        <w:ind w:left="2880" w:hanging="360"/>
+      </w:pPr>
+      <w:rPr>
+        <w:rFonts w:ascii="Symbol" w:hAnsi="Symbol" w:hint="default"/>
+      </w:rPr>
+    </w:lvl>
+    <w:lvl w:ilvl="4" w:tplc="08090003" w:tentative="1">
+      <w:start w:val="1"/>
+      <w:numFmt w:val="bullet"/>
+      <w:lvlText w:val="o"/>
+      <w:lvlJc w:val="left"/>
+      <w:pPr>
+        <w:ind w:left="3600" w:hanging="360"/>
+      </w:pPr>
+      <w:rPr>
+        <w:rFonts w:ascii="Courier New" w:hAnsi="Courier New" w:hint="default"/>
+      </w:rPr>
+    </w:lvl>
+    <w:lvl w:ilvl="5" w:tplc="08090005" w:tentative="1">
+      <w:start w:val="1"/>
+      <w:numFmt w:val="bullet"/>
+      <w:lvlText w:val=""/>
+      <w:lvlJc w:val="left"/>
+      <w:pPr>
+        <w:ind w:left="4320" w:hanging="360"/>
+      </w:pPr>
+      <w:rPr>
+        <w:rFonts w:ascii="Wingdings" w:hAnsi="Wingdings" w:hint="default"/>
+      </w:rPr>
+    </w:lvl>
+    <w:lvl w:ilvl="6" w:tplc="08090001" w:tentative="1">
+      <w:start w:val="1"/>
+      <w:numFmt w:val="bullet"/>
+      <w:lvlText w:val=""/>
+      <w:lvlJc w:val="left"/>
+      <w:pPr>
+        <w:ind w:left="5040" w:hanging="360"/>
+      </w:pPr>
+      <w:rPr>
+        <w:rFonts w:ascii="Symbol" w:hAnsi="Symbol" w:hint="default"/>
+      </w:rPr>
+    </w:lvl>
+    <w:lvl w:ilvl="7" w:tplc="08090003" w:tentative="1">
+      <w:start w:val="1"/>
+      <w:numFmt w:val="bullet"/>
+      <w:lvlText w:val="o"/>
+      <w:lvlJc w:val="left"/>
+      <w:pPr>
+        <w:ind w:left="5760" w:hanging="360"/>
+      </w:pPr>
+      <w:rPr>
+        <w:rFonts w:ascii="Courier New" w:hAnsi="Courier New" w:hint="default"/>
+      </w:rPr>
+    </w:lvl>
+    <w:lvl w:ilvl="8" w:tplc="08090005" w:tentative="1">
+      <w:start w:val="1"/>
+      <w:numFmt w:val="bullet"/>
+      <w:lvlText w:val=""/>
+      <w:lvlJc w:val="left"/>
+      <w:pPr>
+        <w:ind w:left="6480" w:hanging="360"/>
+      </w:pPr>
+      <w:rPr>
+        <w:rFonts w:ascii="Wingdings" w:hAnsi="Wingdings" w:hint="default"/>
+      </w:rPr>
+    </w:lvl>
+  </w:abstractNum>
   <w:num w:numId="1" w16cid:durableId="1063258086">
     <w:abstractNumId w:val="0"/>
     <w:lvlOverride w:ilvl="0">
@@ -3362,6 +4859,9 @@
   </w:num>
   <w:num w:numId="4" w16cid:durableId="387264634">
     <w:abstractNumId w:val="2"/>
+  </w:num>
+  <w:num w:numId="5" w16cid:durableId="277877725">
+    <w:abstractNumId w:val="4"/>
   </w:num>
 </w:numbering>
 </file>

</xml_diff>

<commit_message>
Started adding importance to Part 1, and double checked spelling with family member.
</commit_message>
<xml_diff>
--- a/CM2307_CW_StudentNumber.docx.docx
+++ b/CM2307_CW_StudentNumber.docx.docx
@@ -1275,7 +1275,23 @@
     </w:tbl>
     <w:p/>
     <w:p>
-      <w:r>
+      <w:pPr>
+        <w:rPr>
+          <w:i/>
+          <w:iCs/>
+          <w:color w:val="808080" w:themeColor="background1" w:themeShade="80"/>
+          <w:sz w:val="21"/>
+          <w:szCs w:val="21"/>
+        </w:rPr>
+      </w:pPr>
+      <w:r>
+        <w:rPr>
+          <w:i/>
+          <w:iCs/>
+          <w:color w:val="808080" w:themeColor="background1" w:themeShade="80"/>
+          <w:sz w:val="21"/>
+          <w:szCs w:val="21"/>
+        </w:rPr>
         <w:t>next page &gt;&gt;</w:t>
       </w:r>
     </w:p>
@@ -1559,12 +1575,25 @@
       <w:pPr>
         <w:rPr>
           <w:rFonts w:hint="eastAsia"/>
+          <w:i/>
+          <w:iCs/>
         </w:rPr>
       </w:pPr>
       <w:r>
+        <w:rPr>
+          <w:i/>
+          <w:iCs/>
+          <w:color w:val="808080" w:themeColor="background1" w:themeShade="80"/>
+          <w:sz w:val="21"/>
+          <w:szCs w:val="21"/>
+        </w:rPr>
         <w:t>next page &gt;&gt;</w:t>
       </w:r>
       <w:r>
+        <w:rPr>
+          <w:i/>
+          <w:iCs/>
+        </w:rPr>
         <w:br w:type="page"/>
       </w:r>
     </w:p>
@@ -1585,15 +1614,27 @@
     <w:p>
       <w:pPr>
         <w:pStyle w:val="Heading2"/>
+        <w:rPr>
+          <w:color w:val="2F6BFF"/>
+        </w:rPr>
       </w:pPr>
       <w:r>
+        <w:rPr>
+          <w:color w:val="2F6BFF"/>
+        </w:rPr>
         <w:t>Part 1</w:t>
       </w:r>
       <w:r>
+        <w:rPr>
+          <w:color w:val="2F6BFF"/>
+        </w:rPr>
         <w:t>:</w:t>
       </w:r>
       <w:r>
-        <w:t xml:space="preserve"> (max of 1500 words)</w:t>
+        <w:rPr>
+          <w:color w:val="2F6BFF"/>
+        </w:rPr>
+        <w:t xml:space="preserve"> </w:t>
       </w:r>
     </w:p>
     <w:p>
@@ -1607,7 +1648,127 @@
         <w:t xml:space="preserve"> use object oriented (O.O.)</w:t>
       </w:r>
       <w:r>
-        <w:t xml:space="preserve"> principles to render the program more maintain-able, extend-able and test-able. It does this thanks to encapsulation, abstraction and polymorphism supported by several design patterns like immutability, value objects (UUIDs), composition, dependency injection and many more. </w:t>
+        <w:t xml:space="preserve"> principles to render the program </w:t>
+      </w:r>
+      <w:r>
+        <w:rPr>
+          <w:b/>
+          <w:bCs/>
+        </w:rPr>
+        <w:t>more maintainable</w:t>
+      </w:r>
+      <w:r>
+        <w:t xml:space="preserve">, </w:t>
+      </w:r>
+      <w:r>
+        <w:rPr>
+          <w:b/>
+          <w:bCs/>
+        </w:rPr>
+        <w:t>extendable</w:t>
+      </w:r>
+      <w:r>
+        <w:t xml:space="preserve"> and </w:t>
+      </w:r>
+      <w:r>
+        <w:rPr>
+          <w:b/>
+          <w:bCs/>
+        </w:rPr>
+        <w:t>testable</w:t>
+      </w:r>
+      <w:r>
+        <w:t xml:space="preserve">. It does this thanks to </w:t>
+      </w:r>
+      <w:r>
+        <w:rPr>
+          <w:b/>
+          <w:bCs/>
+        </w:rPr>
+        <w:t>encapsulation</w:t>
+      </w:r>
+      <w:r>
+        <w:t xml:space="preserve">, </w:t>
+      </w:r>
+      <w:r>
+        <w:rPr>
+          <w:b/>
+          <w:bCs/>
+        </w:rPr>
+        <w:t>abstraction</w:t>
+      </w:r>
+      <w:r>
+        <w:t xml:space="preserve"> and </w:t>
+      </w:r>
+      <w:r>
+        <w:rPr>
+          <w:b/>
+          <w:bCs/>
+        </w:rPr>
+        <w:t>polymorphism</w:t>
+      </w:r>
+      <w:r>
+        <w:t xml:space="preserve"> supported by several design patterns like </w:t>
+      </w:r>
+      <w:r>
+        <w:rPr>
+          <w:b/>
+          <w:bCs/>
+        </w:rPr>
+        <w:t>immutability</w:t>
+      </w:r>
+      <w:r>
+        <w:t xml:space="preserve">, </w:t>
+      </w:r>
+      <w:r>
+        <w:rPr>
+          <w:b/>
+          <w:bCs/>
+        </w:rPr>
+        <w:t>value objects</w:t>
+      </w:r>
+      <w:r>
+        <w:t xml:space="preserve"> (</w:t>
+      </w:r>
+      <w:r>
+        <w:rPr>
+          <w:i/>
+          <w:iCs/>
+        </w:rPr>
+        <w:t>UUIDs</w:t>
+      </w:r>
+      <w:r>
+        <w:t xml:space="preserve">), </w:t>
+      </w:r>
+      <w:r>
+        <w:rPr>
+          <w:b/>
+          <w:bCs/>
+        </w:rPr>
+        <w:t>composition</w:t>
+      </w:r>
+      <w:r>
+        <w:t xml:space="preserve">, </w:t>
+      </w:r>
+      <w:r>
+        <w:rPr>
+          <w:b/>
+          <w:bCs/>
+        </w:rPr>
+        <w:t>dependency injection</w:t>
+      </w:r>
+      <w:r>
+        <w:t xml:space="preserve"> and </w:t>
+      </w:r>
+      <w:r>
+        <w:rPr>
+          <w:b/>
+          <w:bCs/>
+        </w:rPr>
+        <w:t>many more</w:t>
+      </w:r>
+      <w:r>
+        <w:t xml:space="preserve">. </w:t>
       </w:r>
     </w:p>
     <w:p/>
@@ -1616,21 +1777,139 @@
         <w:jc w:val="both"/>
       </w:pPr>
       <w:r>
-        <w:t xml:space="preserve">In the original application (seen </w:t>
-      </w:r>
-      <w:r>
+        <w:t>In the original application (</w:t>
+      </w:r>
+      <w:r>
+        <w:rPr>
+          <w:i/>
+          <w:iCs/>
+        </w:rPr>
+        <w:t xml:space="preserve">seen </w:t>
+      </w:r>
+      <w:r>
+        <w:rPr>
+          <w:i/>
+          <w:iCs/>
+        </w:rPr>
         <w:t>bellow</w:t>
       </w:r>
       <w:r>
-        <w:t xml:space="preserve"> in this instance), the entire system was comprised in one file: “StudentJobPortal.java” inside its </w:t>
+        <w:rPr>
+          <w:i/>
+          <w:iCs/>
+        </w:rPr>
+        <w:t xml:space="preserve"> in this instance</w:t>
+      </w:r>
+      <w:r>
+        <w:t xml:space="preserve">), the </w:t>
+      </w:r>
+      <w:r>
+        <w:rPr>
+          <w:b/>
+          <w:bCs/>
+        </w:rPr>
+        <w:t>entire system</w:t>
+      </w:r>
+      <w:r>
+        <w:t xml:space="preserve"> was comprised in </w:t>
+      </w:r>
+      <w:r>
+        <w:rPr>
+          <w:b/>
+          <w:bCs/>
+        </w:rPr>
+        <w:t>one file</w:t>
+      </w:r>
+      <w:r>
+        <w:t>: “</w:t>
+      </w:r>
+      <w:r>
+        <w:rPr>
+          <w:b/>
+          <w:bCs/>
+          <w:i/>
+          <w:iCs/>
+        </w:rPr>
+        <w:t>StudentJobPortal.java</w:t>
+      </w:r>
+      <w:r>
+        <w:t xml:space="preserve">” </w:t>
+      </w:r>
+      <w:r>
+        <w:rPr>
+          <w:b/>
+          <w:bCs/>
+        </w:rPr>
+        <w:t xml:space="preserve">inside its </w:t>
       </w:r>
       <w:proofErr w:type="gramStart"/>
       <w:r>
+        <w:rPr>
+          <w:b/>
+          <w:bCs/>
+        </w:rPr>
         <w:t>main(</w:t>
       </w:r>
       <w:proofErr w:type="gramEnd"/>
       <w:r>
-        <w:t xml:space="preserve">) method. Generally, having more than 1 responsibility inside a file makes things complicated, maintenance heavy, hard to test and very difficult to improve upon in future iterations. </w:t>
+        <w:rPr>
+          <w:b/>
+          <w:bCs/>
+        </w:rPr>
+        <w:t>)</w:t>
+      </w:r>
+      <w:r>
+        <w:t xml:space="preserve"> method. Generally, </w:t>
+      </w:r>
+      <w:r>
+        <w:rPr>
+          <w:b/>
+          <w:bCs/>
+        </w:rPr>
+        <w:t>having more than 1 responsibility</w:t>
+      </w:r>
+      <w:r>
+        <w:t xml:space="preserve"> inside a file makes things </w:t>
+      </w:r>
+      <w:r>
+        <w:rPr>
+          <w:b/>
+          <w:bCs/>
+        </w:rPr>
+        <w:t>complicated</w:t>
+      </w:r>
+      <w:r>
+        <w:t xml:space="preserve">, </w:t>
+      </w:r>
+      <w:r>
+        <w:rPr>
+          <w:b/>
+          <w:bCs/>
+        </w:rPr>
+        <w:t>maintenance heavy</w:t>
+      </w:r>
+      <w:r>
+        <w:t xml:space="preserve">, </w:t>
+      </w:r>
+      <w:r>
+        <w:rPr>
+          <w:b/>
+          <w:bCs/>
+        </w:rPr>
+        <w:t>hard to test</w:t>
+      </w:r>
+      <w:r>
+        <w:t xml:space="preserve"> and </w:t>
+      </w:r>
+      <w:r>
+        <w:rPr>
+          <w:b/>
+          <w:bCs/>
+        </w:rPr>
+        <w:t>very difficult to improve</w:t>
+      </w:r>
+      <w:r>
+        <w:t xml:space="preserve"> upon in future iterations. </w:t>
       </w:r>
     </w:p>
     <w:p/>
@@ -1848,19 +2127,161 @@
           </w:tcPr>
           <w:p>
             <w:r>
-              <w:t>On top of that, job information is represented in the form of 5 separate mutable static lists, which is generally not good practice, because the program is expecting very specific information, and if that information isn’t filled out as it’s expected (for some reason) this could cause errors, or worst-case scenario, crashes further down the line.</w:t>
+              <w:t xml:space="preserve">On top of that, job information is represented in the form of </w:t>
+            </w:r>
+            <w:r>
+              <w:rPr>
+                <w:b/>
+                <w:bCs/>
+              </w:rPr>
+              <w:t>5 separate mutable static lists</w:t>
+            </w:r>
+            <w:r>
+              <w:t xml:space="preserve">, which is generally </w:t>
+            </w:r>
+            <w:r>
+              <w:rPr>
+                <w:b/>
+                <w:bCs/>
+              </w:rPr>
+              <w:t>not good practice</w:t>
+            </w:r>
+            <w:r>
+              <w:t xml:space="preserve">, because the </w:t>
+            </w:r>
+            <w:r>
+              <w:rPr>
+                <w:b/>
+                <w:bCs/>
+              </w:rPr>
+              <w:t>program is expecting very specific information</w:t>
+            </w:r>
+            <w:r>
+              <w:t xml:space="preserve">, and if that </w:t>
+            </w:r>
+            <w:r>
+              <w:rPr>
+                <w:b/>
+                <w:bCs/>
+              </w:rPr>
+              <w:t>information isn’t filled out as it’s expected</w:t>
+            </w:r>
+            <w:r>
+              <w:t xml:space="preserve"> (</w:t>
+            </w:r>
+            <w:r>
+              <w:rPr>
+                <w:i/>
+                <w:iCs/>
+              </w:rPr>
+              <w:t>for some reason</w:t>
+            </w:r>
+            <w:r>
+              <w:t xml:space="preserve">) this could </w:t>
+            </w:r>
+            <w:r>
+              <w:rPr>
+                <w:b/>
+                <w:bCs/>
+              </w:rPr>
+              <w:t>cause errors</w:t>
+            </w:r>
+            <w:r>
+              <w:t xml:space="preserve">, or worst-case scenario, </w:t>
+            </w:r>
+            <w:r>
+              <w:rPr>
+                <w:b/>
+                <w:bCs/>
+              </w:rPr>
+              <w:t>crashes</w:t>
+            </w:r>
+            <w:r>
+              <w:t xml:space="preserve"> further down the line.</w:t>
             </w:r>
           </w:p>
           <w:p/>
           <w:p/>
           <w:p>
             <w:r>
-              <w:t xml:space="preserve">This is known as “breaking encapsulation”, because there is no “Job” object responsible for protecting and validating the state belonging to a single job; instead, a job only exists through matching indexes across several different lists. </w:t>
+              <w:t>This is known as “</w:t>
+            </w:r>
+            <w:r>
+              <w:rPr>
+                <w:b/>
+                <w:bCs/>
+                <w:i/>
+                <w:iCs/>
+              </w:rPr>
+              <w:t>breaking encapsulation</w:t>
+            </w:r>
+            <w:r>
+              <w:t xml:space="preserve">”, because there is </w:t>
+            </w:r>
+            <w:r>
+              <w:rPr>
+                <w:b/>
+                <w:bCs/>
+              </w:rPr>
+              <w:t>no “Job” object</w:t>
+            </w:r>
+            <w:r>
+              <w:t xml:space="preserve"> responsible for </w:t>
+            </w:r>
+            <w:r>
+              <w:rPr>
+                <w:b/>
+                <w:bCs/>
+              </w:rPr>
+              <w:t>protecting and validating</w:t>
+            </w:r>
+            <w:r>
+              <w:t xml:space="preserve"> the state belonging to a single job; instead, a job only exists through </w:t>
+            </w:r>
+            <w:r>
+              <w:rPr>
+                <w:b/>
+                <w:bCs/>
+              </w:rPr>
+              <w:t>matching indexes across several different lists</w:t>
+            </w:r>
+            <w:r>
+              <w:t xml:space="preserve">. </w:t>
             </w:r>
           </w:p>
           <w:p>
             <w:r>
-              <w:t>For example, in this instance: “jobTitles.get(i)”, “companies.get(i)”, “jobTypes.get(i)” etc…</w:t>
+              <w:t>For example, in this instance: “</w:t>
+            </w:r>
+            <w:r>
+              <w:rPr>
+                <w:i/>
+                <w:iCs/>
+              </w:rPr>
+              <w:t>jobTitles.get(i)</w:t>
+            </w:r>
+            <w:r>
+              <w:t>”, “</w:t>
+            </w:r>
+            <w:r>
+              <w:rPr>
+                <w:i/>
+                <w:iCs/>
+              </w:rPr>
+              <w:t>companies.get(i)</w:t>
+            </w:r>
+            <w:r>
+              <w:t>”, “</w:t>
+            </w:r>
+            <w:r>
+              <w:rPr>
+                <w:i/>
+                <w:iCs/>
+              </w:rPr>
+              <w:t>jobTypes.get(i)</w:t>
+            </w:r>
+            <w:r>
+              <w:t>” etc…</w:t>
             </w:r>
           </w:p>
           <w:p/>
@@ -1934,7 +2355,19 @@
           </w:tcPr>
           <w:p>
             <w:r>
-              <w:t>If a programming error occurs that adds an element to one of the lists, it would place the system in to an “error / inconsistent state”.</w:t>
+              <w:t>If a programming error occurs that adds an element to one of the lists, it would place the system in to an “</w:t>
+            </w:r>
+            <w:r>
+              <w:rPr>
+                <w:b/>
+                <w:bCs/>
+                <w:i/>
+                <w:iCs/>
+              </w:rPr>
+              <w:t>error / inconsistent state</w:t>
+            </w:r>
+            <w:r>
+              <w:t>”.</w:t>
             </w:r>
           </w:p>
           <w:p/>
@@ -2034,7 +2467,23 @@
     </w:tbl>
     <w:p/>
     <w:p>
-      <w:r>
+      <w:pPr>
+        <w:rPr>
+          <w:i/>
+          <w:iCs/>
+          <w:color w:val="808080" w:themeColor="background1" w:themeShade="80"/>
+          <w:sz w:val="21"/>
+          <w:szCs w:val="21"/>
+        </w:rPr>
+      </w:pPr>
+      <w:r>
+        <w:rPr>
+          <w:i/>
+          <w:iCs/>
+          <w:color w:val="808080" w:themeColor="background1" w:themeShade="80"/>
+          <w:sz w:val="21"/>
+          <w:szCs w:val="21"/>
+        </w:rPr>
         <w:t>next page &gt;&gt;</w:t>
       </w:r>
     </w:p>
@@ -2049,13 +2498,34 @@
       </w:pPr>
       <w:r>
         <w:lastRenderedPageBreak/>
-        <w:t>The updated version of the program addresses th</w:t>
-      </w:r>
-      <w:r>
+        <w:t xml:space="preserve">The updated version of the program </w:t>
+      </w:r>
+      <w:r>
+        <w:rPr>
+          <w:b/>
+          <w:bCs/>
+        </w:rPr>
+        <w:t>addresses th</w:t>
+      </w:r>
+      <w:r>
+        <w:rPr>
+          <w:b/>
+          <w:bCs/>
+        </w:rPr>
         <w:t>ese issues</w:t>
       </w:r>
       <w:r>
-        <w:t xml:space="preserve"> by introducing an immutable domain class, and a job is now represented using the following;</w:t>
+        <w:t xml:space="preserve"> by introducing an </w:t>
+      </w:r>
+      <w:r>
+        <w:rPr>
+          <w:b/>
+          <w:bCs/>
+        </w:rPr>
+        <w:t>immutable domain class</w:t>
+      </w:r>
+      <w:r>
+        <w:t>, and a job is now represented using the following;</w:t>
       </w:r>
     </w:p>
     <w:p/>
@@ -2166,28 +2636,192 @@
                 </w:tcPr>
                 <w:p>
                   <w:r>
-                    <w:t>This on the other hand, does demonstrate encapsulation, because first of all; the internal state is private which means it can’t be modified, it can only be read using controlled “accessor methods” such as “</w:t>
+                    <w:t xml:space="preserve">This on the other hand, </w:t>
+                  </w:r>
+                  <w:r>
+                    <w:rPr>
+                      <w:b/>
+                      <w:bCs/>
+                    </w:rPr>
+                    <w:t>does demonstrate encapsulation</w:t>
+                  </w:r>
+                  <w:r>
+                    <w:t xml:space="preserve">, because first of all; </w:t>
+                  </w:r>
+                  <w:r>
+                    <w:rPr>
+                      <w:b/>
+                      <w:bCs/>
+                    </w:rPr>
+                    <w:t>the internal state is private</w:t>
+                  </w:r>
+                  <w:r>
+                    <w:t xml:space="preserve"> which means it </w:t>
+                  </w:r>
+                  <w:r>
+                    <w:rPr>
+                      <w:b/>
+                      <w:bCs/>
+                    </w:rPr>
+                    <w:t>can’t be modified</w:t>
+                  </w:r>
+                  <w:r>
+                    <w:t xml:space="preserve">, it can </w:t>
+                  </w:r>
+                  <w:r>
+                    <w:rPr>
+                      <w:b/>
+                      <w:bCs/>
+                    </w:rPr>
+                    <w:t>only be read using controlled “</w:t>
+                  </w:r>
+                  <w:r>
+                    <w:rPr>
+                      <w:b/>
+                      <w:bCs/>
+                      <w:i/>
+                      <w:iCs/>
+                    </w:rPr>
+                    <w:t>accessor methods</w:t>
+                  </w:r>
+                  <w:r>
+                    <w:rPr>
+                      <w:b/>
+                      <w:bCs/>
+                    </w:rPr>
+                    <w:t>”</w:t>
+                  </w:r>
+                  <w:r>
+                    <w:t xml:space="preserve"> such as “</w:t>
                   </w:r>
                   <w:proofErr w:type="gramStart"/>
                   <w:r>
+                    <w:rPr>
+                      <w:i/>
+                      <w:iCs/>
+                    </w:rPr>
                     <w:t>getTitle(</w:t>
                   </w:r>
                   <w:proofErr w:type="gramEnd"/>
                   <w:r>
-                    <w:t xml:space="preserve">)” to get the job title. </w:t>
+                    <w:rPr>
+                      <w:i/>
+                      <w:iCs/>
+                    </w:rPr>
+                    <w:t>)”</w:t>
+                  </w:r>
+                  <w:r>
+                    <w:t xml:space="preserve"> to get the job title. </w:t>
                   </w:r>
                 </w:p>
                 <w:p>
                   <w:r>
-                    <w:t>This also demonstrates immutability, because fields are marked as “final”, which means the classes expose no setters, and a valid job can’t be changed unexpectedly by another part of the application. Their construction is controlled through the “Job.Builder()”, which validates identifiers and text fields before allowing a “job” to be made thanks to its “</w:t>
+                    <w:t xml:space="preserve">This also </w:t>
+                  </w:r>
+                  <w:r>
+                    <w:rPr>
+                      <w:b/>
+                      <w:bCs/>
+                    </w:rPr>
+                    <w:t>demonstrates immutability</w:t>
+                  </w:r>
+                  <w:r>
+                    <w:t xml:space="preserve">, because </w:t>
+                  </w:r>
+                  <w:r>
+                    <w:rPr>
+                      <w:b/>
+                      <w:bCs/>
+                    </w:rPr>
+                    <w:t>fields are marked as “</w:t>
+                  </w:r>
+                  <w:r>
+                    <w:rPr>
+                      <w:b/>
+                      <w:bCs/>
+                      <w:i/>
+                      <w:iCs/>
+                    </w:rPr>
+                    <w:t>final</w:t>
+                  </w:r>
+                  <w:r>
+                    <w:rPr>
+                      <w:b/>
+                      <w:bCs/>
+                    </w:rPr>
+                    <w:t>”</w:t>
+                  </w:r>
+                  <w:r>
+                    <w:t xml:space="preserve">, which means the classes expose no setters, and a </w:t>
+                  </w:r>
+                  <w:r>
+                    <w:rPr>
+                      <w:b/>
+                      <w:bCs/>
+                    </w:rPr>
+                    <w:t>valid job can’t be changed unexpectedly</w:t>
+                  </w:r>
+                  <w:r>
+                    <w:t xml:space="preserve"> </w:t>
+                  </w:r>
+                  <w:r>
+                    <w:rPr>
+                      <w:b/>
+                      <w:bCs/>
+                    </w:rPr>
+                    <w:t>by another part of the application</w:t>
+                  </w:r>
+                  <w:r>
+                    <w:t>. Their construction is controlled through the “</w:t>
+                  </w:r>
+                  <w:r>
+                    <w:rPr>
+                      <w:i/>
+                      <w:iCs/>
+                    </w:rPr>
+                    <w:t>Job.Builder()</w:t>
+                  </w:r>
+                  <w:r>
+                    <w:t xml:space="preserve">”, which </w:t>
+                  </w:r>
+                  <w:r>
+                    <w:rPr>
+                      <w:b/>
+                      <w:bCs/>
+                    </w:rPr>
+                    <w:t>validates identifiers</w:t>
+                  </w:r>
+                  <w:r>
+                    <w:t xml:space="preserve"> and </w:t>
+                  </w:r>
+                  <w:r>
+                    <w:rPr>
+                      <w:b/>
+                      <w:bCs/>
+                    </w:rPr>
+                    <w:t>text fields</w:t>
+                  </w:r>
+                  <w:r>
+                    <w:t xml:space="preserve"> before allowing a “job” to be made thanks to its “</w:t>
                   </w:r>
                   <w:proofErr w:type="gramStart"/>
                   <w:r>
+                    <w:rPr>
+                      <w:i/>
+                      <w:iCs/>
+                    </w:rPr>
                     <w:t>build(</w:t>
                   </w:r>
                   <w:proofErr w:type="gramEnd"/>
                   <w:r>
-                    <w:t xml:space="preserve">)” method. </w:t>
+                    <w:rPr>
+                      <w:i/>
+                      <w:iCs/>
+                    </w:rPr>
+                    <w:t>)</w:t>
+                  </w:r>
+                  <w:r>
+                    <w:t xml:space="preserve">” method. </w:t>
                   </w:r>
                 </w:p>
                 <w:p/>
@@ -2280,7 +2914,113 @@
     <w:p/>
     <w:p>
       <w:r>
-        <w:t>This moves me swiftly to my implementation of the Gang of Four (G.o.F.) Builder Creational Pattern. It’s appropriate here because the object in question (a job) contains several related properties and validation rules. This prevents us from having a multitude of indexed lists to create a single job and makes construction much clearer.</w:t>
+        <w:t xml:space="preserve">This moves me swiftly to my implementation of the </w:t>
+      </w:r>
+      <w:r>
+        <w:rPr>
+          <w:b/>
+          <w:bCs/>
+        </w:rPr>
+        <w:t>Gang of Four (</w:t>
+      </w:r>
+      <w:r>
+        <w:rPr>
+          <w:b/>
+          <w:bCs/>
+          <w:i/>
+          <w:iCs/>
+        </w:rPr>
+        <w:t>G.o.F.</w:t>
+      </w:r>
+      <w:r>
+        <w:rPr>
+          <w:b/>
+          <w:bCs/>
+        </w:rPr>
+        <w:t>)</w:t>
+      </w:r>
+      <w:r>
+        <w:t xml:space="preserve"> </w:t>
+      </w:r>
+      <w:r>
+        <w:rPr>
+          <w:b/>
+          <w:bCs/>
+        </w:rPr>
+        <w:t>Builder Creational Pattern</w:t>
+      </w:r>
+      <w:r>
+        <w:t>. It’s appropriate here because the object in question (</w:t>
+      </w:r>
+      <w:r>
+        <w:rPr>
+          <w:i/>
+          <w:iCs/>
+        </w:rPr>
+        <w:t>a job</w:t>
+      </w:r>
+      <w:r>
+        <w:t xml:space="preserve">) </w:t>
+      </w:r>
+      <w:r>
+        <w:rPr>
+          <w:b/>
+          <w:bCs/>
+        </w:rPr>
+        <w:t xml:space="preserve">contains </w:t>
+      </w:r>
+      <w:r>
+        <w:t>several</w:t>
+      </w:r>
+      <w:r>
+        <w:rPr>
+          <w:b/>
+          <w:bCs/>
+        </w:rPr>
+        <w:t xml:space="preserve"> related properties </w:t>
+      </w:r>
+      <w:r>
+        <w:t>and</w:t>
+      </w:r>
+      <w:r>
+        <w:rPr>
+          <w:b/>
+          <w:bCs/>
+        </w:rPr>
+        <w:t xml:space="preserve"> validation rules</w:t>
+      </w:r>
+      <w:r>
+        <w:t xml:space="preserve">. This prevents us from having a </w:t>
+      </w:r>
+      <w:r>
+        <w:rPr>
+          <w:b/>
+          <w:bCs/>
+        </w:rPr>
+        <w:t>multitude of indexed lists</w:t>
+      </w:r>
+      <w:r>
+        <w:t xml:space="preserve"> to create a </w:t>
+      </w:r>
+      <w:r>
+        <w:rPr>
+          <w:b/>
+          <w:bCs/>
+        </w:rPr>
+        <w:t>single job</w:t>
+      </w:r>
+      <w:r>
+        <w:t xml:space="preserve"> and makes </w:t>
+      </w:r>
+      <w:r>
+        <w:rPr>
+          <w:b/>
+          <w:bCs/>
+        </w:rPr>
+        <w:t>construction much clearer</w:t>
+      </w:r>
+      <w:r>
+        <w:t>.</w:t>
       </w:r>
     </w:p>
     <w:p/>
@@ -2453,7 +3193,23 @@
     </w:tbl>
     <w:p/>
     <w:p>
-      <w:r>
+      <w:pPr>
+        <w:rPr>
+          <w:i/>
+          <w:iCs/>
+          <w:color w:val="808080" w:themeColor="background1" w:themeShade="80"/>
+          <w:sz w:val="21"/>
+          <w:szCs w:val="21"/>
+        </w:rPr>
+      </w:pPr>
+      <w:r>
+        <w:rPr>
+          <w:i/>
+          <w:iCs/>
+          <w:color w:val="808080" w:themeColor="background1" w:themeShade="80"/>
+          <w:sz w:val="21"/>
+          <w:szCs w:val="21"/>
+        </w:rPr>
         <w:t>next page &gt;&gt;</w:t>
       </w:r>
     </w:p>
@@ -2471,6 +3227,10 @@
         <w:t>“</w:t>
       </w:r>
       <w:r>
+        <w:rPr>
+          <w:i/>
+          <w:iCs/>
+        </w:rPr>
         <w:t>model/Application.java</w:t>
       </w:r>
       <w:r>
@@ -2483,18 +3243,36 @@
         <w:t>“</w:t>
       </w:r>
       <w:r>
+        <w:rPr>
+          <w:i/>
+          <w:iCs/>
+        </w:rPr>
         <w:t>Application</w:t>
       </w:r>
       <w:r>
         <w:t>”</w:t>
       </w:r>
       <w:r>
-        <w:t xml:space="preserve"> is also immutable and created using the </w:t>
+        <w:t xml:space="preserve"> is also </w:t>
+      </w:r>
+      <w:r>
+        <w:rPr>
+          <w:b/>
+          <w:bCs/>
+        </w:rPr>
+        <w:t>immutable</w:t>
+      </w:r>
+      <w:r>
+        <w:t xml:space="preserve"> and created using the </w:t>
       </w:r>
       <w:r>
         <w:t>“</w:t>
       </w:r>
       <w:r>
+        <w:rPr>
+          <w:i/>
+          <w:iCs/>
+        </w:rPr>
         <w:t>Application.Builder</w:t>
       </w:r>
       <w:r>
@@ -2689,6 +3467,11 @@
                 <w:p>
                   <w:pPr>
                     <w:jc w:val="center"/>
+                    <w:rPr>
+                      <w:color w:val="808080" w:themeColor="background1" w:themeShade="80"/>
+                      <w:sz w:val="22"/>
+                      <w:szCs w:val="22"/>
+                    </w:rPr>
                   </w:pPr>
                   <w:r>
                     <w:rPr>
@@ -2789,6 +3572,11 @@
                     </w:rPr>
                     <w:t xml:space="preserve"> Aug 2026.</w:t>
                   </w:r>
+                </w:p>
+                <w:p>
+                  <w:pPr>
+                    <w:jc w:val="center"/>
+                  </w:pPr>
                 </w:p>
               </w:tc>
             </w:tr>
@@ -2952,24 +3740,212 @@
           </w:tcPr>
           <w:p>
             <w:r>
-              <w:t xml:space="preserve">Value Objects are yet another improvement </w:t>
-            </w:r>
-            <w:r>
+              <w:rPr>
+                <w:b/>
+                <w:bCs/>
+              </w:rPr>
+              <w:t>Value Objects</w:t>
+            </w:r>
+            <w:r>
+              <w:t xml:space="preserve"> are yet another </w:t>
+            </w:r>
+            <w:r>
+              <w:rPr>
+                <w:b/>
+                <w:bCs/>
+              </w:rPr>
+              <w:t xml:space="preserve">improvement </w:t>
+            </w:r>
+            <w:r>
+              <w:rPr>
+                <w:b/>
+                <w:bCs/>
+              </w:rPr>
               <w:t>in</w:t>
             </w:r>
             <w:r>
-              <w:t xml:space="preserve"> encapsulation, more specifically the “JobID”’ and “ApplicationID”’. </w:t>
+              <w:rPr>
+                <w:b/>
+                <w:bCs/>
+              </w:rPr>
+              <w:t xml:space="preserve"> encapsulation</w:t>
+            </w:r>
+            <w:r>
+              <w:t>, more specifically the “</w:t>
+            </w:r>
+            <w:r>
+              <w:rPr>
+                <w:i/>
+                <w:iCs/>
+              </w:rPr>
+              <w:t>JobID</w:t>
+            </w:r>
+            <w:r>
+              <w:t>”’ and “</w:t>
+            </w:r>
+            <w:r>
+              <w:rPr>
+                <w:i/>
+                <w:iCs/>
+              </w:rPr>
+              <w:t>ApplicationID</w:t>
+            </w:r>
+            <w:r>
+              <w:t xml:space="preserve">”’. </w:t>
             </w:r>
           </w:p>
           <w:p>
             <w:r>
-              <w:t xml:space="preserve">Instead of identifying each job or job application with an indexed list number (i), both encapsulate a UUID. </w:t>
+              <w:t xml:space="preserve">Instead of identifying each job or job application with an </w:t>
+            </w:r>
+            <w:r>
+              <w:rPr>
+                <w:b/>
+                <w:bCs/>
+              </w:rPr>
+              <w:t>indexed list number (</w:t>
+            </w:r>
+            <w:r>
+              <w:rPr>
+                <w:b/>
+                <w:bCs/>
+                <w:i/>
+                <w:iCs/>
+              </w:rPr>
+              <w:t>i</w:t>
+            </w:r>
+            <w:r>
+              <w:rPr>
+                <w:b/>
+                <w:bCs/>
+              </w:rPr>
+              <w:t>)</w:t>
+            </w:r>
+            <w:r>
+              <w:t xml:space="preserve">, </w:t>
+            </w:r>
+            <w:r>
+              <w:rPr>
+                <w:b/>
+                <w:bCs/>
+              </w:rPr>
+              <w:t>both encapsulate a UUID</w:t>
+            </w:r>
+            <w:r>
+              <w:t xml:space="preserve">. </w:t>
             </w:r>
           </w:p>
           <w:p/>
+          <w:p/>
           <w:p>
             <w:r>
-              <w:t>Also, their creation is controlled through a generator like “ApplicationID.generate()” for example, which improves safety &amp; maintainability due to the methods used: such as “applyForJob(JobID jobID)” which explicitly require a JobID rather than an indexed value (i).</w:t>
+              <w:t xml:space="preserve">Also, their </w:t>
+            </w:r>
+            <w:r>
+              <w:rPr>
+                <w:b/>
+                <w:bCs/>
+              </w:rPr>
+              <w:t>creation is controlled</w:t>
+            </w:r>
+            <w:r>
+              <w:t xml:space="preserve"> through a </w:t>
+            </w:r>
+            <w:r>
+              <w:rPr>
+                <w:b/>
+                <w:bCs/>
+              </w:rPr>
+              <w:t>generator</w:t>
+            </w:r>
+            <w:r>
+              <w:t xml:space="preserve"> like “</w:t>
+            </w:r>
+            <w:r>
+              <w:rPr>
+                <w:i/>
+                <w:iCs/>
+              </w:rPr>
+              <w:t>ApplicationID.generate()</w:t>
+            </w:r>
+            <w:r>
+              <w:t xml:space="preserve">” for example, which </w:t>
+            </w:r>
+            <w:r>
+              <w:rPr>
+                <w:b/>
+                <w:bCs/>
+              </w:rPr>
+              <w:t>improves safety</w:t>
+            </w:r>
+            <w:r>
+              <w:t xml:space="preserve"> &amp; </w:t>
+            </w:r>
+            <w:r>
+              <w:rPr>
+                <w:b/>
+                <w:bCs/>
+              </w:rPr>
+              <w:t>maintainability</w:t>
+            </w:r>
+            <w:r>
+              <w:t xml:space="preserve"> due to the methods used: such as “</w:t>
+            </w:r>
+            <w:r>
+              <w:rPr>
+                <w:i/>
+                <w:iCs/>
+              </w:rPr>
+              <w:t>applyForJob(JobID jobID)</w:t>
+            </w:r>
+            <w:r>
+              <w:t xml:space="preserve">” which </w:t>
+            </w:r>
+            <w:r>
+              <w:rPr>
+                <w:b/>
+                <w:bCs/>
+              </w:rPr>
+              <w:t>explicitly require a JobID</w:t>
+            </w:r>
+            <w:r>
+              <w:t xml:space="preserve"> rather than an </w:t>
+            </w:r>
+            <w:r>
+              <w:rPr>
+                <w:b/>
+                <w:bCs/>
+              </w:rPr>
+              <w:t>indexed value</w:t>
+            </w:r>
+            <w:r>
+              <w:t xml:space="preserve"> </w:t>
+            </w:r>
+            <w:r>
+              <w:rPr>
+                <w:b/>
+                <w:bCs/>
+              </w:rPr>
+              <w:t>(</w:t>
+            </w:r>
+            <w:r>
+              <w:rPr>
+                <w:b/>
+                <w:bCs/>
+                <w:i/>
+                <w:iCs/>
+              </w:rPr>
+              <w:t>i</w:t>
+            </w:r>
+            <w:r>
+              <w:rPr>
+                <w:b/>
+                <w:bCs/>
+              </w:rPr>
+              <w:t>)</w:t>
+            </w:r>
+            <w:r>
+              <w:t>.</w:t>
             </w:r>
           </w:p>
         </w:tc>
@@ -2978,23 +3954,125 @@
     <w:p/>
     <w:p>
       <w:r>
-        <w:t>Another problem with the initial code that was provided is that there was no visible abstraction</w:t>
-      </w:r>
-      <w:r>
-        <w:t>, and all storage, searching, input, output and application behaviour more generally, were implemented in “</w:t>
+        <w:t>Another problem with the initial code</w:t>
+      </w:r>
+      <w:r>
+        <w:t>,</w:t>
+      </w:r>
+      <w:r>
+        <w:t xml:space="preserve"> is that there was </w:t>
+      </w:r>
+      <w:r>
+        <w:rPr>
+          <w:b/>
+          <w:bCs/>
+        </w:rPr>
+        <w:t>no visible abstraction</w:t>
+      </w:r>
+      <w:r>
+        <w:t xml:space="preserve">, and </w:t>
+      </w:r>
+      <w:r>
+        <w:rPr>
+          <w:b/>
+          <w:bCs/>
+        </w:rPr>
+        <w:t>all storage</w:t>
+      </w:r>
+      <w:r>
+        <w:t xml:space="preserve">, </w:t>
+      </w:r>
+      <w:r>
+        <w:rPr>
+          <w:b/>
+          <w:bCs/>
+        </w:rPr>
+        <w:t>searching</w:t>
+      </w:r>
+      <w:r>
+        <w:t xml:space="preserve">, </w:t>
+      </w:r>
+      <w:r>
+        <w:rPr>
+          <w:b/>
+          <w:bCs/>
+        </w:rPr>
+        <w:t>input</w:t>
+      </w:r>
+      <w:r>
+        <w:t xml:space="preserve">, </w:t>
+      </w:r>
+      <w:r>
+        <w:rPr>
+          <w:b/>
+          <w:bCs/>
+        </w:rPr>
+        <w:t>output</w:t>
+      </w:r>
+      <w:r>
+        <w:t xml:space="preserve"> and </w:t>
+      </w:r>
+      <w:r>
+        <w:rPr>
+          <w:b/>
+          <w:bCs/>
+        </w:rPr>
+        <w:t>application behaviour</w:t>
+      </w:r>
+      <w:r>
+        <w:t xml:space="preserve"> more generally, </w:t>
+      </w:r>
+      <w:r>
+        <w:rPr>
+          <w:b/>
+          <w:bCs/>
+        </w:rPr>
+        <w:t>were implemented in “</w:t>
       </w:r>
       <w:proofErr w:type="gramStart"/>
       <w:r>
+        <w:rPr>
+          <w:b/>
+          <w:bCs/>
+          <w:i/>
+          <w:iCs/>
+        </w:rPr>
         <w:t>main(</w:t>
       </w:r>
       <w:proofErr w:type="gramEnd"/>
       <w:r>
-        <w:t xml:space="preserve">)”. </w:t>
+        <w:rPr>
+          <w:b/>
+          <w:bCs/>
+          <w:i/>
+          <w:iCs/>
+        </w:rPr>
+        <w:t>)</w:t>
+      </w:r>
+      <w:r>
+        <w:rPr>
+          <w:b/>
+          <w:bCs/>
+        </w:rPr>
+        <w:t>”</w:t>
+      </w:r>
+      <w:r>
+        <w:t xml:space="preserve">. </w:t>
       </w:r>
     </w:p>
     <w:p>
       <w:r>
-        <w:t>A good example of this would be the search function in the provided “StudentJobProtal.java” file:</w:t>
+        <w:t>A good example of this would be the search function in the provided “</w:t>
+      </w:r>
+      <w:r>
+        <w:rPr>
+          <w:i/>
+          <w:iCs/>
+        </w:rPr>
+        <w:t>StudentJobProtal.java</w:t>
+      </w:r>
+      <w:r>
+        <w:t>” file:</w:t>
       </w:r>
     </w:p>
     <w:p/>
@@ -3173,7 +4251,23 @@
     </w:tbl>
     <w:p/>
     <w:p>
-      <w:r>
+      <w:pPr>
+        <w:rPr>
+          <w:i/>
+          <w:iCs/>
+          <w:color w:val="808080" w:themeColor="background1" w:themeShade="80"/>
+          <w:sz w:val="21"/>
+          <w:szCs w:val="21"/>
+        </w:rPr>
+      </w:pPr>
+      <w:r>
+        <w:rPr>
+          <w:i/>
+          <w:iCs/>
+          <w:color w:val="808080" w:themeColor="background1" w:themeShade="80"/>
+          <w:sz w:val="21"/>
+          <w:szCs w:val="21"/>
+        </w:rPr>
         <w:t>next page &gt;&gt;</w:t>
       </w:r>
     </w:p>
@@ -3185,7 +4279,59 @@
     <w:p>
       <w:r>
         <w:lastRenderedPageBreak/>
-        <w:t>Any extension, modification or replacement of this search method would require editing this conditional directly. The refactored version of the program replaces this direct conditional with the “JobSearchStrategy” interface shown below.</w:t>
+        <w:t xml:space="preserve">Any extension, modification or replacement of this search method would </w:t>
+      </w:r>
+      <w:r>
+        <w:rPr>
+          <w:b/>
+          <w:bCs/>
+        </w:rPr>
+        <w:t>require editing this conditional directly</w:t>
+      </w:r>
+      <w:r>
+        <w:t>.</w:t>
+      </w:r>
+      <w:r>
+        <w:rPr>
+          <w:b/>
+          <w:bCs/>
+        </w:rPr>
+        <w:t xml:space="preserve"> </w:t>
+      </w:r>
+      <w:r>
+        <w:t xml:space="preserve">The refactored version of the program </w:t>
+      </w:r>
+      <w:r>
+        <w:rPr>
+          <w:b/>
+          <w:bCs/>
+        </w:rPr>
+        <w:t>replaces</w:t>
+      </w:r>
+      <w:r>
+        <w:t xml:space="preserve"> this direct conditional with the “</w:t>
+      </w:r>
+      <w:r>
+        <w:rPr>
+          <w:b/>
+          <w:bCs/>
+          <w:i/>
+          <w:iCs/>
+        </w:rPr>
+        <w:t>JobSearchStrategy</w:t>
+      </w:r>
+      <w:r>
+        <w:t xml:space="preserve">” </w:t>
+      </w:r>
+      <w:r>
+        <w:rPr>
+          <w:b/>
+          <w:bCs/>
+        </w:rPr>
+        <w:t>interface</w:t>
+      </w:r>
+      <w:r>
+        <w:t xml:space="preserve"> shown below.</w:t>
       </w:r>
     </w:p>
     <w:p/>
@@ -3358,10 +4504,76 @@
     <w:p/>
     <w:p>
       <w:r>
-        <w:t xml:space="preserve">This concrete implementation allows for the inclusion of “TitleSearchStrategy”, “CompanySearchStrategy”, </w:t>
-      </w:r>
-      <w:r>
-        <w:t xml:space="preserve">“LocationSearchStrategy” and finally “JobTypeSearchStrategy” which can each have their own “algorithms”. As an </w:t>
+        <w:t>This concrete implementation allows for the inclusion of “</w:t>
+      </w:r>
+      <w:r>
+        <w:rPr>
+          <w:i/>
+          <w:iCs/>
+        </w:rPr>
+        <w:t>TitleSearchStrategy</w:t>
+      </w:r>
+      <w:r>
+        <w:t>”, “</w:t>
+      </w:r>
+      <w:r>
+        <w:rPr>
+          <w:i/>
+          <w:iCs/>
+        </w:rPr>
+        <w:t>CompanySearchStrategy</w:t>
+      </w:r>
+      <w:r>
+        <w:t xml:space="preserve">”, </w:t>
+      </w:r>
+      <w:r>
+        <w:t>“</w:t>
+      </w:r>
+      <w:r>
+        <w:rPr>
+          <w:i/>
+          <w:iCs/>
+        </w:rPr>
+        <w:t>LocationSearchStrategy</w:t>
+      </w:r>
+      <w:r>
+        <w:t>” and finally “</w:t>
+      </w:r>
+      <w:r>
+        <w:rPr>
+          <w:i/>
+          <w:iCs/>
+        </w:rPr>
+        <w:t>JobTypeSearchStrategy</w:t>
+      </w:r>
+      <w:r>
+        <w:t xml:space="preserve">” which can </w:t>
+      </w:r>
+      <w:r>
+        <w:rPr>
+          <w:b/>
+          <w:bCs/>
+        </w:rPr>
+        <w:t>each have their own “</w:t>
+      </w:r>
+      <w:r>
+        <w:rPr>
+          <w:b/>
+          <w:bCs/>
+          <w:i/>
+          <w:iCs/>
+        </w:rPr>
+        <w:t>algorithms</w:t>
+      </w:r>
+      <w:r>
+        <w:rPr>
+          <w:b/>
+          <w:bCs/>
+        </w:rPr>
+        <w:t>”</w:t>
+      </w:r>
+      <w:r>
+        <w:t xml:space="preserve">. As an </w:t>
       </w:r>
       <w:proofErr w:type="gramStart"/>
       <w:r>
@@ -3369,7 +4581,17 @@
       </w:r>
       <w:proofErr w:type="gramEnd"/>
       <w:r>
-        <w:t xml:space="preserve"> to this; “TitleSearchStrategy.matches()” is relevant to the following </w:t>
+        <w:t xml:space="preserve"> to this; “</w:t>
+      </w:r>
+      <w:r>
+        <w:rPr>
+          <w:i/>
+          <w:iCs/>
+        </w:rPr>
+        <w:t>TitleSearchStrategy.matches()</w:t>
+      </w:r>
+      <w:r>
+        <w:t xml:space="preserve">” is relevant to the following </w:t>
       </w:r>
       <w:r>
         <w:t xml:space="preserve">algorithm: </w:t>
@@ -3380,14 +4602,26 @@
         <w:t>“</w:t>
       </w:r>
       <w:r>
+        <w:rPr>
+          <w:i/>
+          <w:iCs/>
+        </w:rPr>
         <w:t>return SearchSupport.contains(</w:t>
       </w:r>
       <w:proofErr w:type="gramStart"/>
       <w:r>
+        <w:rPr>
+          <w:i/>
+          <w:iCs/>
+        </w:rPr>
         <w:t>Job::</w:t>
       </w:r>
       <w:proofErr w:type="gramEnd"/>
       <w:r>
+        <w:rPr>
+          <w:i/>
+          <w:iCs/>
+        </w:rPr>
         <w:t>getTitle, job, searchTerm);</w:t>
       </w:r>
       <w:r>
@@ -3559,19 +4793,178 @@
     <w:p/>
     <w:p>
       <w:r>
-        <w:t>This is also a good example of the inclusion of Polymorphism due to the fact that the “JobService” works with the “JobSearchStrategy” interface</w:t>
-      </w:r>
-      <w:r>
-        <w:t xml:space="preserve"> rather than needing to know which search algorithm has been supplied. This also serves as the second Gang of Four (G.o.F.) implementa</w:t>
-      </w:r>
-      <w:r>
-        <w:t xml:space="preserve">tion, this time the Strategy Behavioural Pattern. It’s appropriate here because searching is inherently expected to vary based on what the user needs; and alternative strategies can be substituted without rewriting the “JobService”. </w:t>
+        <w:t xml:space="preserve">This is also a good example of the inclusion of </w:t>
+      </w:r>
+      <w:r>
+        <w:rPr>
+          <w:b/>
+          <w:bCs/>
+        </w:rPr>
+        <w:t>Polymorphism</w:t>
+      </w:r>
+      <w:r>
+        <w:t xml:space="preserve"> due to the fact that the “</w:t>
+      </w:r>
+      <w:r>
+        <w:rPr>
+          <w:i/>
+          <w:iCs/>
+        </w:rPr>
+        <w:t>JobService</w:t>
+      </w:r>
+      <w:r>
+        <w:t xml:space="preserve">” </w:t>
+      </w:r>
+      <w:r>
+        <w:rPr>
+          <w:b/>
+          <w:bCs/>
+        </w:rPr>
+        <w:t>works with</w:t>
+      </w:r>
+      <w:r>
+        <w:t xml:space="preserve"> the “</w:t>
+      </w:r>
+      <w:r>
+        <w:rPr>
+          <w:i/>
+          <w:iCs/>
+        </w:rPr>
+        <w:t>JobSearchStrategy</w:t>
+      </w:r>
+      <w:r>
+        <w:t>” interface</w:t>
+      </w:r>
+      <w:r>
+        <w:t xml:space="preserve"> </w:t>
+      </w:r>
+      <w:r>
+        <w:rPr>
+          <w:b/>
+          <w:bCs/>
+        </w:rPr>
+        <w:t>rather than needing to know which search algorithm has been supplied</w:t>
+      </w:r>
+      <w:r>
+        <w:t xml:space="preserve">. This also serves as the </w:t>
+      </w:r>
+      <w:r>
+        <w:rPr>
+          <w:b/>
+          <w:bCs/>
+        </w:rPr>
+        <w:t>second Gang of Four (</w:t>
+      </w:r>
+      <w:r>
+        <w:rPr>
+          <w:b/>
+          <w:bCs/>
+          <w:i/>
+          <w:iCs/>
+        </w:rPr>
+        <w:t>G.o.F.</w:t>
+      </w:r>
+      <w:r>
+        <w:rPr>
+          <w:b/>
+          <w:bCs/>
+        </w:rPr>
+        <w:t>)</w:t>
+      </w:r>
+      <w:r>
+        <w:t xml:space="preserve"> implementa</w:t>
+      </w:r>
+      <w:r>
+        <w:t xml:space="preserve">tion, this time the </w:t>
+      </w:r>
+      <w:r>
+        <w:rPr>
+          <w:b/>
+          <w:bCs/>
+        </w:rPr>
+        <w:t>Strategy Behavioural Pattern</w:t>
+      </w:r>
+      <w:r>
+        <w:t xml:space="preserve">. It’s appropriate here because </w:t>
+      </w:r>
+      <w:r>
+        <w:rPr>
+          <w:b/>
+          <w:bCs/>
+        </w:rPr>
+        <w:t xml:space="preserve">searching is inherently expected to vary </w:t>
+      </w:r>
+      <w:r>
+        <w:t xml:space="preserve">based on what the </w:t>
+      </w:r>
+      <w:r>
+        <w:rPr>
+          <w:b/>
+          <w:bCs/>
+        </w:rPr>
+        <w:t>user needs</w:t>
+      </w:r>
+      <w:r>
+        <w:t xml:space="preserve">; and </w:t>
+      </w:r>
+      <w:r>
+        <w:rPr>
+          <w:b/>
+          <w:bCs/>
+        </w:rPr>
+        <w:t>alternative strategies</w:t>
+      </w:r>
+      <w:r>
+        <w:t xml:space="preserve"> can be </w:t>
+      </w:r>
+      <w:r>
+        <w:rPr>
+          <w:b/>
+          <w:bCs/>
+        </w:rPr>
+        <w:t>substituted without rewriting the “</w:t>
+      </w:r>
+      <w:r>
+        <w:rPr>
+          <w:b/>
+          <w:bCs/>
+          <w:i/>
+          <w:iCs/>
+        </w:rPr>
+        <w:t>JobService</w:t>
+      </w:r>
+      <w:r>
+        <w:rPr>
+          <w:b/>
+          <w:bCs/>
+        </w:rPr>
+        <w:t>”</w:t>
+      </w:r>
+      <w:r>
+        <w:t xml:space="preserve">. </w:t>
       </w:r>
     </w:p>
     <w:p/>
     <w:p>
       <w:r>
-        <w:t xml:space="preserve">This is great for our requirements of improving Extend-ability </w:t>
+        <w:t xml:space="preserve">This is great for our requirements of improving </w:t>
+      </w:r>
+      <w:r>
+        <w:rPr>
+          <w:b/>
+          <w:bCs/>
+        </w:rPr>
+        <w:t>e</w:t>
+      </w:r>
+      <w:r>
+        <w:rPr>
+          <w:b/>
+          <w:bCs/>
+        </w:rPr>
+        <w:t>xtendibility</w:t>
+      </w:r>
+      <w:r>
+        <w:t xml:space="preserve"> </w:t>
       </w:r>
       <w:r>
         <w:t xml:space="preserve">because another implementation, such as </w:t>
@@ -3580,6 +4973,10 @@
         <w:t>“</w:t>
       </w:r>
       <w:r>
+        <w:rPr>
+          <w:i/>
+          <w:iCs/>
+        </w:rPr>
         <w:t>SalarySearchStrategy</w:t>
       </w:r>
       <w:r>
@@ -3592,21 +4989,55 @@
         <w:t xml:space="preserve"> “</w:t>
       </w:r>
       <w:r>
+        <w:rPr>
+          <w:i/>
+          <w:iCs/>
+        </w:rPr>
         <w:t>JobSearchStrategy</w:t>
       </w:r>
       <w:r>
         <w:t>”</w:t>
       </w:r>
       <w:r>
-        <w:t xml:space="preserve"> while the existing service remains un</w:t>
-      </w:r>
-      <w:r>
-        <w:t>touched.</w:t>
+        <w:t xml:space="preserve"> while the existing service </w:t>
+      </w:r>
+      <w:r>
+        <w:rPr>
+          <w:b/>
+          <w:bCs/>
+        </w:rPr>
+        <w:t>remains un</w:t>
+      </w:r>
+      <w:r>
+        <w:rPr>
+          <w:b/>
+          <w:bCs/>
+        </w:rPr>
+        <w:t>touched</w:t>
+      </w:r>
+      <w:r>
+        <w:t>.</w:t>
       </w:r>
     </w:p>
     <w:p/>
     <w:p>
-      <w:r>
+      <w:pPr>
+        <w:rPr>
+          <w:i/>
+          <w:iCs/>
+          <w:color w:val="808080" w:themeColor="background1" w:themeShade="80"/>
+          <w:sz w:val="21"/>
+          <w:szCs w:val="21"/>
+        </w:rPr>
+      </w:pPr>
+      <w:r>
+        <w:rPr>
+          <w:i/>
+          <w:iCs/>
+          <w:color w:val="808080" w:themeColor="background1" w:themeShade="80"/>
+          <w:sz w:val="21"/>
+          <w:szCs w:val="21"/>
+        </w:rPr>
         <w:t>next page &gt;&gt;</w:t>
       </w:r>
     </w:p>
@@ -3992,10 +5423,27 @@
     </w:p>
     <w:p/>
     <w:p>
-      <w:r>
+      <w:pPr>
+        <w:rPr>
+          <w:i/>
+          <w:iCs/>
+        </w:rPr>
+      </w:pPr>
+      <w:r>
+        <w:rPr>
+          <w:i/>
+          <w:iCs/>
+          <w:color w:val="808080" w:themeColor="background1" w:themeShade="80"/>
+          <w:sz w:val="21"/>
+          <w:szCs w:val="21"/>
+        </w:rPr>
         <w:t>next page &gt;&gt;</w:t>
       </w:r>
       <w:r>
+        <w:rPr>
+          <w:i/>
+          <w:iCs/>
+        </w:rPr>
         <w:br w:type="page"/>
       </w:r>
     </w:p>
@@ -4299,21 +5747,30 @@
       </w:r>
     </w:p>
     <w:p/>
-    <w:p/>
     <w:p>
       <w:pPr>
         <w:pStyle w:val="Heading2"/>
         <w:rPr>
           <w:rFonts w:hint="eastAsia"/>
+          <w:color w:val="2F6BFF"/>
         </w:rPr>
       </w:pPr>
       <w:r>
+        <w:rPr>
+          <w:color w:val="2F6BFF"/>
+        </w:rPr>
         <w:t>Part 2: (max of 1</w:t>
       </w:r>
       <w:r>
+        <w:rPr>
+          <w:color w:val="2F6BFF"/>
+        </w:rPr>
         <w:t>0</w:t>
       </w:r>
       <w:r>
+        <w:rPr>
+          <w:color w:val="2F6BFF"/>
+        </w:rPr>
         <w:t>00 words)</w:t>
       </w:r>
     </w:p>

</xml_diff>

<commit_message>
Finalized working on Part 1, ideally needs another person's opinion before publication
</commit_message>
<xml_diff>
--- a/CM2307_CW_StudentNumber.docx.docx
+++ b/CM2307_CW_StudentNumber.docx.docx
@@ -5049,7 +5049,57 @@
     <w:p>
       <w:r>
         <w:lastRenderedPageBreak/>
-        <w:t>This also allowed me to make the “CombinedKeywordSearchStrategy” which further demonstrates composition over inheritance by holding multiple “JobSearchStrategy” objects</w:t>
+        <w:t>This also allowed me to make the “</w:t>
+      </w:r>
+      <w:r>
+        <w:rPr>
+          <w:i/>
+          <w:iCs/>
+        </w:rPr>
+        <w:t>CombinedKeywordSearchStrategy</w:t>
+      </w:r>
+      <w:r>
+        <w:t xml:space="preserve">” which further demonstrates </w:t>
+      </w:r>
+      <w:r>
+        <w:rPr>
+          <w:b/>
+          <w:bCs/>
+        </w:rPr>
+        <w:t>composition</w:t>
+      </w:r>
+      <w:r>
+        <w:t xml:space="preserve"> </w:t>
+      </w:r>
+      <w:r>
+        <w:rPr>
+          <w:b/>
+          <w:bCs/>
+        </w:rPr>
+        <w:t>over</w:t>
+      </w:r>
+      <w:r>
+        <w:t xml:space="preserve"> </w:t>
+      </w:r>
+      <w:r>
+        <w:rPr>
+          <w:b/>
+          <w:bCs/>
+        </w:rPr>
+        <w:t>inheritance</w:t>
+      </w:r>
+      <w:r>
+        <w:t xml:space="preserve"> by holding multiple “</w:t>
+      </w:r>
+      <w:r>
+        <w:rPr>
+          <w:i/>
+          <w:iCs/>
+        </w:rPr>
+        <w:t>JobSearchStrategy</w:t>
+      </w:r>
+      <w:r>
+        <w:t>” objects</w:t>
       </w:r>
     </w:p>
     <w:p/>
@@ -5222,27 +5272,135 @@
     <w:p/>
     <w:p>
       <w:r>
-        <w:t xml:space="preserve">Another key abstraction in the revised “StudentJobPortal” </w:t>
-      </w:r>
-      <w:r>
-        <w:t xml:space="preserve">application is the repository layer. These interfaces hide how information </w:t>
-      </w:r>
-      <w:r>
-        <w:t xml:space="preserve">is </w:t>
-      </w:r>
-      <w:r>
-        <w:t xml:space="preserve">actually stored, </w:t>
-      </w:r>
-      <w:r>
-        <w:t>whereas classes containing “</w:t>
+        <w:t xml:space="preserve">Another key </w:t>
+      </w:r>
+      <w:r>
+        <w:rPr>
+          <w:b/>
+          <w:bCs/>
+        </w:rPr>
+        <w:t>abstraction</w:t>
+      </w:r>
+      <w:r>
+        <w:t xml:space="preserve"> in the revised “</w:t>
+      </w:r>
+      <w:r>
+        <w:rPr>
+          <w:i/>
+          <w:iCs/>
+        </w:rPr>
+        <w:t>StudentJobPortal</w:t>
+      </w:r>
+      <w:r>
+        <w:t xml:space="preserve">” </w:t>
+      </w:r>
+      <w:r>
+        <w:t xml:space="preserve">application is the repository layer. These interfaces </w:t>
+      </w:r>
+      <w:r>
+        <w:rPr>
+          <w:b/>
+          <w:bCs/>
+        </w:rPr>
+        <w:t>hide</w:t>
+      </w:r>
+      <w:r>
+        <w:t xml:space="preserve"> </w:t>
+      </w:r>
+      <w:r>
+        <w:rPr>
+          <w:b/>
+          <w:bCs/>
+        </w:rPr>
+        <w:t>how</w:t>
+      </w:r>
+      <w:r>
+        <w:t xml:space="preserve"> </w:t>
+      </w:r>
+      <w:r>
+        <w:rPr>
+          <w:b/>
+          <w:bCs/>
+        </w:rPr>
+        <w:t>information</w:t>
+      </w:r>
+      <w:r>
+        <w:t xml:space="preserve"> </w:t>
+      </w:r>
+      <w:r>
+        <w:rPr>
+          <w:b/>
+          <w:bCs/>
+        </w:rPr>
+        <w:t>is</w:t>
+      </w:r>
+      <w:r>
+        <w:t xml:space="preserve"> </w:t>
+      </w:r>
+      <w:r>
+        <w:rPr>
+          <w:b/>
+          <w:bCs/>
+        </w:rPr>
+        <w:t>actually</w:t>
+      </w:r>
+      <w:r>
+        <w:t xml:space="preserve"> </w:t>
+      </w:r>
+      <w:r>
+        <w:rPr>
+          <w:b/>
+          <w:bCs/>
+        </w:rPr>
+        <w:t>stored</w:t>
+      </w:r>
+      <w:r>
+        <w:t xml:space="preserve">, </w:t>
+      </w:r>
+      <w:r>
+        <w:t xml:space="preserve">whereas </w:t>
+      </w:r>
+      <w:r>
+        <w:rPr>
+          <w:b/>
+          <w:bCs/>
+        </w:rPr>
+        <w:t>classes</w:t>
+      </w:r>
+      <w:r>
+        <w:t xml:space="preserve"> containing “</w:t>
       </w:r>
       <w:proofErr w:type="spellStart"/>
       <w:r>
+        <w:rPr>
+          <w:i/>
+          <w:iCs/>
+        </w:rPr>
         <w:t>InMemory</w:t>
       </w:r>
       <w:proofErr w:type="spellEnd"/>
       <w:r>
-        <w:t>…” supply a current implementation. The following example is given:</w:t>
+        <w:t xml:space="preserve">…” supply a </w:t>
+      </w:r>
+      <w:r>
+        <w:rPr>
+          <w:b/>
+          <w:bCs/>
+        </w:rPr>
+        <w:t>current</w:t>
+      </w:r>
+      <w:r>
+        <w:t xml:space="preserve"> </w:t>
+      </w:r>
+      <w:r>
+        <w:rPr>
+          <w:b/>
+          <w:bCs/>
+        </w:rPr>
+        <w:t>implementation</w:t>
+      </w:r>
+      <w:r>
+        <w:t>. The following example is given:</w:t>
       </w:r>
     </w:p>
     <w:p/>
@@ -5415,10 +5573,160 @@
     <w:p/>
     <w:p>
       <w:r>
-        <w:t>The above example, applies the repository pattern, which hides the “LinkedHashMap” used by the in-memory implementation. This allows for a later upgrade to a full database-backed system</w:t>
-      </w:r>
-      <w:r>
-        <w:t xml:space="preserve"> all whilst not affecting any of the service layer because they continue to depend on the same interface.</w:t>
+        <w:t xml:space="preserve">The above example, applies the </w:t>
+      </w:r>
+      <w:r>
+        <w:rPr>
+          <w:b/>
+          <w:bCs/>
+        </w:rPr>
+        <w:t>repository</w:t>
+      </w:r>
+      <w:r>
+        <w:t xml:space="preserve"> </w:t>
+      </w:r>
+      <w:r>
+        <w:rPr>
+          <w:b/>
+          <w:bCs/>
+        </w:rPr>
+        <w:t>pattern</w:t>
+      </w:r>
+      <w:r>
+        <w:t>, which hides the “</w:t>
+      </w:r>
+      <w:r>
+        <w:rPr>
+          <w:i/>
+          <w:iCs/>
+        </w:rPr>
+        <w:t>LinkedHashMap</w:t>
+      </w:r>
+      <w:r>
+        <w:t xml:space="preserve">” used by the </w:t>
+      </w:r>
+      <w:r>
+        <w:rPr>
+          <w:b/>
+          <w:bCs/>
+        </w:rPr>
+        <w:t>in-memory</w:t>
+      </w:r>
+      <w:r>
+        <w:t xml:space="preserve"> </w:t>
+      </w:r>
+      <w:r>
+        <w:rPr>
+          <w:b/>
+          <w:bCs/>
+        </w:rPr>
+        <w:t>implementation</w:t>
+      </w:r>
+      <w:r>
+        <w:t xml:space="preserve">. This allows for a </w:t>
+      </w:r>
+      <w:r>
+        <w:rPr>
+          <w:b/>
+          <w:bCs/>
+        </w:rPr>
+        <w:t>later</w:t>
+      </w:r>
+      <w:r>
+        <w:t xml:space="preserve"> </w:t>
+      </w:r>
+      <w:r>
+        <w:rPr>
+          <w:b/>
+          <w:bCs/>
+        </w:rPr>
+        <w:t>upgrade</w:t>
+      </w:r>
+      <w:r>
+        <w:t xml:space="preserve"> to a full </w:t>
+      </w:r>
+      <w:r>
+        <w:rPr>
+          <w:b/>
+          <w:bCs/>
+        </w:rPr>
+        <w:t>database-backed</w:t>
+      </w:r>
+      <w:r>
+        <w:t xml:space="preserve"> system</w:t>
+      </w:r>
+      <w:r>
+        <w:t xml:space="preserve"> all whilst </w:t>
+      </w:r>
+      <w:r>
+        <w:rPr>
+          <w:b/>
+          <w:bCs/>
+        </w:rPr>
+        <w:t>not</w:t>
+      </w:r>
+      <w:r>
+        <w:t xml:space="preserve"> </w:t>
+      </w:r>
+      <w:r>
+        <w:rPr>
+          <w:b/>
+          <w:bCs/>
+        </w:rPr>
+        <w:t>affecting</w:t>
+      </w:r>
+      <w:r>
+        <w:t xml:space="preserve"> any of the service layer because they continue to </w:t>
+      </w:r>
+      <w:r>
+        <w:rPr>
+          <w:b/>
+          <w:bCs/>
+        </w:rPr>
+        <w:t>depend</w:t>
+      </w:r>
+      <w:r>
+        <w:t xml:space="preserve"> </w:t>
+      </w:r>
+      <w:r>
+        <w:rPr>
+          <w:b/>
+          <w:bCs/>
+        </w:rPr>
+        <w:t>on</w:t>
+      </w:r>
+      <w:r>
+        <w:t xml:space="preserve"> </w:t>
+      </w:r>
+      <w:r>
+        <w:rPr>
+          <w:b/>
+          <w:bCs/>
+        </w:rPr>
+        <w:t>the</w:t>
+      </w:r>
+      <w:r>
+        <w:t xml:space="preserve"> </w:t>
+      </w:r>
+      <w:r>
+        <w:rPr>
+          <w:b/>
+          <w:bCs/>
+        </w:rPr>
+        <w:t>same</w:t>
+      </w:r>
+      <w:r>
+        <w:t xml:space="preserve"> </w:t>
+      </w:r>
+      <w:r>
+        <w:rPr>
+          <w:b/>
+          <w:bCs/>
+        </w:rPr>
+        <w:t>interface</w:t>
+      </w:r>
+      <w:r>
+        <w:t>.</w:t>
       </w:r>
     </w:p>
     <w:p/>
@@ -5532,10 +5840,233 @@
               <w:t>s</w:t>
             </w:r>
             <w:r>
-              <w:t xml:space="preserve"> brings me swiftly to the “Single Responsibility Principle”. The provided source code</w:t>
-            </w:r>
-            <w:r>
-              <w:t xml:space="preserve"> had all of the program in a single file: “StudentJobPortal.java”, however, the new, updated system divides these responsibilities between several focussed classes. </w:t>
+              <w:t xml:space="preserve"> brings me swiftly to the “</w:t>
+            </w:r>
+            <w:r>
+              <w:rPr>
+                <w:i/>
+                <w:iCs/>
+              </w:rPr>
+              <w:t>Single</w:t>
+            </w:r>
+            <w:r>
+              <w:t xml:space="preserve"> </w:t>
+            </w:r>
+            <w:r>
+              <w:rPr>
+                <w:i/>
+                <w:iCs/>
+              </w:rPr>
+              <w:t>Responsibility</w:t>
+            </w:r>
+            <w:r>
+              <w:t xml:space="preserve"> </w:t>
+            </w:r>
+            <w:r>
+              <w:rPr>
+                <w:i/>
+                <w:iCs/>
+              </w:rPr>
+              <w:t>Principle</w:t>
+            </w:r>
+            <w:r>
+              <w:t>”. The provided source code</w:t>
+            </w:r>
+            <w:r>
+              <w:t xml:space="preserve"> had all of the program in a </w:t>
+            </w:r>
+            <w:r>
+              <w:rPr>
+                <w:b/>
+                <w:bCs/>
+              </w:rPr>
+              <w:t>single</w:t>
+            </w:r>
+            <w:r>
+              <w:t xml:space="preserve"> </w:t>
+            </w:r>
+            <w:r>
+              <w:rPr>
+                <w:b/>
+                <w:bCs/>
+              </w:rPr>
+              <w:t>file</w:t>
+            </w:r>
+            <w:r>
+              <w:t>: “</w:t>
+            </w:r>
+            <w:r>
+              <w:rPr>
+                <w:i/>
+                <w:iCs/>
+              </w:rPr>
+              <w:t>StudentJobPortal.java</w:t>
+            </w:r>
+            <w:r>
+              <w:t xml:space="preserve">”, however, the new, updated system </w:t>
+            </w:r>
+            <w:r>
+              <w:rPr>
+                <w:b/>
+                <w:bCs/>
+              </w:rPr>
+              <w:t>divides</w:t>
+            </w:r>
+            <w:r>
+              <w:t xml:space="preserve"> </w:t>
+            </w:r>
+            <w:r>
+              <w:rPr>
+                <w:b/>
+                <w:bCs/>
+              </w:rPr>
+              <w:t>these</w:t>
+            </w:r>
+            <w:r>
+              <w:t xml:space="preserve"> </w:t>
+            </w:r>
+            <w:r>
+              <w:rPr>
+                <w:b/>
+                <w:bCs/>
+              </w:rPr>
+              <w:t>responsibilities</w:t>
+            </w:r>
+            <w:r>
+              <w:t xml:space="preserve"> </w:t>
+            </w:r>
+            <w:r>
+              <w:rPr>
+                <w:b/>
+                <w:bCs/>
+              </w:rPr>
+              <w:t>between</w:t>
+            </w:r>
+            <w:r>
+              <w:t xml:space="preserve"> </w:t>
+            </w:r>
+            <w:r>
+              <w:rPr>
+                <w:b/>
+                <w:bCs/>
+              </w:rPr>
+              <w:t>several</w:t>
+            </w:r>
+            <w:r>
+              <w:t xml:space="preserve"> </w:t>
+            </w:r>
+            <w:r>
+              <w:rPr>
+                <w:b/>
+                <w:bCs/>
+              </w:rPr>
+              <w:t>focussed</w:t>
+            </w:r>
+            <w:r>
+              <w:t xml:space="preserve"> </w:t>
+            </w:r>
+            <w:r>
+              <w:rPr>
+                <w:b/>
+                <w:bCs/>
+              </w:rPr>
+              <w:t>classes</w:t>
+            </w:r>
+            <w:r>
+              <w:t xml:space="preserve">. </w:t>
+            </w:r>
+          </w:p>
+          <w:p>
+            <w:pPr>
+              <w:pStyle w:val="ListParagraph"/>
+              <w:numPr>
+                <w:ilvl w:val="0"/>
+                <w:numId w:val="5"/>
+              </w:numPr>
+              <w:rPr>
+                <w:i/>
+                <w:iCs/>
+              </w:rPr>
+            </w:pPr>
+            <w:proofErr w:type="spellStart"/>
+            <w:r>
+              <w:rPr>
+                <w:i/>
+                <w:iCs/>
+              </w:rPr>
+              <w:t>JobPortalCli</w:t>
+            </w:r>
+            <w:proofErr w:type="spellEnd"/>
+          </w:p>
+          <w:p>
+            <w:pPr>
+              <w:pStyle w:val="ListParagraph"/>
+              <w:numPr>
+                <w:ilvl w:val="0"/>
+                <w:numId w:val="5"/>
+              </w:numPr>
+              <w:rPr>
+                <w:i/>
+                <w:iCs/>
+              </w:rPr>
+            </w:pPr>
+            <w:r>
+              <w:rPr>
+                <w:i/>
+                <w:iCs/>
+              </w:rPr>
+              <w:t>JobService</w:t>
+            </w:r>
+          </w:p>
+          <w:p>
+            <w:pPr>
+              <w:pStyle w:val="ListParagraph"/>
+              <w:numPr>
+                <w:ilvl w:val="0"/>
+                <w:numId w:val="5"/>
+              </w:numPr>
+              <w:rPr>
+                <w:i/>
+                <w:iCs/>
+              </w:rPr>
+            </w:pPr>
+            <w:proofErr w:type="spellStart"/>
+            <w:r>
+              <w:rPr>
+                <w:i/>
+                <w:iCs/>
+              </w:rPr>
+              <w:t>SavedJobService</w:t>
+            </w:r>
+            <w:proofErr w:type="spellEnd"/>
+          </w:p>
+          <w:p>
+            <w:pPr>
+              <w:pStyle w:val="ListParagraph"/>
+              <w:numPr>
+                <w:ilvl w:val="0"/>
+                <w:numId w:val="5"/>
+              </w:numPr>
+              <w:rPr>
+                <w:i/>
+                <w:iCs/>
+              </w:rPr>
+            </w:pPr>
+            <w:proofErr w:type="spellStart"/>
+            <w:r>
+              <w:rPr>
+                <w:i/>
+                <w:iCs/>
+              </w:rPr>
+              <w:t>ApplicationService</w:t>
+            </w:r>
+            <w:proofErr w:type="spellEnd"/>
+            <w:r>
+              <w:rPr>
+                <w:i/>
+                <w:iCs/>
+              </w:rPr>
+              <w:t xml:space="preserve"> &amp;</w:t>
             </w:r>
           </w:p>
           <w:p>
@@ -5548,63 +6079,10 @@
             </w:pPr>
             <w:proofErr w:type="spellStart"/>
             <w:r>
-              <w:t>JobPortalCli</w:t>
-            </w:r>
-            <w:proofErr w:type="spellEnd"/>
-          </w:p>
-          <w:p>
-            <w:pPr>
-              <w:pStyle w:val="ListParagraph"/>
-              <w:numPr>
-                <w:ilvl w:val="0"/>
-                <w:numId w:val="5"/>
-              </w:numPr>
-            </w:pPr>
-            <w:r>
-              <w:t>JobService</w:t>
-            </w:r>
-          </w:p>
-          <w:p>
-            <w:pPr>
-              <w:pStyle w:val="ListParagraph"/>
-              <w:numPr>
-                <w:ilvl w:val="0"/>
-                <w:numId w:val="5"/>
-              </w:numPr>
-            </w:pPr>
-            <w:proofErr w:type="spellStart"/>
-            <w:r>
-              <w:t>SavedJobService</w:t>
-            </w:r>
-            <w:proofErr w:type="spellEnd"/>
-          </w:p>
-          <w:p>
-            <w:pPr>
-              <w:pStyle w:val="ListParagraph"/>
-              <w:numPr>
-                <w:ilvl w:val="0"/>
-                <w:numId w:val="5"/>
-              </w:numPr>
-            </w:pPr>
-            <w:proofErr w:type="spellStart"/>
-            <w:r>
-              <w:t>ApplicationService</w:t>
-            </w:r>
-            <w:proofErr w:type="spellEnd"/>
-            <w:r>
-              <w:t xml:space="preserve"> &amp;</w:t>
-            </w:r>
-          </w:p>
-          <w:p>
-            <w:pPr>
-              <w:pStyle w:val="ListParagraph"/>
-              <w:numPr>
-                <w:ilvl w:val="0"/>
-                <w:numId w:val="5"/>
-              </w:numPr>
-            </w:pPr>
-            <w:proofErr w:type="spellStart"/>
-            <w:r>
+              <w:rPr>
+                <w:i/>
+                <w:iCs/>
+              </w:rPr>
               <w:t>SampleJobDataSeeder</w:t>
             </w:r>
             <w:proofErr w:type="spellEnd"/>
@@ -5658,7 +6136,83 @@
     <w:p/>
     <w:p>
       <w:r>
-        <w:t>This means that the new refactored “main()” is largely empty, and only contains the composition root.</w:t>
+        <w:t xml:space="preserve">This means that the new </w:t>
+      </w:r>
+      <w:r>
+        <w:rPr>
+          <w:b/>
+          <w:bCs/>
+        </w:rPr>
+        <w:t>refactored</w:t>
+      </w:r>
+      <w:r>
+        <w:t xml:space="preserve"> </w:t>
+      </w:r>
+      <w:r>
+        <w:rPr>
+          <w:b/>
+          <w:bCs/>
+        </w:rPr>
+        <w:t>“</w:t>
+      </w:r>
+      <w:r>
+        <w:rPr>
+          <w:b/>
+          <w:bCs/>
+          <w:i/>
+          <w:iCs/>
+        </w:rPr>
+        <w:t>main()</w:t>
+      </w:r>
+      <w:r>
+        <w:rPr>
+          <w:b/>
+          <w:bCs/>
+        </w:rPr>
+        <w:t>”</w:t>
+      </w:r>
+      <w:r>
+        <w:t xml:space="preserve"> is </w:t>
+      </w:r>
+      <w:r>
+        <w:rPr>
+          <w:b/>
+          <w:bCs/>
+        </w:rPr>
+        <w:t>largely</w:t>
+      </w:r>
+      <w:r>
+        <w:t xml:space="preserve"> </w:t>
+      </w:r>
+      <w:r>
+        <w:rPr>
+          <w:b/>
+          <w:bCs/>
+        </w:rPr>
+        <w:t>empty</w:t>
+      </w:r>
+      <w:r>
+        <w:t xml:space="preserve">, and only contains the </w:t>
+      </w:r>
+      <w:r>
+        <w:rPr>
+          <w:b/>
+          <w:bCs/>
+        </w:rPr>
+        <w:t>composition</w:t>
+      </w:r>
+      <w:r>
+        <w:t xml:space="preserve"> </w:t>
+      </w:r>
+      <w:r>
+        <w:rPr>
+          <w:b/>
+          <w:bCs/>
+        </w:rPr>
+        <w:t>root</w:t>
+      </w:r>
+      <w:r>
+        <w:t>.</w:t>
       </w:r>
     </w:p>
     <w:p/>
@@ -5670,29 +6224,406 @@
         <w:t>, t</w:t>
       </w:r>
       <w:r>
-        <w:t>he original version of the StudentJobPortal technically used a java class but it behaved as a procedural, single file program with shared mutable states, parallel connections</w:t>
+        <w:t xml:space="preserve">he original version of the StudentJobPortal </w:t>
+      </w:r>
+      <w:r>
+        <w:rPr>
+          <w:b/>
+          <w:bCs/>
+        </w:rPr>
+        <w:t>technically</w:t>
+      </w:r>
+      <w:r>
+        <w:t xml:space="preserve"> used a java class but it </w:t>
+      </w:r>
+      <w:r>
+        <w:rPr>
+          <w:b/>
+          <w:bCs/>
+        </w:rPr>
+        <w:t>behaved as a procedural, single file program</w:t>
+      </w:r>
+      <w:r>
+        <w:t xml:space="preserve"> with </w:t>
+      </w:r>
+      <w:r>
+        <w:rPr>
+          <w:b/>
+          <w:bCs/>
+        </w:rPr>
+        <w:t>shared mutable states</w:t>
       </w:r>
       <w:r>
         <w:t xml:space="preserve">, </w:t>
       </w:r>
       <w:r>
+        <w:rPr>
+          <w:b/>
+          <w:bCs/>
+        </w:rPr>
+        <w:t>parallel connections</w:t>
+      </w:r>
+      <w:r>
+        <w:t xml:space="preserve">, </w:t>
+      </w:r>
+      <w:r>
+        <w:rPr>
+          <w:b/>
+          <w:bCs/>
+        </w:rPr>
         <w:t>hard coded algorithms</w:t>
       </w:r>
       <w:r>
-        <w:t xml:space="preserve"> and tightly coupled input &amp; output. The revised program has a much stronger object-oriented design with Encapsulation to protect domain states through the use of private immutable fields; Abstraction is available through repository and strategy interfaces; and Polymorphism that allows for multiple repository and search implementations to be used. </w:t>
+        <w:t xml:space="preserve"> and </w:t>
+      </w:r>
+      <w:r>
+        <w:rPr>
+          <w:b/>
+          <w:bCs/>
+        </w:rPr>
+        <w:t>tightly coupled input</w:t>
+      </w:r>
+      <w:r>
+        <w:t xml:space="preserve"> &amp; </w:t>
+      </w:r>
+      <w:r>
+        <w:rPr>
+          <w:b/>
+          <w:bCs/>
+        </w:rPr>
+        <w:t>output</w:t>
+      </w:r>
+      <w:r>
+        <w:t xml:space="preserve">. The revised program has a much </w:t>
+      </w:r>
+      <w:r>
+        <w:rPr>
+          <w:b/>
+          <w:bCs/>
+        </w:rPr>
+        <w:t>stronger object-oriented design</w:t>
+      </w:r>
+      <w:r>
+        <w:t xml:space="preserve"> with </w:t>
+      </w:r>
+      <w:r>
+        <w:rPr>
+          <w:b/>
+          <w:bCs/>
+        </w:rPr>
+        <w:t>Encapsulation</w:t>
+      </w:r>
+      <w:r>
+        <w:t xml:space="preserve"> to </w:t>
+      </w:r>
+      <w:r>
+        <w:rPr>
+          <w:b/>
+          <w:bCs/>
+        </w:rPr>
+        <w:t>protect domain states</w:t>
+      </w:r>
+      <w:r>
+        <w:t xml:space="preserve"> through the use of </w:t>
+      </w:r>
+      <w:r>
+        <w:rPr>
+          <w:b/>
+          <w:bCs/>
+        </w:rPr>
+        <w:t>private immutable fields</w:t>
+      </w:r>
+      <w:r>
+        <w:t xml:space="preserve">; </w:t>
+      </w:r>
+      <w:r>
+        <w:rPr>
+          <w:b/>
+          <w:bCs/>
+        </w:rPr>
+        <w:t>Abstraction</w:t>
+      </w:r>
+      <w:r>
+        <w:t xml:space="preserve"> is available through </w:t>
+      </w:r>
+      <w:r>
+        <w:rPr>
+          <w:b/>
+          <w:bCs/>
+        </w:rPr>
+        <w:t>repository</w:t>
+      </w:r>
+      <w:r>
+        <w:t xml:space="preserve"> and </w:t>
+      </w:r>
+      <w:r>
+        <w:rPr>
+          <w:b/>
+          <w:bCs/>
+        </w:rPr>
+        <w:t>strategy interfaces</w:t>
+      </w:r>
+      <w:r>
+        <w:t xml:space="preserve">; and </w:t>
+      </w:r>
+      <w:r>
+        <w:rPr>
+          <w:b/>
+          <w:bCs/>
+        </w:rPr>
+        <w:t>Polymorphism</w:t>
+      </w:r>
+      <w:r>
+        <w:t xml:space="preserve"> that allows for </w:t>
+      </w:r>
+      <w:r>
+        <w:rPr>
+          <w:b/>
+          <w:bCs/>
+        </w:rPr>
+        <w:t>multiple repository</w:t>
+      </w:r>
+      <w:r>
+        <w:t xml:space="preserve"> </w:t>
+      </w:r>
+      <w:r>
+        <w:rPr>
+          <w:b/>
+          <w:bCs/>
+        </w:rPr>
+        <w:t>and search implementations</w:t>
+      </w:r>
+      <w:r>
+        <w:t xml:space="preserve"> to be used. </w:t>
       </w:r>
     </w:p>
     <w:p>
       <w:r>
-        <w:t xml:space="preserve">The inclusion of immutability, value objects, defensive collections and composition over inheritance further improve the systems testability, maintainability and extendibility. </w:t>
+        <w:t xml:space="preserve">The inclusion of </w:t>
+      </w:r>
+      <w:r>
+        <w:rPr>
+          <w:b/>
+          <w:bCs/>
+        </w:rPr>
+        <w:t>immutability</w:t>
+      </w:r>
+      <w:r>
+        <w:t xml:space="preserve">, </w:t>
+      </w:r>
+      <w:r>
+        <w:rPr>
+          <w:b/>
+          <w:bCs/>
+        </w:rPr>
+        <w:t>value objects</w:t>
+      </w:r>
+      <w:r>
+        <w:t xml:space="preserve">, </w:t>
+      </w:r>
+      <w:r>
+        <w:rPr>
+          <w:b/>
+          <w:bCs/>
+        </w:rPr>
+        <w:t>defensive collections</w:t>
+      </w:r>
+      <w:r>
+        <w:t xml:space="preserve"> and </w:t>
+      </w:r>
+      <w:r>
+        <w:rPr>
+          <w:b/>
+          <w:bCs/>
+        </w:rPr>
+        <w:t>composition over inheritance</w:t>
+      </w:r>
+      <w:r>
+        <w:t xml:space="preserve"> further improve the </w:t>
+      </w:r>
+      <w:r>
+        <w:rPr>
+          <w:b/>
+          <w:bCs/>
+        </w:rPr>
+        <w:t>systems testability</w:t>
+      </w:r>
+      <w:r>
+        <w:t xml:space="preserve">, </w:t>
+      </w:r>
+      <w:r>
+        <w:rPr>
+          <w:b/>
+          <w:bCs/>
+        </w:rPr>
+        <w:t>maintainability</w:t>
+      </w:r>
+      <w:r>
+        <w:t xml:space="preserve"> and </w:t>
+      </w:r>
+      <w:r>
+        <w:rPr>
+          <w:b/>
+          <w:bCs/>
+        </w:rPr>
+        <w:t>extendibility</w:t>
+      </w:r>
+      <w:r>
+        <w:t xml:space="preserve">. </w:t>
       </w:r>
     </w:p>
     <w:p>
       <w:r>
-        <w:t xml:space="preserve">The Gang of Four (G.o.F.) </w:t>
-      </w:r>
-      <w:r>
-        <w:t xml:space="preserve">Builder and Strategy patterns have been implemented and the “CombinedKeywordSearchStrategy” showcases a composite style structural design. Additional Repository and Service Layer patterns separate persistence and business logic </w:t>
+        <w:t xml:space="preserve">The </w:t>
+      </w:r>
+      <w:r>
+        <w:rPr>
+          <w:b/>
+          <w:bCs/>
+        </w:rPr>
+        <w:t>Gang of Four (</w:t>
+      </w:r>
+      <w:r>
+        <w:rPr>
+          <w:b/>
+          <w:bCs/>
+          <w:i/>
+          <w:iCs/>
+        </w:rPr>
+        <w:t>G.o.F.)</w:t>
+      </w:r>
+      <w:r>
+        <w:t xml:space="preserve"> </w:t>
+      </w:r>
+      <w:r>
+        <w:rPr>
+          <w:b/>
+          <w:bCs/>
+        </w:rPr>
+        <w:t>Builder</w:t>
+      </w:r>
+      <w:r>
+        <w:t xml:space="preserve"> and </w:t>
+      </w:r>
+      <w:r>
+        <w:rPr>
+          <w:b/>
+          <w:bCs/>
+        </w:rPr>
+        <w:t>Strategy</w:t>
+      </w:r>
+      <w:r>
+        <w:t xml:space="preserve"> </w:t>
+      </w:r>
+      <w:r>
+        <w:rPr>
+          <w:b/>
+          <w:bCs/>
+        </w:rPr>
+        <w:t>patterns</w:t>
+      </w:r>
+      <w:r>
+        <w:t xml:space="preserve"> have been implemented and the “</w:t>
+      </w:r>
+      <w:r>
+        <w:rPr>
+          <w:i/>
+          <w:iCs/>
+        </w:rPr>
+        <w:t>CombinedKeywordSearchStrategy</w:t>
+      </w:r>
+      <w:r>
+        <w:t xml:space="preserve">” showcases a </w:t>
+      </w:r>
+      <w:r>
+        <w:rPr>
+          <w:b/>
+          <w:bCs/>
+        </w:rPr>
+        <w:t>composite style structural design</w:t>
+      </w:r>
+      <w:r>
+        <w:t xml:space="preserve">. Additional </w:t>
+      </w:r>
+      <w:r>
+        <w:rPr>
+          <w:b/>
+          <w:bCs/>
+        </w:rPr>
+        <w:t>Repository</w:t>
+      </w:r>
+      <w:r>
+        <w:t xml:space="preserve"> and </w:t>
+      </w:r>
+      <w:r>
+        <w:rPr>
+          <w:b/>
+          <w:bCs/>
+        </w:rPr>
+        <w:t>Service</w:t>
+      </w:r>
+      <w:r>
+        <w:t xml:space="preserve"> </w:t>
+      </w:r>
+      <w:r>
+        <w:rPr>
+          <w:b/>
+          <w:bCs/>
+        </w:rPr>
+        <w:t>Layer</w:t>
+      </w:r>
+      <w:r>
+        <w:t xml:space="preserve"> </w:t>
+      </w:r>
+      <w:r>
+        <w:rPr>
+          <w:b/>
+          <w:bCs/>
+        </w:rPr>
+        <w:t>patterns</w:t>
+      </w:r>
+      <w:r>
+        <w:t xml:space="preserve"> </w:t>
+      </w:r>
+      <w:r>
+        <w:rPr>
+          <w:b/>
+          <w:bCs/>
+        </w:rPr>
+        <w:t>separate</w:t>
+      </w:r>
+      <w:r>
+        <w:t xml:space="preserve"> </w:t>
+      </w:r>
+      <w:r>
+        <w:rPr>
+          <w:b/>
+          <w:bCs/>
+        </w:rPr>
+        <w:t>persistence</w:t>
+      </w:r>
+      <w:r>
+        <w:t xml:space="preserve"> and </w:t>
+      </w:r>
+      <w:r>
+        <w:rPr>
+          <w:b/>
+          <w:bCs/>
+        </w:rPr>
+        <w:t>business</w:t>
+      </w:r>
+      <w:r>
+        <w:t xml:space="preserve"> </w:t>
+      </w:r>
+      <w:r>
+        <w:rPr>
+          <w:b/>
+          <w:bCs/>
+        </w:rPr>
+        <w:t>logic</w:t>
+      </w:r>
+      <w:r>
+        <w:t xml:space="preserve"> </w:t>
       </w:r>
       <w:r>
         <w:t>even though they are</w:t>
@@ -5716,7 +6647,17 @@
         <w:t>F</w:t>
       </w:r>
       <w:r>
-        <w:t>our (G.o.F.)</w:t>
+        <w:t>our (</w:t>
+      </w:r>
+      <w:r>
+        <w:rPr>
+          <w:i/>
+          <w:iCs/>
+        </w:rPr>
+        <w:t>G.o.F.</w:t>
+      </w:r>
+      <w:r>
+        <w:t>)</w:t>
       </w:r>
       <w:r>
         <w:t xml:space="preserve"> catalogue. Th</w:t>
@@ -5725,25 +6666,202 @@
         <w:t xml:space="preserve">ey’re </w:t>
       </w:r>
       <w:r>
-        <w:t xml:space="preserve">appropriate because they isolate areas of the system that are likely to vary independently, </w:t>
+        <w:t xml:space="preserve">appropriate because they </w:t>
+      </w:r>
+      <w:r>
+        <w:rPr>
+          <w:b/>
+          <w:bCs/>
+        </w:rPr>
+        <w:t>isolate</w:t>
+      </w:r>
+      <w:r>
+        <w:t xml:space="preserve"> </w:t>
+      </w:r>
+      <w:r>
+        <w:rPr>
+          <w:b/>
+          <w:bCs/>
+        </w:rPr>
+        <w:t>areas</w:t>
+      </w:r>
+      <w:r>
+        <w:t xml:space="preserve"> of the system that are </w:t>
+      </w:r>
+      <w:r>
+        <w:rPr>
+          <w:b/>
+          <w:bCs/>
+        </w:rPr>
+        <w:t>likely</w:t>
+      </w:r>
+      <w:r>
+        <w:t xml:space="preserve"> </w:t>
+      </w:r>
+      <w:r>
+        <w:rPr>
+          <w:b/>
+          <w:bCs/>
+        </w:rPr>
+        <w:t>to</w:t>
+      </w:r>
+      <w:r>
+        <w:t xml:space="preserve"> </w:t>
+      </w:r>
+      <w:r>
+        <w:rPr>
+          <w:b/>
+          <w:bCs/>
+        </w:rPr>
+        <w:t>vary</w:t>
+      </w:r>
+      <w:r>
+        <w:t xml:space="preserve"> </w:t>
+      </w:r>
+      <w:r>
+        <w:rPr>
+          <w:b/>
+          <w:bCs/>
+        </w:rPr>
+        <w:t>independently</w:t>
+      </w:r>
+      <w:r>
+        <w:t xml:space="preserve">, </w:t>
       </w:r>
       <w:r>
         <w:t>which results in</w:t>
       </w:r>
       <w:r>
-        <w:t xml:space="preserve"> future changes such as alternative search algorithms, database persistence or additional job fields</w:t>
+        <w:t xml:space="preserve"> future changes such as </w:t>
+      </w:r>
+      <w:r>
+        <w:rPr>
+          <w:b/>
+          <w:bCs/>
+        </w:rPr>
+        <w:t>alternative</w:t>
+      </w:r>
+      <w:r>
+        <w:t xml:space="preserve"> </w:t>
+      </w:r>
+      <w:r>
+        <w:rPr>
+          <w:b/>
+          <w:bCs/>
+        </w:rPr>
+        <w:t>search</w:t>
+      </w:r>
+      <w:r>
+        <w:t xml:space="preserve"> </w:t>
+      </w:r>
+      <w:r>
+        <w:rPr>
+          <w:b/>
+          <w:bCs/>
+        </w:rPr>
+        <w:t>algorithms</w:t>
       </w:r>
       <w:r>
         <w:t xml:space="preserve">, </w:t>
       </w:r>
       <w:r>
+        <w:rPr>
+          <w:b/>
+          <w:bCs/>
+        </w:rPr>
+        <w:t>database</w:t>
+      </w:r>
+      <w:r>
+        <w:t xml:space="preserve"> </w:t>
+      </w:r>
+      <w:r>
+        <w:rPr>
+          <w:b/>
+          <w:bCs/>
+        </w:rPr>
+        <w:t>persistence</w:t>
+      </w:r>
+      <w:r>
+        <w:t xml:space="preserve"> or </w:t>
+      </w:r>
+      <w:r>
+        <w:rPr>
+          <w:b/>
+          <w:bCs/>
+        </w:rPr>
+        <w:t>additional</w:t>
+      </w:r>
+      <w:r>
+        <w:t xml:space="preserve"> </w:t>
+      </w:r>
+      <w:r>
+        <w:rPr>
+          <w:b/>
+          <w:bCs/>
+        </w:rPr>
+        <w:t>job</w:t>
+      </w:r>
+      <w:r>
+        <w:t xml:space="preserve"> </w:t>
+      </w:r>
+      <w:r>
+        <w:rPr>
+          <w:b/>
+          <w:bCs/>
+        </w:rPr>
+        <w:t>fields</w:t>
+      </w:r>
+      <w:r>
+        <w:t xml:space="preserve">, </w:t>
+      </w:r>
+      <w:r>
         <w:t>be</w:t>
       </w:r>
       <w:r>
         <w:t>ing</w:t>
       </w:r>
       <w:r>
-        <w:t xml:space="preserve"> introduced with significantly less modification to existing code.  </w:t>
+        <w:t xml:space="preserve"> introduced with significantly </w:t>
+      </w:r>
+      <w:r>
+        <w:rPr>
+          <w:b/>
+          <w:bCs/>
+        </w:rPr>
+        <w:t>less</w:t>
+      </w:r>
+      <w:r>
+        <w:t xml:space="preserve"> </w:t>
+      </w:r>
+      <w:r>
+        <w:rPr>
+          <w:b/>
+          <w:bCs/>
+        </w:rPr>
+        <w:t>modification</w:t>
+      </w:r>
+      <w:r>
+        <w:t xml:space="preserve"> to </w:t>
+      </w:r>
+      <w:r>
+        <w:rPr>
+          <w:b/>
+          <w:bCs/>
+        </w:rPr>
+        <w:t>existing</w:t>
+      </w:r>
+      <w:r>
+        <w:t xml:space="preserve"> </w:t>
+      </w:r>
+      <w:r>
+        <w:rPr>
+          <w:b/>
+          <w:bCs/>
+        </w:rPr>
+        <w:t>code</w:t>
+      </w:r>
+      <w:r>
+        <w:t xml:space="preserve">.  </w:t>
       </w:r>
     </w:p>
     <w:p/>

</xml_diff>

<commit_message>
AI made Test-data and Test-files for metrics. Updated declarations and main report.
</commit_message>
<xml_diff>
--- a/CM2307_CW_StudentNumber.docx.docx
+++ b/CM2307_CW_StudentNumber.docx.docx
@@ -771,7 +771,13 @@
         </w:numPr>
       </w:pPr>
       <w:r>
-        <w:t xml:space="preserve">I assume that the Test Files (used purely for demonstration purposes) can be generated with AI (all chats provided) due to the fact that I am using Artificial Intelligence as a tool to </w:t>
+        <w:t xml:space="preserve">I assume that the Test Files </w:t>
+      </w:r>
+      <w:r>
+        <w:t xml:space="preserve">&amp; Sample Data </w:t>
+      </w:r>
+      <w:r>
+        <w:t xml:space="preserve">(used purely for demonstration purposes) can be generated with AI (all chats provided) due to the fact that I am using Artificial Intelligence as a tool to </w:t>
       </w:r>
       <w:r>
         <w:rPr>
@@ -6864,7 +6870,11 @@
         <w:t xml:space="preserve">.  </w:t>
       </w:r>
     </w:p>
-    <w:p/>
+    <w:p>
+      <w:r>
+        <w:br w:type="page"/>
+      </w:r>
+    </w:p>
     <w:p>
       <w:pPr>
         <w:pStyle w:val="Heading2"/>
@@ -6877,6 +6887,7 @@
         <w:rPr>
           <w:color w:val="2F6BFF"/>
         </w:rPr>
+        <w:lastRenderedPageBreak/>
         <w:t>Part 2: (max of 1</w:t>
       </w:r>
       <w:r>

</xml_diff>